<commit_message>
adding preprocessing to dcos
</commit_message>
<xml_diff>
--- a/ML_FINAL.docx
+++ b/ML_FINAL.docx
@@ -782,6 +782,17 @@
         </w:rPr>
         <w:t xml:space="preserve"> 23 משתמשים לא עמדו בתנאי זה. </w:t>
       </w:r>
+      <w:r>
+        <w:rPr>
+          <w:rStyle w:val="CommentTok"/>
+          <w:rFonts w:asciiTheme="minorHAnsi" w:hAnsiTheme="minorHAnsi" w:hint="cs"/>
+          <w:color w:val="auto"/>
+          <w:sz w:val="24"/>
+          <w:shd w:val="clear" w:color="auto" w:fill="auto"/>
+          <w:rtl/>
+        </w:rPr>
+        <w:t xml:space="preserve"> </w:t>
+      </w:r>
     </w:p>
     <w:p>
       <w:pPr>
@@ -796,2062 +807,975 @@
           <w:rtl/>
         </w:rPr>
       </w:pPr>
-    </w:p>
-    <w:p>
-      <w:pPr>
-        <w:spacing w:line="360" w:lineRule="auto"/>
+      <w:r>
+        <w:rPr>
+          <w:rStyle w:val="CommentTok"/>
+          <w:rFonts w:asciiTheme="minorHAnsi" w:hAnsiTheme="minorHAnsi" w:hint="cs"/>
+          <w:color w:val="auto"/>
+          <w:sz w:val="24"/>
+          <w:shd w:val="clear" w:color="auto" w:fill="auto"/>
+          <w:rtl/>
+        </w:rPr>
+        <w:t>ב</w:t>
+      </w:r>
+      <w:r>
+        <w:rPr>
+          <w:rStyle w:val="CommentTok"/>
+          <w:rFonts w:asciiTheme="minorHAnsi" w:hAnsiTheme="minorHAnsi" w:hint="cs"/>
+          <w:color w:val="auto"/>
+          <w:sz w:val="24"/>
+          <w:shd w:val="clear" w:color="auto" w:fill="auto"/>
+          <w:rtl/>
+        </w:rPr>
+        <w:t>ח</w:t>
+      </w:r>
+      <w:r>
+        <w:rPr>
+          <w:rStyle w:val="CommentTok"/>
+          <w:rFonts w:asciiTheme="minorHAnsi" w:hAnsiTheme="minorHAnsi" w:hint="cs"/>
+          <w:color w:val="auto"/>
+          <w:sz w:val="24"/>
+          <w:shd w:val="clear" w:color="auto" w:fill="auto"/>
+          <w:rtl/>
+        </w:rPr>
+        <w:t>ל</w:t>
+      </w:r>
+      <w:r>
+        <w:rPr>
+          <w:rStyle w:val="CommentTok"/>
+          <w:rFonts w:asciiTheme="minorHAnsi" w:hAnsiTheme="minorHAnsi" w:hint="cs"/>
+          <w:color w:val="auto"/>
+          <w:sz w:val="24"/>
+          <w:shd w:val="clear" w:color="auto" w:fill="auto"/>
+          <w:rtl/>
+        </w:rPr>
+        <w:t>ק</w:t>
+      </w:r>
+      <w:r>
+        <w:rPr>
+          <w:rStyle w:val="CommentTok"/>
+          <w:rFonts w:asciiTheme="minorHAnsi" w:hAnsiTheme="minorHAnsi" w:hint="cs"/>
+          <w:color w:val="auto"/>
+          <w:sz w:val="24"/>
+          <w:shd w:val="clear" w:color="auto" w:fill="auto"/>
+          <w:rtl/>
+        </w:rPr>
+        <w:t xml:space="preserve"> האחרון של שלב זה, ניסינו ליצור אופן בו ניתן לרתום את המידע שאינו כמותי אודות המשתמשים על מנת לתרום לניבוי </w:t>
+      </w:r>
+      <w:r>
         <w:rPr>
           <w:rStyle w:val="CommentTok"/>
           <w:rFonts w:asciiTheme="minorHAnsi" w:hAnsiTheme="minorHAnsi"/>
           <w:color w:val="auto"/>
           <w:sz w:val="24"/>
           <w:shd w:val="clear" w:color="auto" w:fill="auto"/>
+          <w:rtl/>
+        </w:rPr>
+        <w:t>–</w:t>
+      </w:r>
+      <w:r>
+        <w:rPr>
+          <w:rStyle w:val="CommentTok"/>
+          <w:rFonts w:asciiTheme="minorHAnsi" w:hAnsiTheme="minorHAnsi" w:hint="cs"/>
+          <w:color w:val="auto"/>
+          <w:sz w:val="24"/>
+          <w:shd w:val="clear" w:color="auto" w:fill="auto"/>
+          <w:rtl/>
+        </w:rPr>
+        <w:t xml:space="preserve"> ספציפית את המקצועו</w:t>
+      </w:r>
+      <w:r>
+        <w:rPr>
+          <w:rStyle w:val="CommentTok"/>
+          <w:rFonts w:asciiTheme="minorHAnsi" w:hAnsiTheme="minorHAnsi"/>
+          <w:color w:val="auto"/>
+          <w:sz w:val="24"/>
+          <w:shd w:val="clear" w:color="auto" w:fill="auto"/>
+        </w:rPr>
+        <w:t>;</w:t>
+      </w:r>
+      <w:r>
+        <w:rPr>
+          <w:rStyle w:val="CommentTok"/>
+          <w:rFonts w:asciiTheme="minorHAnsi" w:hAnsiTheme="minorHAnsi" w:hint="cs"/>
+          <w:color w:val="auto"/>
+          <w:sz w:val="24"/>
+          <w:shd w:val="clear" w:color="auto" w:fill="auto"/>
+          <w:rtl/>
+        </w:rPr>
+        <w:t xml:space="preserve"> או האופן שבו הוא בוחר להציג את מקצועו. </w:t>
+      </w:r>
+      <w:r>
+        <w:rPr>
+          <w:rStyle w:val="CommentTok"/>
+          <w:rFonts w:asciiTheme="minorHAnsi" w:hAnsiTheme="minorHAnsi" w:hint="cs"/>
+          <w:color w:val="auto"/>
+          <w:sz w:val="24"/>
+          <w:shd w:val="clear" w:color="auto" w:fill="auto"/>
+          <w:rtl/>
+        </w:rPr>
+        <w:t>על מנת לכמת זאת, בחרנו ל</w:t>
+      </w:r>
+      <w:r>
+        <w:rPr>
+          <w:rStyle w:val="CommentTok"/>
+          <w:rFonts w:asciiTheme="minorHAnsi" w:hAnsiTheme="minorHAnsi" w:hint="cs"/>
+          <w:color w:val="auto"/>
+          <w:sz w:val="24"/>
+          <w:shd w:val="clear" w:color="auto" w:fill="auto"/>
+          <w:rtl/>
+        </w:rPr>
+        <w:t>א</w:t>
+      </w:r>
+      <w:r>
+        <w:rPr>
+          <w:rStyle w:val="CommentTok"/>
+          <w:rFonts w:asciiTheme="minorHAnsi" w:hAnsiTheme="minorHAnsi" w:hint="cs"/>
+          <w:color w:val="auto"/>
+          <w:sz w:val="24"/>
+          <w:shd w:val="clear" w:color="auto" w:fill="auto"/>
+          <w:rtl/>
+        </w:rPr>
+        <w:t xml:space="preserve">מוד את המרחק </w:t>
+      </w:r>
+      <w:r>
+        <w:rPr>
+          <w:rStyle w:val="CommentTok"/>
+          <w:rFonts w:asciiTheme="minorHAnsi" w:hAnsiTheme="minorHAnsi" w:hint="cs"/>
+          <w:color w:val="auto"/>
+          <w:sz w:val="24"/>
+          <w:shd w:val="clear" w:color="auto" w:fill="auto"/>
+          <w:rtl/>
+        </w:rPr>
+        <w:t>הווקטור על ידי</w:t>
+      </w:r>
+      <w:r>
+        <w:rPr>
+          <w:rStyle w:val="CommentTok"/>
+          <w:rFonts w:asciiTheme="minorHAnsi" w:hAnsiTheme="minorHAnsi" w:hint="cs"/>
+          <w:color w:val="auto"/>
+          <w:sz w:val="24"/>
+          <w:shd w:val="clear" w:color="auto" w:fill="auto"/>
+          <w:rtl/>
+        </w:rPr>
+        <w:t xml:space="preserve"> </w:t>
+      </w:r>
+      <w:r>
+        <w:rPr>
+          <w:rStyle w:val="CommentTok"/>
+          <w:rFonts w:asciiTheme="minorHAnsi" w:hAnsiTheme="minorHAnsi"/>
+          <w:color w:val="auto"/>
+          <w:sz w:val="24"/>
+          <w:shd w:val="clear" w:color="auto" w:fill="auto"/>
+        </w:rPr>
+        <w:t xml:space="preserve">cosine </w:t>
+      </w:r>
+      <w:r>
+        <w:rPr>
+          <w:rStyle w:val="CommentTok"/>
+          <w:rFonts w:asciiTheme="minorHAnsi" w:hAnsiTheme="minorHAnsi"/>
+          <w:color w:val="auto"/>
+          <w:sz w:val="24"/>
+          <w:shd w:val="clear" w:color="auto" w:fill="auto"/>
+        </w:rPr>
+        <w:t>similarity</w:t>
+      </w:r>
+      <w:r>
+        <w:rPr>
+          <w:rStyle w:val="CommentTok"/>
+          <w:rFonts w:asciiTheme="minorHAnsi" w:hAnsiTheme="minorHAnsi"/>
+          <w:color w:val="auto"/>
+          <w:sz w:val="24"/>
+          <w:shd w:val="clear" w:color="auto" w:fill="auto"/>
+        </w:rPr>
+        <w:t xml:space="preserve"> </w:t>
+      </w:r>
+      <w:r>
+        <w:rPr>
+          <w:rStyle w:val="CommentTok"/>
+          <w:rFonts w:asciiTheme="minorHAnsi" w:hAnsiTheme="minorHAnsi"/>
+          <w:color w:val="auto"/>
+          <w:sz w:val="24"/>
+          <w:shd w:val="clear" w:color="auto" w:fill="auto"/>
+        </w:rPr>
+        <w:t xml:space="preserve"> </w:t>
+      </w:r>
+      <w:r>
+        <w:rPr>
+          <w:rStyle w:val="CommentTok"/>
+          <w:rFonts w:asciiTheme="minorHAnsi" w:hAnsiTheme="minorHAnsi" w:hint="cs"/>
+          <w:color w:val="auto"/>
+          <w:sz w:val="24"/>
+          <w:shd w:val="clear" w:color="auto" w:fill="auto"/>
+          <w:rtl/>
+        </w:rPr>
+        <w:t xml:space="preserve"> בין ה-</w:t>
+      </w:r>
+      <w:proofErr w:type="spellStart"/>
+      <w:r>
+        <w:rPr>
+          <w:rStyle w:val="CommentTok"/>
+          <w:rFonts w:asciiTheme="minorHAnsi" w:hAnsiTheme="minorHAnsi"/>
+          <w:color w:val="auto"/>
+          <w:sz w:val="24"/>
+          <w:shd w:val="clear" w:color="auto" w:fill="auto"/>
+        </w:rPr>
+        <w:t>jobTitle</w:t>
+      </w:r>
+      <w:proofErr w:type="spellEnd"/>
+      <w:r>
+        <w:rPr>
+          <w:rStyle w:val="CommentTok"/>
+          <w:rFonts w:asciiTheme="minorHAnsi" w:hAnsiTheme="minorHAnsi" w:hint="cs"/>
+          <w:color w:val="auto"/>
+          <w:sz w:val="24"/>
+          <w:shd w:val="clear" w:color="auto" w:fill="auto"/>
+          <w:rtl/>
+        </w:rPr>
+        <w:t xml:space="preserve"> של המשתמש מהמילה</w:t>
+      </w:r>
+      <w:r>
+        <w:rPr>
+          <w:rStyle w:val="CommentTok"/>
+          <w:rFonts w:asciiTheme="minorHAnsi" w:hAnsiTheme="minorHAnsi" w:hint="cs"/>
+          <w:color w:val="auto"/>
+          <w:sz w:val="24"/>
+          <w:shd w:val="clear" w:color="auto" w:fill="auto"/>
+          <w:rtl/>
+        </w:rPr>
+        <w:t xml:space="preserve">  </w:t>
+      </w:r>
+      <w:r>
+        <w:rPr>
+          <w:rStyle w:val="NormalTok"/>
+        </w:rPr>
+        <w:t>‘engineer’</w:t>
+      </w:r>
+      <w:r>
+        <w:rPr>
+          <w:rStyle w:val="CommentTok"/>
+          <w:rFonts w:asciiTheme="minorHAnsi" w:hAnsiTheme="minorHAnsi"/>
+          <w:color w:val="auto"/>
+          <w:sz w:val="24"/>
+          <w:shd w:val="clear" w:color="auto" w:fill="auto"/>
+        </w:rPr>
+        <w:t xml:space="preserve"> </w:t>
+      </w:r>
+      <w:r>
+        <w:rPr>
+          <w:rStyle w:val="CommentTok"/>
+          <w:rFonts w:asciiTheme="minorHAnsi" w:hAnsiTheme="minorHAnsi" w:hint="cs"/>
+          <w:color w:val="auto"/>
+          <w:sz w:val="24"/>
+          <w:shd w:val="clear" w:color="auto" w:fill="auto"/>
+          <w:rtl/>
+        </w:rPr>
+        <w:t xml:space="preserve">. ההחלטה לבחור במילה אחת ולא במילון התקבלה לאור כך שהטקסט אותו אנו מנתחים הוא דל במידע, מכיל מילים בודדות, ומאוד פשוט לפרשנות והבנה. </w:t>
+      </w:r>
+      <w:r>
+        <w:rPr>
+          <w:rStyle w:val="CommentTok"/>
+          <w:rFonts w:asciiTheme="minorHAnsi" w:hAnsiTheme="minorHAnsi" w:hint="cs"/>
+          <w:color w:val="auto"/>
+          <w:sz w:val="24"/>
+          <w:shd w:val="clear" w:color="auto" w:fill="auto"/>
+          <w:rtl/>
+        </w:rPr>
+        <w:t>ראוי לציון כי ההחלטה זו הקטינה לנו משמעותית את גודל סט הנתונים שלנו (ל-576 משתמשים שדה זה היה ריק) והותירה אותנו עם 335 בלבד</w:t>
+      </w:r>
+      <w:r>
+        <w:rPr>
+          <w:rStyle w:val="CommentTok"/>
+          <w:rFonts w:asciiTheme="minorHAnsi" w:hAnsiTheme="minorHAnsi" w:hint="cs"/>
+          <w:color w:val="auto"/>
+          <w:sz w:val="24"/>
+          <w:highlight w:val="yellow"/>
+          <w:shd w:val="clear" w:color="auto" w:fill="auto"/>
+          <w:rtl/>
+        </w:rPr>
+        <w:t xml:space="preserve">. נדון בהיבט זה בסוף העבודה לאחר </w:t>
+      </w:r>
+      <w:proofErr w:type="spellStart"/>
+      <w:r>
+        <w:rPr>
+          <w:rStyle w:val="CommentTok"/>
+          <w:rFonts w:asciiTheme="minorHAnsi" w:hAnsiTheme="minorHAnsi" w:hint="cs"/>
+          <w:color w:val="auto"/>
+          <w:sz w:val="24"/>
+          <w:highlight w:val="yellow"/>
+          <w:shd w:val="clear" w:color="auto" w:fill="auto"/>
+          <w:rtl/>
+        </w:rPr>
+        <w:t>ש</w:t>
+      </w:r>
+      <w:r>
+        <w:rPr>
+          <w:rStyle w:val="CommentTok"/>
+          <w:rFonts w:asciiTheme="minorHAnsi" w:hAnsiTheme="minorHAnsi" w:hint="cs"/>
+          <w:color w:val="auto"/>
+          <w:sz w:val="24"/>
+          <w:highlight w:val="yellow"/>
+          <w:shd w:val="clear" w:color="auto" w:fill="auto"/>
+          <w:rtl/>
+        </w:rPr>
+        <w:t>נ</w:t>
+      </w:r>
+      <w:r>
+        <w:rPr>
+          <w:rStyle w:val="CommentTok"/>
+          <w:rFonts w:asciiTheme="minorHAnsi" w:hAnsiTheme="minorHAnsi" w:hint="cs"/>
+          <w:color w:val="auto"/>
+          <w:sz w:val="24"/>
+          <w:highlight w:val="yellow"/>
+          <w:shd w:val="clear" w:color="auto" w:fill="auto"/>
+          <w:rtl/>
+        </w:rPr>
+        <w:t>אמוד</w:t>
+      </w:r>
+      <w:proofErr w:type="spellEnd"/>
+      <w:r>
+        <w:rPr>
+          <w:rStyle w:val="CommentTok"/>
+          <w:rFonts w:asciiTheme="minorHAnsi" w:hAnsiTheme="minorHAnsi" w:hint="cs"/>
+          <w:color w:val="auto"/>
+          <w:sz w:val="24"/>
+          <w:highlight w:val="yellow"/>
+          <w:shd w:val="clear" w:color="auto" w:fill="auto"/>
+          <w:rtl/>
+        </w:rPr>
+        <w:t xml:space="preserve"> את מידת התרומה של משתנה זה לניבוי.</w:t>
+      </w:r>
+      <w:r>
+        <w:rPr>
+          <w:rStyle w:val="CommentTok"/>
+          <w:rFonts w:asciiTheme="minorHAnsi" w:hAnsiTheme="minorHAnsi" w:hint="cs"/>
+          <w:color w:val="auto"/>
+          <w:sz w:val="24"/>
+          <w:shd w:val="clear" w:color="auto" w:fill="auto"/>
+          <w:rtl/>
+        </w:rPr>
+        <w:t xml:space="preserve"> </w:t>
+      </w:r>
+      <w:r>
+        <w:rPr>
+          <w:rStyle w:val="CommentTok"/>
+          <w:rFonts w:asciiTheme="minorHAnsi" w:hAnsiTheme="minorHAnsi" w:hint="cs"/>
+          <w:color w:val="auto"/>
+          <w:sz w:val="24"/>
+          <w:shd w:val="clear" w:color="auto" w:fill="auto"/>
+          <w:rtl/>
+        </w:rPr>
+        <w:t xml:space="preserve"> </w:t>
+      </w:r>
+    </w:p>
+    <w:p>
+      <w:pPr>
+        <w:bidi/>
+        <w:spacing w:line="360" w:lineRule="auto"/>
+        <w:rPr>
+          <w:rStyle w:val="CommentTok"/>
+          <w:rFonts w:asciiTheme="minorHAnsi" w:hAnsiTheme="minorHAnsi"/>
+          <w:color w:val="auto"/>
+          <w:sz w:val="24"/>
+          <w:shd w:val="clear" w:color="auto" w:fill="auto"/>
+          <w:rtl/>
+        </w:rPr>
+      </w:pPr>
+      <w:r>
+        <w:rPr>
+          <w:rStyle w:val="CommentTok"/>
+          <w:rFonts w:asciiTheme="minorHAnsi" w:hAnsiTheme="minorHAnsi" w:hint="cs"/>
+          <w:color w:val="auto"/>
+          <w:sz w:val="24"/>
+          <w:shd w:val="clear" w:color="auto" w:fill="auto"/>
+          <w:rtl/>
+        </w:rPr>
+        <w:t xml:space="preserve">תחת ההנחה כי משתמשים שערכם במשתנה </w:t>
+      </w:r>
+      <w:proofErr w:type="spellStart"/>
+      <w:r>
+        <w:rPr>
+          <w:rStyle w:val="CommentTok"/>
+          <w:rFonts w:asciiTheme="minorHAnsi" w:hAnsiTheme="minorHAnsi"/>
+          <w:color w:val="auto"/>
+          <w:sz w:val="24"/>
+          <w:shd w:val="clear" w:color="auto" w:fill="auto"/>
+        </w:rPr>
+        <w:t>jobTitle</w:t>
+      </w:r>
+      <w:proofErr w:type="spellEnd"/>
+      <w:r>
+        <w:rPr>
+          <w:rStyle w:val="CommentTok"/>
+          <w:rFonts w:asciiTheme="minorHAnsi" w:hAnsiTheme="minorHAnsi" w:hint="cs"/>
+          <w:color w:val="auto"/>
+          <w:sz w:val="24"/>
+          <w:shd w:val="clear" w:color="auto" w:fill="auto"/>
+          <w:rtl/>
+        </w:rPr>
+        <w:t xml:space="preserve"> שווה ל-</w:t>
+      </w:r>
+      <w:r>
+        <w:rPr>
+          <w:rStyle w:val="CommentTok"/>
+          <w:rFonts w:asciiTheme="minorHAnsi" w:hAnsiTheme="minorHAnsi"/>
+          <w:color w:val="auto"/>
+          <w:sz w:val="24"/>
+          <w:shd w:val="clear" w:color="auto" w:fill="auto"/>
+        </w:rPr>
+        <w:t>False</w:t>
+      </w:r>
+      <w:r>
+        <w:rPr>
+          <w:rStyle w:val="CommentTok"/>
+          <w:rFonts w:asciiTheme="minorHAnsi" w:hAnsiTheme="minorHAnsi" w:hint="cs"/>
+          <w:color w:val="auto"/>
+          <w:sz w:val="24"/>
+          <w:shd w:val="clear" w:color="auto" w:fill="auto"/>
+          <w:rtl/>
+        </w:rPr>
+        <w:t xml:space="preserve"> הכוונה למובטלים, שינינו את ערכם במילה </w:t>
+      </w:r>
+      <w:r>
+        <w:rPr>
+          <w:rStyle w:val="CommentTok"/>
+          <w:rFonts w:asciiTheme="minorHAnsi" w:hAnsiTheme="minorHAnsi"/>
+          <w:color w:val="auto"/>
+          <w:sz w:val="24"/>
+          <w:shd w:val="clear" w:color="auto" w:fill="auto"/>
+        </w:rPr>
+        <w:t>‘unemployed’</w:t>
+      </w:r>
+      <w:r>
+        <w:rPr>
+          <w:rStyle w:val="CommentTok"/>
+          <w:rFonts w:asciiTheme="minorHAnsi" w:hAnsiTheme="minorHAnsi" w:hint="cs"/>
+          <w:color w:val="auto"/>
+          <w:sz w:val="24"/>
+          <w:shd w:val="clear" w:color="auto" w:fill="auto"/>
+          <w:rtl/>
+        </w:rPr>
+        <w:t xml:space="preserve"> על מנת ״לתפוס״ את המשמעות הסמנטית של ערך זה. </w:t>
+      </w:r>
+      <w:r>
+        <w:rPr>
+          <w:rStyle w:val="CommentTok"/>
+          <w:rFonts w:asciiTheme="minorHAnsi" w:hAnsiTheme="minorHAnsi" w:hint="cs"/>
+          <w:color w:val="auto"/>
+          <w:sz w:val="24"/>
+          <w:shd w:val="clear" w:color="auto" w:fill="auto"/>
+          <w:rtl/>
+        </w:rPr>
+        <w:t xml:space="preserve"> יצרנו את הקורפוס של נתונינו ללא כל </w:t>
+      </w:r>
+      <w:r>
+        <w:rPr>
+          <w:rStyle w:val="CommentTok"/>
+          <w:rFonts w:asciiTheme="minorHAnsi" w:hAnsiTheme="minorHAnsi" w:hint="cs"/>
+          <w:color w:val="auto"/>
+          <w:sz w:val="24"/>
+          <w:shd w:val="clear" w:color="auto" w:fill="auto"/>
+          <w:rtl/>
+        </w:rPr>
+        <w:lastRenderedPageBreak/>
+        <w:t>מניפולציה (</w:t>
+      </w:r>
+      <w:r>
+        <w:rPr>
+          <w:rStyle w:val="CommentTok"/>
+          <w:rFonts w:asciiTheme="minorHAnsi" w:hAnsiTheme="minorHAnsi"/>
+          <w:color w:val="auto"/>
+          <w:sz w:val="24"/>
+          <w:shd w:val="clear" w:color="auto" w:fill="auto"/>
+        </w:rPr>
+        <w:t>Stem</w:t>
+      </w:r>
+      <w:r>
+        <w:rPr>
+          <w:rStyle w:val="CommentTok"/>
+          <w:rFonts w:asciiTheme="minorHAnsi" w:hAnsiTheme="minorHAnsi" w:hint="cs"/>
+          <w:color w:val="auto"/>
+          <w:sz w:val="24"/>
+          <w:shd w:val="clear" w:color="auto" w:fill="auto"/>
+          <w:rtl/>
+        </w:rPr>
+        <w:t xml:space="preserve"> או </w:t>
+      </w:r>
+      <w:r>
+        <w:rPr>
+          <w:rStyle w:val="CommentTok"/>
+          <w:rFonts w:asciiTheme="minorHAnsi" w:hAnsiTheme="minorHAnsi"/>
+          <w:color w:val="auto"/>
+          <w:sz w:val="24"/>
+          <w:shd w:val="clear" w:color="auto" w:fill="auto"/>
+        </w:rPr>
+        <w:t>Lemmatization</w:t>
+      </w:r>
+      <w:r>
+        <w:rPr>
+          <w:rStyle w:val="CommentTok"/>
+          <w:rFonts w:asciiTheme="minorHAnsi" w:hAnsiTheme="minorHAnsi" w:hint="cs"/>
+          <w:color w:val="auto"/>
+          <w:sz w:val="24"/>
+          <w:shd w:val="clear" w:color="auto" w:fill="auto"/>
+          <w:rtl/>
+        </w:rPr>
+        <w:t>) משום שכאמור הטקסט הוא פשוט ואי</w:t>
+      </w:r>
+      <w:r>
+        <w:rPr>
+          <w:rStyle w:val="CommentTok"/>
+          <w:rFonts w:asciiTheme="minorHAnsi" w:hAnsiTheme="minorHAnsi" w:hint="cs"/>
+          <w:color w:val="auto"/>
+          <w:sz w:val="24"/>
+          <w:shd w:val="clear" w:color="auto" w:fill="auto"/>
+          <w:rtl/>
+        </w:rPr>
+        <w:t>נו מצוי בתוך משפט (דבר אשר יוצר שינוי דקדוקי במבנה המילה)</w:t>
+      </w:r>
+      <w:r>
+        <w:rPr>
+          <w:rStyle w:val="CommentTok"/>
+          <w:rFonts w:asciiTheme="minorHAnsi" w:hAnsiTheme="minorHAnsi" w:hint="cs"/>
+          <w:color w:val="auto"/>
+          <w:sz w:val="24"/>
+          <w:shd w:val="clear" w:color="auto" w:fill="auto"/>
+          <w:rtl/>
+        </w:rPr>
+        <w:t xml:space="preserve">. המודל שבחרנו הוא מסוג </w:t>
+      </w:r>
+      <w:proofErr w:type="spellStart"/>
+      <w:r>
+        <w:rPr>
+          <w:rStyle w:val="NormalTok"/>
+        </w:rPr>
+        <w:t>GloVe</w:t>
+      </w:r>
+      <w:proofErr w:type="spellEnd"/>
+      <w:r>
+        <w:rPr>
+          <w:rStyle w:val="CommentTok"/>
+          <w:rFonts w:asciiTheme="minorHAnsi" w:hAnsiTheme="minorHAnsi" w:hint="cs"/>
+          <w:color w:val="auto"/>
+          <w:sz w:val="24"/>
+          <w:shd w:val="clear" w:color="auto" w:fill="auto"/>
+          <w:rtl/>
+        </w:rPr>
+        <w:t xml:space="preserve"> </w:t>
+      </w:r>
+      <w:r>
+        <w:rPr>
+          <w:rStyle w:val="CommentTok"/>
+          <w:rFonts w:asciiTheme="minorHAnsi" w:hAnsiTheme="minorHAnsi" w:hint="cs"/>
+          <w:color w:val="auto"/>
+          <w:sz w:val="24"/>
+          <w:shd w:val="clear" w:color="auto" w:fill="auto"/>
+          <w:rtl/>
+        </w:rPr>
+        <w:t xml:space="preserve">ומאחר שהטקסט שלנו אינו עשיר בתוכן בחרנו במודל </w:t>
+      </w:r>
+      <w:r>
+        <w:rPr>
+          <w:rStyle w:val="StringTok"/>
+        </w:rPr>
+        <w:t>glove.6B.50d</w:t>
+      </w:r>
+      <w:r>
+        <w:rPr>
+          <w:rStyle w:val="StringTok"/>
+          <w:rFonts w:hint="cs"/>
+          <w:rtl/>
+        </w:rPr>
+        <w:t xml:space="preserve"> </w:t>
+      </w:r>
+      <w:r>
+        <w:rPr>
+          <w:rStyle w:val="CommentTok"/>
+          <w:rFonts w:asciiTheme="minorHAnsi" w:hAnsiTheme="minorHAnsi" w:hint="cs"/>
+          <w:color w:val="auto"/>
+          <w:sz w:val="24"/>
+          <w:shd w:val="clear" w:color="auto" w:fill="auto"/>
+          <w:rtl/>
+        </w:rPr>
+        <w:t xml:space="preserve">שהינו פשוט יחסית להרצה. </w:t>
+      </w:r>
+      <w:r>
+        <w:rPr>
+          <w:rStyle w:val="CommentTok"/>
+          <w:rFonts w:asciiTheme="minorHAnsi" w:hAnsiTheme="minorHAnsi" w:hint="cs"/>
+          <w:color w:val="auto"/>
+          <w:sz w:val="24"/>
+          <w:shd w:val="clear" w:color="auto" w:fill="auto"/>
+          <w:rtl/>
+        </w:rPr>
+        <w:t>לאחר שלב ה-</w:t>
+      </w:r>
+      <w:r>
+        <w:rPr>
+          <w:rStyle w:val="CommentTok"/>
+          <w:rFonts w:asciiTheme="minorHAnsi" w:hAnsiTheme="minorHAnsi"/>
+          <w:color w:val="auto"/>
+          <w:sz w:val="24"/>
+          <w:shd w:val="clear" w:color="auto" w:fill="auto"/>
+        </w:rPr>
+        <w:t xml:space="preserve">text embedding </w:t>
+      </w:r>
+      <w:r>
+        <w:rPr>
+          <w:rStyle w:val="CommentTok"/>
+          <w:rFonts w:asciiTheme="minorHAnsi" w:hAnsiTheme="minorHAnsi" w:hint="cs"/>
+          <w:color w:val="auto"/>
+          <w:sz w:val="24"/>
+          <w:shd w:val="clear" w:color="auto" w:fill="auto"/>
+          <w:rtl/>
+        </w:rPr>
+        <w:t xml:space="preserve"> של הקורפוס שלנו</w:t>
+      </w:r>
+      <w:r>
+        <w:rPr>
+          <w:rStyle w:val="CommentTok"/>
+          <w:rFonts w:asciiTheme="minorHAnsi" w:hAnsiTheme="minorHAnsi" w:hint="cs"/>
+          <w:color w:val="auto"/>
+          <w:sz w:val="24"/>
+          <w:shd w:val="clear" w:color="auto" w:fill="auto"/>
+          <w:rtl/>
+        </w:rPr>
+        <w:t>,</w:t>
+      </w:r>
+      <w:r>
+        <w:rPr>
+          <w:rStyle w:val="CommentTok"/>
+          <w:rFonts w:asciiTheme="minorHAnsi" w:hAnsiTheme="minorHAnsi" w:hint="cs"/>
+          <w:color w:val="auto"/>
+          <w:sz w:val="24"/>
+          <w:shd w:val="clear" w:color="auto" w:fill="auto"/>
+          <w:rtl/>
+        </w:rPr>
+        <w:t xml:space="preserve"> ירדו לנו 26 משתמשים אשר מקצועם אינו נמצאו בסט האימון שעליו נבנה מודל ה-</w:t>
+      </w:r>
+      <w:r>
+        <w:rPr>
+          <w:rStyle w:val="NormalTok"/>
+        </w:rPr>
+        <w:t xml:space="preserve"> </w:t>
+      </w:r>
+      <w:proofErr w:type="spellStart"/>
+      <w:r>
+        <w:rPr>
+          <w:rStyle w:val="NormalTok"/>
+        </w:rPr>
+        <w:t>GloVe</w:t>
+      </w:r>
+      <w:proofErr w:type="spellEnd"/>
+      <w:r>
+        <w:rPr>
+          <w:rStyle w:val="CommentTok"/>
+          <w:rFonts w:asciiTheme="minorHAnsi" w:hAnsiTheme="minorHAnsi" w:hint="cs"/>
+          <w:color w:val="auto"/>
+          <w:sz w:val="24"/>
+          <w:shd w:val="clear" w:color="auto" w:fill="auto"/>
+          <w:rtl/>
+        </w:rPr>
+        <w:t>. בדיקה ידנית הראתה כי הסיבה שמקצוען לא נמצא היא בגלל שגיאת כתיב או  שלא נכתבו באנגלית (</w:t>
+      </w:r>
+      <w:r>
+        <w:rPr>
+          <w:rStyle w:val="CommentTok"/>
+        </w:rPr>
+        <w:t>"</w:t>
+      </w:r>
+      <w:proofErr w:type="spellStart"/>
+      <w:r>
+        <w:rPr>
+          <w:rStyle w:val="CommentTok"/>
+        </w:rPr>
+        <w:t>programmerare</w:t>
+      </w:r>
+      <w:proofErr w:type="spellEnd"/>
+      <w:r>
+        <w:rPr>
+          <w:rStyle w:val="CommentTok"/>
+        </w:rPr>
+        <w:t>", "</w:t>
+      </w:r>
+      <w:proofErr w:type="spellStart"/>
+      <w:r>
+        <w:rPr>
+          <w:rStyle w:val="CommentTok"/>
+        </w:rPr>
+        <w:t>salesperon</w:t>
+      </w:r>
+      <w:proofErr w:type="spellEnd"/>
+      <w:r>
+        <w:rPr>
+          <w:rStyle w:val="CommentTok"/>
+        </w:rPr>
+        <w:t>" "</w:t>
+      </w:r>
+      <w:proofErr w:type="spellStart"/>
+      <w:r>
+        <w:rPr>
+          <w:rStyle w:val="CommentTok"/>
+        </w:rPr>
+        <w:t>rechtsreferendar</w:t>
+      </w:r>
+      <w:proofErr w:type="spellEnd"/>
+      <w:r>
+        <w:rPr>
+          <w:rStyle w:val="CommentTok"/>
+        </w:rPr>
+        <w:t>".</w:t>
+      </w:r>
+      <w:r>
+        <w:rPr>
+          <w:rStyle w:val="CommentTok"/>
+          <w:rFonts w:hint="cs"/>
+          <w:rtl/>
+        </w:rPr>
+        <w:t>)</w:t>
+      </w:r>
+      <w:r>
+        <w:rPr>
+          <w:rStyle w:val="CommentTok"/>
+          <w:rFonts w:asciiTheme="minorHAnsi" w:hAnsiTheme="minorHAnsi" w:hint="cs"/>
+          <w:color w:val="auto"/>
+          <w:sz w:val="24"/>
+          <w:shd w:val="clear" w:color="auto" w:fill="auto"/>
+          <w:rtl/>
+        </w:rPr>
+        <w:t>. בחרנו לזנוח משתמשים אלו ולא לנסות לתקן את ערכם.</w:t>
+      </w:r>
+      <w:r>
+        <w:rPr>
+          <w:rStyle w:val="CommentTok"/>
+          <w:rFonts w:asciiTheme="minorHAnsi" w:hAnsiTheme="minorHAnsi" w:hint="cs"/>
+          <w:color w:val="auto"/>
+          <w:sz w:val="24"/>
+          <w:shd w:val="clear" w:color="auto" w:fill="auto"/>
+          <w:rtl/>
+        </w:rPr>
+        <w:t xml:space="preserve"> </w:t>
+      </w:r>
+    </w:p>
+    <w:p>
+      <w:pPr>
+        <w:bidi/>
+        <w:spacing w:line="360" w:lineRule="auto"/>
+        <w:rPr>
+          <w:rStyle w:val="CommentTok"/>
+          <w:rFonts w:asciiTheme="minorHAnsi" w:hAnsiTheme="minorHAnsi"/>
+          <w:color w:val="auto"/>
+          <w:sz w:val="24"/>
+          <w:shd w:val="clear" w:color="auto" w:fill="auto"/>
+          <w:rtl/>
+        </w:rPr>
+      </w:pPr>
+      <w:r>
+        <w:rPr>
+          <w:rStyle w:val="CommentTok"/>
+          <w:rFonts w:asciiTheme="minorHAnsi" w:hAnsiTheme="minorHAnsi" w:hint="cs"/>
+          <w:color w:val="auto"/>
+          <w:sz w:val="24"/>
+          <w:shd w:val="clear" w:color="auto" w:fill="auto"/>
+          <w:rtl/>
+        </w:rPr>
+        <w:t>לאחר מכן ניבנו את ה</w:t>
+      </w:r>
+      <w:r>
+        <w:rPr>
+          <w:rStyle w:val="CommentTok"/>
+          <w:rFonts w:asciiTheme="minorHAnsi" w:hAnsiTheme="minorHAnsi" w:hint="cs"/>
+          <w:color w:val="auto"/>
+          <w:sz w:val="24"/>
+          <w:shd w:val="clear" w:color="auto" w:fill="auto"/>
+          <w:rtl/>
+        </w:rPr>
+        <w:t>מרחק של מקצועו</w:t>
+      </w:r>
+      <w:r>
+        <w:rPr>
+          <w:rStyle w:val="CommentTok"/>
+          <w:rFonts w:asciiTheme="minorHAnsi" w:hAnsiTheme="minorHAnsi" w:hint="cs"/>
+          <w:color w:val="auto"/>
+          <w:sz w:val="24"/>
+          <w:shd w:val="clear" w:color="auto" w:fill="auto"/>
+          <w:rtl/>
+        </w:rPr>
+        <w:t xml:space="preserve"> </w:t>
+      </w:r>
+      <w:r>
+        <w:rPr>
+          <w:rStyle w:val="CommentTok"/>
+          <w:rFonts w:asciiTheme="minorHAnsi" w:hAnsiTheme="minorHAnsi" w:hint="cs"/>
+          <w:color w:val="auto"/>
+          <w:sz w:val="24"/>
+          <w:shd w:val="clear" w:color="auto" w:fill="auto"/>
+          <w:rtl/>
+        </w:rPr>
+        <w:t>של כל משתמש</w:t>
+      </w:r>
+      <w:r>
+        <w:rPr>
+          <w:rStyle w:val="CommentTok"/>
+          <w:rFonts w:asciiTheme="minorHAnsi" w:hAnsiTheme="minorHAnsi" w:hint="cs"/>
+          <w:color w:val="auto"/>
+          <w:sz w:val="24"/>
+          <w:shd w:val="clear" w:color="auto" w:fill="auto"/>
+          <w:rtl/>
+        </w:rPr>
+        <w:t xml:space="preserve"> בעזרת  </w:t>
+      </w:r>
+      <w:r>
+        <w:rPr>
+          <w:rStyle w:val="CommentTok"/>
+          <w:rFonts w:asciiTheme="minorHAnsi" w:hAnsiTheme="minorHAnsi"/>
+          <w:color w:val="auto"/>
+          <w:sz w:val="24"/>
+          <w:shd w:val="clear" w:color="auto" w:fill="auto"/>
+        </w:rPr>
+        <w:t>cosine similarity</w:t>
+      </w:r>
+      <w:r>
+        <w:rPr>
+          <w:rStyle w:val="CommentTok"/>
+          <w:rFonts w:asciiTheme="minorHAnsi" w:hAnsiTheme="minorHAnsi" w:hint="cs"/>
+          <w:color w:val="auto"/>
+          <w:sz w:val="24"/>
+          <w:shd w:val="clear" w:color="auto" w:fill="auto"/>
+          <w:rtl/>
+        </w:rPr>
+        <w:t xml:space="preserve"> </w:t>
+      </w:r>
+      <w:r>
+        <w:rPr>
+          <w:rStyle w:val="CommentTok"/>
+          <w:rFonts w:asciiTheme="minorHAnsi" w:hAnsiTheme="minorHAnsi" w:hint="cs"/>
+          <w:color w:val="auto"/>
+          <w:sz w:val="24"/>
+          <w:shd w:val="clear" w:color="auto" w:fill="auto"/>
+          <w:rtl/>
+        </w:rPr>
+        <w:t xml:space="preserve">ביחס למילה </w:t>
+      </w:r>
+      <w:r>
+        <w:rPr>
+          <w:rStyle w:val="CommentTok"/>
+          <w:rFonts w:asciiTheme="minorHAnsi" w:hAnsiTheme="minorHAnsi" w:hint="cs"/>
+          <w:color w:val="auto"/>
+          <w:sz w:val="24"/>
+          <w:shd w:val="clear" w:color="auto" w:fill="auto"/>
+          <w:rtl/>
+        </w:rPr>
+        <w:t xml:space="preserve">  </w:t>
+      </w:r>
+      <w:r>
+        <w:rPr>
+          <w:rStyle w:val="NormalTok"/>
+        </w:rPr>
+        <w:t>‘engineer’</w:t>
+      </w:r>
+      <w:r>
+        <w:rPr>
+          <w:rStyle w:val="CommentTok"/>
+          <w:rFonts w:asciiTheme="minorHAnsi" w:hAnsiTheme="minorHAnsi" w:hint="cs"/>
+          <w:color w:val="auto"/>
+          <w:sz w:val="24"/>
+          <w:shd w:val="clear" w:color="auto" w:fill="auto"/>
+          <w:rtl/>
+        </w:rPr>
+        <w:t>, והוספנו את הערך שהתקבל לסט הנתונים.</w:t>
+      </w:r>
+    </w:p>
+    <w:p>
+      <w:pPr>
+        <w:bidi/>
+        <w:spacing w:line="360" w:lineRule="auto"/>
+        <w:rPr>
+          <w:rStyle w:val="CommentTok"/>
+          <w:rFonts w:asciiTheme="minorHAnsi" w:hAnsiTheme="minorHAnsi"/>
+          <w:color w:val="auto"/>
+          <w:sz w:val="24"/>
+          <w:shd w:val="clear" w:color="auto" w:fill="auto"/>
+          <w:rtl/>
+        </w:rPr>
+      </w:pPr>
+      <w:r>
+        <w:rPr>
+          <w:rStyle w:val="CommentTok"/>
+          <w:rFonts w:asciiTheme="minorHAnsi" w:hAnsiTheme="minorHAnsi" w:hint="cs"/>
+          <w:color w:val="auto"/>
+          <w:sz w:val="24"/>
+          <w:shd w:val="clear" w:color="auto" w:fill="auto"/>
+          <w:rtl/>
+        </w:rPr>
+        <w:t>לסיכום, שלב ה-</w:t>
+      </w:r>
+      <w:r>
+        <w:rPr>
+          <w:rStyle w:val="CommentTok"/>
+          <w:rFonts w:asciiTheme="minorHAnsi" w:hAnsiTheme="minorHAnsi"/>
+          <w:color w:val="auto"/>
+          <w:sz w:val="24"/>
+          <w:shd w:val="clear" w:color="auto" w:fill="auto"/>
+        </w:rPr>
+        <w:t>preprocessing</w:t>
+      </w:r>
+      <w:r>
+        <w:rPr>
+          <w:rStyle w:val="CommentTok"/>
+          <w:rFonts w:asciiTheme="minorHAnsi" w:hAnsiTheme="minorHAnsi" w:hint="cs"/>
+          <w:color w:val="auto"/>
+          <w:sz w:val="24"/>
+          <w:shd w:val="clear" w:color="auto" w:fill="auto"/>
+          <w:rtl/>
+        </w:rPr>
+        <w:t xml:space="preserve"> הותיר אותנו עם 321 משתמשים לשלב המידול.</w:t>
+      </w:r>
+    </w:p>
+    <w:p>
+      <w:pPr>
+        <w:bidi/>
+        <w:spacing w:line="360" w:lineRule="auto"/>
+        <w:rPr>
+          <w:rStyle w:val="CommentTok"/>
+          <w:rFonts w:asciiTheme="minorHAnsi" w:hAnsiTheme="minorHAnsi"/>
+          <w:color w:val="auto"/>
+          <w:sz w:val="24"/>
+          <w:shd w:val="clear" w:color="auto" w:fill="auto"/>
+          <w:rtl/>
         </w:rPr>
       </w:pPr>
     </w:p>
     <w:p>
       <w:pPr>
-        <w:pStyle w:val="SourceCode"/>
         <w:bidi/>
         <w:spacing w:line="360" w:lineRule="auto"/>
+        <w:rPr>
+          <w:rStyle w:val="CommentTok"/>
+          <w:rFonts w:asciiTheme="minorHAnsi" w:hAnsiTheme="minorHAnsi"/>
+          <w:color w:val="auto"/>
+          <w:sz w:val="24"/>
+          <w:shd w:val="clear" w:color="auto" w:fill="auto"/>
+          <w:rtl/>
+        </w:rPr>
       </w:pPr>
-      <w:r>
-        <w:rPr>
-          <w:rStyle w:val="CommentTok"/>
-        </w:rPr>
-        <w:t xml:space="preserve"># Since my models of Interest are not an OLS/GKM </w:t>
-      </w:r>
-      <w:proofErr w:type="gramStart"/>
-      <w:r>
-        <w:rPr>
-          <w:rStyle w:val="CommentTok"/>
-        </w:rPr>
-        <w:t>ones, and</w:t>
-      </w:r>
-      <w:proofErr w:type="gramEnd"/>
-      <w:r>
-        <w:rPr>
-          <w:rStyle w:val="CommentTok"/>
-        </w:rPr>
-        <w:t xml:space="preserve"> given that I do want to interpret the results of such modeling, I would not conduct any dimension reduction method. </w:t>
-      </w:r>
-      <w:r>
-        <w:br/>
-      </w:r>
-      <w:r>
-        <w:rPr>
-          <w:rStyle w:val="CommentTok"/>
-        </w:rPr>
-        <w:t xml:space="preserve"># My models of choice would be Boosting and Random Forest. </w:t>
-      </w:r>
     </w:p>
     <w:p>
       <w:pPr>
-        <w:pStyle w:val="SourceCode"/>
         <w:bidi/>
         <w:spacing w:line="360" w:lineRule="auto"/>
+        <w:rPr>
+          <w:rStyle w:val="CommentTok"/>
+          <w:rFonts w:asciiTheme="minorHAnsi" w:hAnsiTheme="minorHAnsi" w:hint="cs"/>
+          <w:b/>
+          <w:bCs/>
+          <w:color w:val="auto"/>
+          <w:sz w:val="24"/>
+          <w:u w:val="single"/>
+          <w:shd w:val="clear" w:color="auto" w:fill="auto"/>
+          <w:rtl/>
+        </w:rPr>
       </w:pPr>
-      <w:r>
-        <w:rPr>
-          <w:rStyle w:val="CommentTok"/>
-        </w:rPr>
-        <w:t>#Adding 'engineer' feature! - the Cosine squish to engineer in jobTitle</w:t>
-      </w:r>
-      <w:r>
-        <w:br/>
-      </w:r>
-      <w:r>
-        <w:br/>
-      </w:r>
-      <w:r>
-        <w:rPr>
-          <w:rStyle w:val="FunctionTok"/>
-        </w:rPr>
-        <w:t>library</w:t>
-      </w:r>
-      <w:r>
-        <w:rPr>
-          <w:rStyle w:val="NormalTok"/>
-        </w:rPr>
-        <w:t>(text)</w:t>
-      </w:r>
-    </w:p>
-    <w:p>
-      <w:pPr>
-        <w:pStyle w:val="SourceCode"/>
-        <w:bidi/>
-        <w:spacing w:line="360" w:lineRule="auto"/>
-      </w:pPr>
-      <w:r>
-        <w:rPr>
-          <w:rStyle w:val="VerbatimChar"/>
-          <w:rtl/>
-        </w:rPr>
-        <w:lastRenderedPageBreak/>
-        <w:t>[0;34mThis is text (version 1.5).</w:t>
-      </w:r>
-      <w:r>
-        <w:br/>
-      </w:r>
-      <w:r>
-        <w:rPr>
-          <w:rStyle w:val="VerbatimChar"/>
-          <w:rtl/>
-        </w:rPr>
-        <w:t>[0m[0;32mNewer versions may have improved functions and updated defaults to reflect current understandings of the state-of-the-art.[0m[0;35m</w:t>
-      </w:r>
-      <w:r>
-        <w:br/>
-      </w:r>
-      <w:r>
-        <w:br/>
-      </w:r>
-      <w:r>
-        <w:rPr>
-          <w:rStyle w:val="VerbatimChar"/>
-          <w:rtl/>
-        </w:rPr>
-        <w:t>For more information about the package see www.r-text.org.[0m</w:t>
-      </w:r>
-    </w:p>
-    <w:p>
-      <w:pPr>
-        <w:pStyle w:val="SourceCode"/>
-        <w:bidi/>
-        <w:spacing w:line="360" w:lineRule="auto"/>
-      </w:pPr>
-      <w:r>
-        <w:rPr>
-          <w:rStyle w:val="VerbatimChar"/>
-          <w:rtl/>
-        </w:rPr>
-        <w:t>[0;34mtextrpp python option is already set, text will use: condaenv = "textrpp_condaenv"[0m</w:t>
-      </w:r>
-    </w:p>
-    <w:p>
-      <w:pPr>
-        <w:pStyle w:val="SourceCode"/>
-        <w:bidi/>
-        <w:spacing w:line="360" w:lineRule="auto"/>
-      </w:pPr>
-      <w:r>
-        <w:rPr>
-          <w:rStyle w:val="VerbatimChar"/>
-          <w:rtl/>
-        </w:rPr>
-        <w:t>[0;32m</w:t>
-      </w:r>
-      <w:r>
-        <w:br/>
-      </w:r>
-      <w:r>
-        <w:rPr>
-          <w:rStyle w:val="VerbatimChar"/>
-          <w:rtl/>
-        </w:rPr>
-        <w:t>Successfully initialized text required python packages.</w:t>
-      </w:r>
-      <w:r>
-        <w:br/>
-      </w:r>
-      <w:r>
-        <w:rPr>
-          <w:rStyle w:val="VerbatimChar"/>
-          <w:rtl/>
-        </w:rPr>
-        <w:t>[0m</w:t>
-      </w:r>
-    </w:p>
-    <w:p>
-      <w:pPr>
-        <w:pStyle w:val="SourceCode"/>
-        <w:bidi/>
-        <w:spacing w:line="360" w:lineRule="auto"/>
-      </w:pPr>
-      <w:r>
-        <w:rPr>
-          <w:rStyle w:val="VerbatimChar"/>
-          <w:rtl/>
-        </w:rPr>
-        <w:t xml:space="preserve">[0;34mPython options: </w:t>
-      </w:r>
-      <w:r>
-        <w:br/>
-      </w:r>
-      <w:r>
-        <w:rPr>
-          <w:rStyle w:val="VerbatimChar"/>
-          <w:rtl/>
-        </w:rPr>
-        <w:t xml:space="preserve"> type = "textrpp_condaenv", </w:t>
-      </w:r>
-      <w:r>
-        <w:br/>
-      </w:r>
-      <w:r>
-        <w:rPr>
-          <w:rStyle w:val="VerbatimChar"/>
-          <w:rtl/>
-        </w:rPr>
-        <w:t xml:space="preserve"> name = "textrpp_condaenv".[0m</w:t>
-      </w:r>
-    </w:p>
-    <w:p>
-      <w:pPr>
-        <w:pStyle w:val="SourceCode"/>
-        <w:bidi/>
-        <w:spacing w:line="360" w:lineRule="auto"/>
-      </w:pPr>
-      <w:r>
-        <w:rPr>
-          <w:rStyle w:val="FunctionTok"/>
-        </w:rPr>
-        <w:t>library</w:t>
-      </w:r>
-      <w:r>
-        <w:rPr>
-          <w:rStyle w:val="NormalTok"/>
-        </w:rPr>
-        <w:t>(quanteda)</w:t>
-      </w:r>
-    </w:p>
-    <w:p>
-      <w:pPr>
-        <w:pStyle w:val="SourceCode"/>
-        <w:bidi/>
-        <w:spacing w:line="360" w:lineRule="auto"/>
-      </w:pPr>
-      <w:r>
-        <w:rPr>
-          <w:rStyle w:val="VerbatimChar"/>
-          <w:rtl/>
-        </w:rPr>
-        <w:t>Package version: 4.3.0</w:t>
-      </w:r>
-      <w:r>
-        <w:br/>
-      </w:r>
-      <w:r>
-        <w:rPr>
-          <w:rStyle w:val="VerbatimChar"/>
-          <w:rtl/>
-        </w:rPr>
-        <w:t>Unicode version: 14.0</w:t>
-      </w:r>
-      <w:r>
-        <w:br/>
-      </w:r>
-      <w:r>
-        <w:rPr>
-          <w:rStyle w:val="VerbatimChar"/>
-          <w:rtl/>
-        </w:rPr>
-        <w:t>ICU version: 71.1</w:t>
-      </w:r>
-    </w:p>
-    <w:p>
-      <w:pPr>
-        <w:pStyle w:val="SourceCode"/>
-        <w:bidi/>
-        <w:spacing w:line="360" w:lineRule="auto"/>
-      </w:pPr>
-      <w:r>
-        <w:rPr>
-          <w:rStyle w:val="VerbatimChar"/>
-          <w:rtl/>
-        </w:rPr>
-        <w:t>Parallel computing: disabled</w:t>
-      </w:r>
-    </w:p>
-    <w:p>
-      <w:pPr>
-        <w:pStyle w:val="SourceCode"/>
-        <w:bidi/>
-        <w:spacing w:line="360" w:lineRule="auto"/>
-      </w:pPr>
-      <w:r>
-        <w:rPr>
-          <w:rStyle w:val="VerbatimChar"/>
-          <w:rtl/>
-        </w:rPr>
-        <w:t>See https://quanteda.io for tutorials and examples.</w:t>
-      </w:r>
-    </w:p>
-    <w:p>
-      <w:pPr>
-        <w:pStyle w:val="SourceCode"/>
-        <w:bidi/>
-        <w:spacing w:line="360" w:lineRule="auto"/>
-      </w:pPr>
-      <w:r>
-        <w:rPr>
-          <w:rStyle w:val="FunctionTok"/>
-        </w:rPr>
-        <w:t>library</w:t>
-      </w:r>
-      <w:r>
-        <w:rPr>
-          <w:rStyle w:val="NormalTok"/>
-        </w:rPr>
-        <w:t>(embedplyr)</w:t>
-      </w:r>
-      <w:r>
-        <w:br/>
-      </w:r>
-      <w:r>
-        <w:rPr>
-          <w:rStyle w:val="CommentTok"/>
-        </w:rPr>
-        <w:t>#First things First, Is to make our corpus, done using the jobTitle column.</w:t>
-      </w:r>
-      <w:r>
-        <w:br/>
-      </w:r>
-      <w:r>
-        <w:br/>
-      </w:r>
-      <w:r>
-        <w:rPr>
-          <w:rStyle w:val="NormalTok"/>
-        </w:rPr>
-        <w:t xml:space="preserve"> </w:t>
-      </w:r>
-      <w:r>
-        <w:rPr>
-          <w:rStyle w:val="FunctionTok"/>
-        </w:rPr>
-        <w:t>sum</w:t>
-      </w:r>
-      <w:r>
-        <w:rPr>
-          <w:rStyle w:val="NormalTok"/>
-        </w:rPr>
-        <w:t>(Tinder_filtered</w:t>
-      </w:r>
-      <w:r>
-        <w:rPr>
-          <w:rStyle w:val="SpecialCharTok"/>
-        </w:rPr>
-        <w:t>$</w:t>
-      </w:r>
-      <w:r>
-        <w:rPr>
-          <w:rStyle w:val="NormalTok"/>
-        </w:rPr>
-        <w:t xml:space="preserve">jobTitle </w:t>
-      </w:r>
-      <w:r>
-        <w:rPr>
-          <w:rStyle w:val="SpecialCharTok"/>
-        </w:rPr>
-        <w:t>==</w:t>
-      </w:r>
-      <w:r>
-        <w:rPr>
-          <w:rStyle w:val="NormalTok"/>
-        </w:rPr>
-        <w:t xml:space="preserve"> </w:t>
-      </w:r>
-      <w:r>
-        <w:rPr>
-          <w:rStyle w:val="StringTok"/>
-        </w:rPr>
-        <w:t>"unknown"</w:t>
-      </w:r>
-      <w:r>
-        <w:rPr>
-          <w:rStyle w:val="NormalTok"/>
-        </w:rPr>
-        <w:t>)</w:t>
-      </w:r>
-    </w:p>
-    <w:p>
-      <w:pPr>
-        <w:pStyle w:val="SourceCode"/>
-        <w:bidi/>
-        <w:spacing w:line="360" w:lineRule="auto"/>
-      </w:pPr>
-      <w:r>
-        <w:rPr>
-          <w:rStyle w:val="VerbatimChar"/>
-          <w:rtl/>
-        </w:rPr>
-        <w:t>[1] 576</w:t>
-      </w:r>
-    </w:p>
-    <w:p>
-      <w:pPr>
-        <w:pStyle w:val="SourceCode"/>
-        <w:bidi/>
-        <w:spacing w:line="360" w:lineRule="auto"/>
-      </w:pPr>
-      <w:r>
-        <w:rPr>
-          <w:rStyle w:val="CommentTok"/>
-        </w:rPr>
-        <w:t xml:space="preserve">#[1] 576 </w:t>
-      </w:r>
-      <w:r>
-        <w:br/>
-      </w:r>
-      <w:r>
-        <w:rPr>
-          <w:rStyle w:val="NormalTok"/>
-        </w:rPr>
-        <w:t xml:space="preserve"> </w:t>
-      </w:r>
-      <w:r>
-        <w:br/>
-      </w:r>
-      <w:r>
-        <w:rPr>
-          <w:rStyle w:val="NormalTok"/>
-        </w:rPr>
-        <w:t xml:space="preserve"> </w:t>
-      </w:r>
-      <w:r>
-        <w:rPr>
-          <w:rStyle w:val="FunctionTok"/>
-        </w:rPr>
-        <w:t>nrow</w:t>
-      </w:r>
-      <w:r>
-        <w:rPr>
-          <w:rStyle w:val="NormalTok"/>
-        </w:rPr>
-        <w:t xml:space="preserve">(Tinder_filtered) </w:t>
-      </w:r>
-      <w:r>
-        <w:rPr>
-          <w:rStyle w:val="SpecialCharTok"/>
-        </w:rPr>
-        <w:t>-</w:t>
-      </w:r>
-      <w:r>
-        <w:rPr>
-          <w:rStyle w:val="NormalTok"/>
-        </w:rPr>
-        <w:t xml:space="preserve">  </w:t>
-      </w:r>
-      <w:r>
-        <w:rPr>
-          <w:rStyle w:val="FunctionTok"/>
-        </w:rPr>
-        <w:t>sum</w:t>
-      </w:r>
-      <w:r>
-        <w:rPr>
-          <w:rStyle w:val="NormalTok"/>
-        </w:rPr>
-        <w:t>(Tinder_filtered</w:t>
-      </w:r>
-      <w:r>
-        <w:rPr>
-          <w:rStyle w:val="SpecialCharTok"/>
-        </w:rPr>
-        <w:t>$</w:t>
-      </w:r>
-      <w:r>
-        <w:rPr>
-          <w:rStyle w:val="NormalTok"/>
-        </w:rPr>
-        <w:t xml:space="preserve">jobTitle </w:t>
-      </w:r>
-      <w:r>
-        <w:rPr>
-          <w:rStyle w:val="SpecialCharTok"/>
-        </w:rPr>
-        <w:t>==</w:t>
-      </w:r>
-      <w:r>
-        <w:rPr>
-          <w:rStyle w:val="NormalTok"/>
-        </w:rPr>
-        <w:t xml:space="preserve"> </w:t>
-      </w:r>
-      <w:r>
-        <w:rPr>
-          <w:rStyle w:val="StringTok"/>
-        </w:rPr>
-        <w:t>"unknown"</w:t>
-      </w:r>
-      <w:r>
-        <w:rPr>
-          <w:rStyle w:val="NormalTok"/>
-        </w:rPr>
-        <w:t>)</w:t>
-      </w:r>
-    </w:p>
-    <w:p>
-      <w:pPr>
-        <w:pStyle w:val="SourceCode"/>
-        <w:bidi/>
-        <w:spacing w:line="360" w:lineRule="auto"/>
-      </w:pPr>
-      <w:r>
-        <w:rPr>
-          <w:rStyle w:val="VerbatimChar"/>
-          <w:rtl/>
-        </w:rPr>
-        <w:lastRenderedPageBreak/>
-        <w:t>[1] 335</w:t>
-      </w:r>
-    </w:p>
-    <w:p>
-      <w:pPr>
-        <w:pStyle w:val="SourceCode"/>
-        <w:bidi/>
-        <w:spacing w:line="360" w:lineRule="auto"/>
-      </w:pPr>
-      <w:r>
-        <w:rPr>
-          <w:rStyle w:val="CommentTok"/>
-        </w:rPr>
-        <w:t>#[1] 335</w:t>
-      </w:r>
-      <w:r>
-        <w:br/>
-      </w:r>
-      <w:r>
-        <w:rPr>
-          <w:rStyle w:val="NormalTok"/>
-        </w:rPr>
-        <w:t xml:space="preserve"> </w:t>
-      </w:r>
-      <w:r>
-        <w:br/>
-      </w:r>
-      <w:r>
-        <w:rPr>
-          <w:rStyle w:val="NormalTok"/>
-        </w:rPr>
-        <w:t xml:space="preserve"> </w:t>
-      </w:r>
-      <w:r>
-        <w:rPr>
-          <w:rStyle w:val="CommentTok"/>
-        </w:rPr>
-        <w:t xml:space="preserve">#That leaves us with only 335 informative users that hat a job Title </w:t>
-      </w:r>
-      <w:r>
-        <w:br/>
-      </w:r>
-      <w:r>
-        <w:rPr>
-          <w:rStyle w:val="NormalTok"/>
-        </w:rPr>
-        <w:t xml:space="preserve"> </w:t>
-      </w:r>
-      <w:r>
-        <w:br/>
-      </w:r>
-      <w:r>
-        <w:br/>
-      </w:r>
-      <w:r>
-        <w:rPr>
-          <w:rStyle w:val="NormalTok"/>
-        </w:rPr>
-        <w:t xml:space="preserve"> </w:t>
-      </w:r>
-      <w:r>
-        <w:br/>
-      </w:r>
-      <w:r>
-        <w:rPr>
-          <w:rStyle w:val="NormalTok"/>
-        </w:rPr>
-        <w:t xml:space="preserve"> </w:t>
-      </w:r>
-      <w:r>
-        <w:br/>
-      </w:r>
-      <w:r>
-        <w:rPr>
-          <w:rStyle w:val="NormalTok"/>
-        </w:rPr>
-        <w:t xml:space="preserve"> </w:t>
-      </w:r>
-      <w:r>
-        <w:rPr>
-          <w:rStyle w:val="CommentTok"/>
-        </w:rPr>
-        <w:t xml:space="preserve">#------- Pre-processing---------- </w:t>
-      </w:r>
-      <w:r>
-        <w:br/>
-      </w:r>
-      <w:r>
-        <w:rPr>
-          <w:rStyle w:val="NormalTok"/>
-        </w:rPr>
-        <w:t xml:space="preserve"> </w:t>
-      </w:r>
-      <w:r>
-        <w:br/>
-      </w:r>
-      <w:r>
-        <w:rPr>
-          <w:rStyle w:val="NormalTok"/>
-        </w:rPr>
-        <w:t xml:space="preserve">Tinder_filtered_for_txt </w:t>
-      </w:r>
-      <w:r>
-        <w:rPr>
-          <w:rStyle w:val="OtherTok"/>
-        </w:rPr>
-        <w:t>&lt;-</w:t>
-      </w:r>
-      <w:r>
-        <w:rPr>
-          <w:rStyle w:val="NormalTok"/>
-        </w:rPr>
-        <w:t xml:space="preserve"> Tinder_filtered </w:t>
-      </w:r>
-      <w:r>
-        <w:rPr>
-          <w:rStyle w:val="SpecialCharTok"/>
-        </w:rPr>
-        <w:t>|&gt;</w:t>
-      </w:r>
-      <w:r>
-        <w:rPr>
-          <w:rStyle w:val="NormalTok"/>
-        </w:rPr>
-        <w:t xml:space="preserve"> </w:t>
-      </w:r>
-      <w:r>
-        <w:br/>
-      </w:r>
-      <w:r>
-        <w:rPr>
-          <w:rStyle w:val="NormalTok"/>
-        </w:rPr>
-        <w:t xml:space="preserve">   </w:t>
-      </w:r>
-      <w:r>
-        <w:rPr>
-          <w:rStyle w:val="CommentTok"/>
-        </w:rPr>
-        <w:t># Filtering out the 'unknown' users</w:t>
-      </w:r>
-      <w:r>
-        <w:br/>
-      </w:r>
-      <w:r>
-        <w:br/>
-      </w:r>
-      <w:r>
-        <w:rPr>
-          <w:rStyle w:val="NormalTok"/>
-        </w:rPr>
-        <w:t xml:space="preserve">  </w:t>
-      </w:r>
-      <w:r>
-        <w:rPr>
-          <w:rStyle w:val="FunctionTok"/>
-        </w:rPr>
-        <w:t>filter</w:t>
-      </w:r>
-      <w:r>
-        <w:rPr>
-          <w:rStyle w:val="NormalTok"/>
-        </w:rPr>
-        <w:t xml:space="preserve">(jobTitle </w:t>
-      </w:r>
-      <w:r>
-        <w:rPr>
-          <w:rStyle w:val="SpecialCharTok"/>
-        </w:rPr>
-        <w:t>!=</w:t>
-      </w:r>
-      <w:r>
-        <w:rPr>
-          <w:rStyle w:val="NormalTok"/>
-        </w:rPr>
-        <w:t xml:space="preserve"> </w:t>
-      </w:r>
-      <w:r>
-        <w:rPr>
-          <w:rStyle w:val="StringTok"/>
-        </w:rPr>
-        <w:t>"unknown"</w:t>
-      </w:r>
-      <w:r>
-        <w:rPr>
-          <w:rStyle w:val="NormalTok"/>
-        </w:rPr>
-        <w:t xml:space="preserve">)  </w:t>
-      </w:r>
-      <w:r>
-        <w:rPr>
-          <w:rStyle w:val="SpecialCharTok"/>
-        </w:rPr>
-        <w:t>|&gt;</w:t>
-      </w:r>
-      <w:r>
-        <w:rPr>
-          <w:rStyle w:val="NormalTok"/>
-        </w:rPr>
-        <w:t xml:space="preserve"> </w:t>
-      </w:r>
-      <w:r>
-        <w:br/>
-      </w:r>
-      <w:r>
-        <w:rPr>
-          <w:rStyle w:val="NormalTok"/>
-        </w:rPr>
-        <w:t xml:space="preserve">   </w:t>
-      </w:r>
-      <w:r>
-        <w:rPr>
-          <w:rStyle w:val="CommentTok"/>
-        </w:rPr>
-        <w:t xml:space="preserve"># Assuming that users with 'False' jobTitle are those that manually chose 'false' indicating that they are unemployed </w:t>
-      </w:r>
-      <w:r>
-        <w:br/>
-      </w:r>
-      <w:r>
-        <w:rPr>
-          <w:rStyle w:val="NormalTok"/>
-        </w:rPr>
-        <w:t xml:space="preserve">   </w:t>
-      </w:r>
-      <w:r>
-        <w:rPr>
-          <w:rStyle w:val="FunctionTok"/>
-        </w:rPr>
-        <w:t>mutate</w:t>
-      </w:r>
-      <w:r>
-        <w:rPr>
-          <w:rStyle w:val="NormalTok"/>
-        </w:rPr>
-        <w:t>(</w:t>
-      </w:r>
-      <w:r>
-        <w:rPr>
-          <w:rStyle w:val="AttributeTok"/>
-        </w:rPr>
-        <w:t>jobTitle =</w:t>
-      </w:r>
-      <w:r>
-        <w:rPr>
-          <w:rStyle w:val="NormalTok"/>
-        </w:rPr>
-        <w:t xml:space="preserve"> </w:t>
-      </w:r>
-      <w:r>
-        <w:rPr>
-          <w:rStyle w:val="FunctionTok"/>
-        </w:rPr>
-        <w:t>ifelse</w:t>
-      </w:r>
-      <w:r>
-        <w:rPr>
-          <w:rStyle w:val="NormalTok"/>
-        </w:rPr>
-        <w:t xml:space="preserve">(jobTitle </w:t>
-      </w:r>
-      <w:r>
-        <w:rPr>
-          <w:rStyle w:val="SpecialCharTok"/>
-        </w:rPr>
-        <w:t>==</w:t>
-      </w:r>
-      <w:r>
-        <w:rPr>
-          <w:rStyle w:val="NormalTok"/>
-        </w:rPr>
-        <w:t xml:space="preserve"> </w:t>
-      </w:r>
-      <w:r>
-        <w:rPr>
-          <w:rStyle w:val="StringTok"/>
-        </w:rPr>
-        <w:t>"False"</w:t>
-      </w:r>
-      <w:r>
-        <w:rPr>
-          <w:rStyle w:val="NormalTok"/>
-        </w:rPr>
-        <w:t>,</w:t>
-      </w:r>
-      <w:r>
-        <w:br/>
-      </w:r>
-      <w:r>
-        <w:rPr>
-          <w:rStyle w:val="NormalTok"/>
-        </w:rPr>
-        <w:t xml:space="preserve">                 </w:t>
-      </w:r>
-      <w:r>
-        <w:rPr>
-          <w:rStyle w:val="StringTok"/>
-        </w:rPr>
-        <w:t>"unemployed"</w:t>
-      </w:r>
-      <w:r>
-        <w:rPr>
-          <w:rStyle w:val="NormalTok"/>
-        </w:rPr>
-        <w:t>,</w:t>
-      </w:r>
-      <w:r>
-        <w:br/>
-      </w:r>
-      <w:r>
-        <w:rPr>
-          <w:rStyle w:val="NormalTok"/>
-        </w:rPr>
-        <w:t xml:space="preserve">                 jobTitle))</w:t>
-      </w:r>
-      <w:r>
-        <w:br/>
-      </w:r>
-      <w:r>
-        <w:rPr>
-          <w:rStyle w:val="NormalTok"/>
-        </w:rPr>
-        <w:t xml:space="preserve"> </w:t>
-      </w:r>
-      <w:r>
-        <w:br/>
-      </w:r>
-      <w:r>
-        <w:rPr>
-          <w:rStyle w:val="CommentTok"/>
-        </w:rPr>
-        <w:t># Creating the corpus</w:t>
-      </w:r>
-      <w:r>
-        <w:br/>
-      </w:r>
-      <w:r>
-        <w:rPr>
-          <w:rStyle w:val="NormalTok"/>
-        </w:rPr>
-        <w:t xml:space="preserve">Tinder_job_corpus </w:t>
-      </w:r>
-      <w:r>
-        <w:rPr>
-          <w:rStyle w:val="OtherTok"/>
-        </w:rPr>
-        <w:t>&lt;-</w:t>
-      </w:r>
-      <w:r>
-        <w:rPr>
-          <w:rStyle w:val="NormalTok"/>
-        </w:rPr>
-        <w:t xml:space="preserve"> Tinder_filtered_for_txt </w:t>
-      </w:r>
-      <w:r>
-        <w:rPr>
-          <w:rStyle w:val="SpecialCharTok"/>
-        </w:rPr>
-        <w:t>|&gt;</w:t>
-      </w:r>
-      <w:r>
-        <w:br/>
-      </w:r>
-      <w:r>
-        <w:rPr>
-          <w:rStyle w:val="NormalTok"/>
-        </w:rPr>
-        <w:t xml:space="preserve">  </w:t>
-      </w:r>
-      <w:r>
-        <w:rPr>
-          <w:rStyle w:val="FunctionTok"/>
-        </w:rPr>
-        <w:t>corpus</w:t>
-      </w:r>
-      <w:r>
-        <w:rPr>
-          <w:rStyle w:val="NormalTok"/>
-        </w:rPr>
-        <w:t>(</w:t>
-      </w:r>
-      <w:r>
-        <w:rPr>
-          <w:rStyle w:val="AttributeTok"/>
-        </w:rPr>
-        <w:t>docid_field =</w:t>
-      </w:r>
-      <w:r>
-        <w:rPr>
-          <w:rStyle w:val="NormalTok"/>
-        </w:rPr>
-        <w:t xml:space="preserve"> </w:t>
-      </w:r>
-      <w:r>
-        <w:rPr>
-          <w:rStyle w:val="StringTok"/>
-        </w:rPr>
-        <w:t>"X_id"</w:t>
-      </w:r>
-      <w:r>
-        <w:rPr>
-          <w:rStyle w:val="NormalTok"/>
-        </w:rPr>
-        <w:t>,</w:t>
-      </w:r>
-      <w:r>
-        <w:br/>
-      </w:r>
-      <w:r>
-        <w:rPr>
-          <w:rStyle w:val="NormalTok"/>
-        </w:rPr>
-        <w:t xml:space="preserve">         </w:t>
-      </w:r>
-      <w:r>
-        <w:rPr>
-          <w:rStyle w:val="AttributeTok"/>
-        </w:rPr>
-        <w:t>text_field=</w:t>
-      </w:r>
-      <w:r>
-        <w:rPr>
-          <w:rStyle w:val="StringTok"/>
-        </w:rPr>
-        <w:t>"jobTitle"</w:t>
-      </w:r>
-      <w:r>
-        <w:rPr>
-          <w:rStyle w:val="NormalTok"/>
-        </w:rPr>
-        <w:t>)</w:t>
-      </w:r>
-      <w:r>
-        <w:br/>
-      </w:r>
-      <w:r>
-        <w:br/>
-      </w:r>
-      <w:r>
-        <w:rPr>
-          <w:rStyle w:val="NormalTok"/>
-        </w:rPr>
-        <w:t xml:space="preserve"> </w:t>
-      </w:r>
-      <w:r>
-        <w:br/>
-      </w:r>
-      <w:r>
-        <w:rPr>
-          <w:rStyle w:val="CommentTok"/>
-        </w:rPr>
-        <w:t># Convert to Tokens</w:t>
-      </w:r>
-      <w:r>
-        <w:br/>
-      </w:r>
-      <w:r>
-        <w:br/>
-      </w:r>
-      <w:r>
-        <w:rPr>
-          <w:rStyle w:val="CommentTok"/>
-        </w:rPr>
-        <w:t xml:space="preserve"># * The tokens are lower-cased! </w:t>
-      </w:r>
-      <w:r>
-        <w:br/>
-      </w:r>
-      <w:r>
-        <w:br/>
-      </w:r>
-      <w:r>
-        <w:rPr>
-          <w:rStyle w:val="NormalTok"/>
-        </w:rPr>
-        <w:t xml:space="preserve">Tinder_job_tokens </w:t>
-      </w:r>
-      <w:r>
-        <w:rPr>
-          <w:rStyle w:val="OtherTok"/>
-        </w:rPr>
-        <w:t>&lt;-</w:t>
-      </w:r>
-      <w:r>
-        <w:rPr>
-          <w:rStyle w:val="NormalTok"/>
-        </w:rPr>
-        <w:t xml:space="preserve"> </w:t>
-      </w:r>
-      <w:r>
-        <w:rPr>
-          <w:rStyle w:val="FunctionTok"/>
-        </w:rPr>
-        <w:t>tokens</w:t>
-      </w:r>
-      <w:r>
-        <w:rPr>
-          <w:rStyle w:val="NormalTok"/>
-        </w:rPr>
-        <w:t>(Tinder_job_corpus,</w:t>
-      </w:r>
-      <w:r>
-        <w:br/>
-      </w:r>
-      <w:r>
-        <w:rPr>
-          <w:rStyle w:val="NormalTok"/>
-        </w:rPr>
-        <w:lastRenderedPageBreak/>
-        <w:t xml:space="preserve">                         </w:t>
-      </w:r>
-      <w:r>
-        <w:rPr>
-          <w:rStyle w:val="AttributeTok"/>
-        </w:rPr>
-        <w:t>remove_punct =</w:t>
-      </w:r>
-      <w:r>
-        <w:rPr>
-          <w:rStyle w:val="NormalTok"/>
-        </w:rPr>
-        <w:t xml:space="preserve"> </w:t>
-      </w:r>
-      <w:r>
-        <w:rPr>
-          <w:rStyle w:val="ConstantTok"/>
-        </w:rPr>
-        <w:t>TRUE</w:t>
-      </w:r>
-      <w:r>
-        <w:rPr>
-          <w:rStyle w:val="NormalTok"/>
-        </w:rPr>
-        <w:t>,</w:t>
-      </w:r>
-      <w:r>
-        <w:br/>
-      </w:r>
-      <w:r>
-        <w:rPr>
-          <w:rStyle w:val="NormalTok"/>
-        </w:rPr>
-        <w:t xml:space="preserve">                         </w:t>
-      </w:r>
-      <w:r>
-        <w:rPr>
-          <w:rStyle w:val="AttributeTok"/>
-        </w:rPr>
-        <w:t>remove_symbols =</w:t>
-      </w:r>
-      <w:r>
-        <w:rPr>
-          <w:rStyle w:val="NormalTok"/>
-        </w:rPr>
-        <w:t xml:space="preserve"> T) </w:t>
-      </w:r>
-      <w:r>
-        <w:rPr>
-          <w:rStyle w:val="SpecialCharTok"/>
-        </w:rPr>
-        <w:t>|&gt;</w:t>
-      </w:r>
-      <w:r>
-        <w:rPr>
-          <w:rStyle w:val="NormalTok"/>
-        </w:rPr>
-        <w:t xml:space="preserve"> </w:t>
-      </w:r>
-      <w:r>
-        <w:br/>
-      </w:r>
-      <w:r>
-        <w:rPr>
-          <w:rStyle w:val="NormalTok"/>
-        </w:rPr>
-        <w:t xml:space="preserve">  </w:t>
-      </w:r>
-      <w:r>
-        <w:rPr>
-          <w:rStyle w:val="FunctionTok"/>
-        </w:rPr>
-        <w:t>tokens_tolower</w:t>
-      </w:r>
-      <w:r>
-        <w:rPr>
-          <w:rStyle w:val="NormalTok"/>
-        </w:rPr>
-        <w:t>()</w:t>
-      </w:r>
-      <w:r>
-        <w:br/>
-      </w:r>
-      <w:r>
-        <w:br/>
-      </w:r>
-      <w:r>
-        <w:rPr>
-          <w:rStyle w:val="CommentTok"/>
-        </w:rPr>
-        <w:t xml:space="preserve"># ------------ Should we Stem or Lemmas? </w:t>
-      </w:r>
-      <w:r>
-        <w:br/>
-      </w:r>
-      <w:r>
-        <w:br/>
-      </w:r>
-      <w:r>
-        <w:rPr>
-          <w:rStyle w:val="CommentTok"/>
-        </w:rPr>
-        <w:t># Since we're working with job titles—short phrases rather than full sentences with contextual information—we're less likely to encounter grammatical word variations (like verbs ending in "ing" or "ed").</w:t>
-      </w:r>
-      <w:r>
-        <w:br/>
-      </w:r>
-      <w:r>
-        <w:rPr>
-          <w:rStyle w:val="CommentTok"/>
-        </w:rPr>
-        <w:t># Therefore, I don’t see a strong reason to apply stemming or lemmatization in this case.</w:t>
-      </w:r>
-      <w:r>
-        <w:br/>
-      </w:r>
-      <w:r>
-        <w:br/>
-      </w:r>
-      <w:r>
-        <w:br/>
-      </w:r>
-      <w:r>
-        <w:rPr>
-          <w:rStyle w:val="CommentTok"/>
-        </w:rPr>
-        <w:t xml:space="preserve"># --- Preperation to Word-Embedding </w:t>
-      </w:r>
-      <w:r>
-        <w:br/>
-      </w:r>
-      <w:r>
-        <w:br/>
-      </w:r>
-      <w:r>
-        <w:rPr>
-          <w:rStyle w:val="NormalTok"/>
-        </w:rPr>
-        <w:t xml:space="preserve">Tinder_job_tokens_dfm </w:t>
-      </w:r>
-      <w:r>
-        <w:rPr>
-          <w:rStyle w:val="OtherTok"/>
-        </w:rPr>
-        <w:t>&lt;-</w:t>
-      </w:r>
-      <w:r>
-        <w:rPr>
-          <w:rStyle w:val="NormalTok"/>
-        </w:rPr>
-        <w:t xml:space="preserve"> </w:t>
-      </w:r>
-      <w:r>
-        <w:rPr>
-          <w:rStyle w:val="FunctionTok"/>
-        </w:rPr>
-        <w:t>dfm</w:t>
-      </w:r>
-      <w:r>
-        <w:rPr>
-          <w:rStyle w:val="NormalTok"/>
-        </w:rPr>
-        <w:t>(Tinder_job_tokens)</w:t>
-      </w:r>
-      <w:r>
-        <w:br/>
-      </w:r>
-      <w:r>
-        <w:br/>
-      </w:r>
-      <w:r>
-        <w:rPr>
-          <w:rStyle w:val="CommentTok"/>
-        </w:rPr>
-        <w:t>#Getting the features from jobTitle. aka unique word.</w:t>
-      </w:r>
-      <w:r>
-        <w:br/>
-      </w:r>
-      <w:r>
-        <w:rPr>
-          <w:rStyle w:val="NormalTok"/>
-        </w:rPr>
-        <w:t xml:space="preserve">Tinder_jobtitle_features </w:t>
-      </w:r>
-      <w:r>
-        <w:rPr>
-          <w:rStyle w:val="OtherTok"/>
-        </w:rPr>
-        <w:t>&lt;-</w:t>
-      </w:r>
-      <w:r>
-        <w:rPr>
-          <w:rStyle w:val="NormalTok"/>
-        </w:rPr>
-        <w:t xml:space="preserve"> </w:t>
-      </w:r>
-      <w:r>
-        <w:rPr>
-          <w:rStyle w:val="FunctionTok"/>
-        </w:rPr>
-        <w:t>featnames</w:t>
-      </w:r>
-      <w:r>
-        <w:rPr>
-          <w:rStyle w:val="NormalTok"/>
-        </w:rPr>
-        <w:t>(Tinder_job_tokens_dfm)</w:t>
-      </w:r>
-      <w:r>
-        <w:br/>
-      </w:r>
-      <w:r>
-        <w:br/>
-      </w:r>
-      <w:r>
-        <w:rPr>
-          <w:rStyle w:val="CommentTok"/>
-        </w:rPr>
-        <w:t># ----- Word Embedding\</w:t>
-      </w:r>
-      <w:r>
-        <w:br/>
-      </w:r>
-      <w:r>
-        <w:br/>
-      </w:r>
-      <w:r>
-        <w:br/>
-      </w:r>
-      <w:r>
-        <w:rPr>
-          <w:rStyle w:val="CommentTok"/>
-        </w:rPr>
-        <w:t xml:space="preserve">#Since that our corpus is not Rich textually speaking we would use a rather small-traiend-model: glove.6B.50d - trained on Wikipedia 2014 + Giga word 5 </w:t>
-      </w:r>
-      <w:r>
-        <w:br/>
-      </w:r>
-      <w:r>
-        <w:br/>
-      </w:r>
-      <w:r>
-        <w:rPr>
-          <w:rStyle w:val="NormalTok"/>
-        </w:rPr>
-        <w:t xml:space="preserve">Tinder_jobTitle_WEmodel </w:t>
-      </w:r>
-      <w:r>
-        <w:rPr>
-          <w:rStyle w:val="OtherTok"/>
-        </w:rPr>
-        <w:t>&lt;-</w:t>
-      </w:r>
-      <w:r>
-        <w:rPr>
-          <w:rStyle w:val="NormalTok"/>
-        </w:rPr>
-        <w:t xml:space="preserve"> </w:t>
-      </w:r>
-      <w:r>
-        <w:rPr>
-          <w:rStyle w:val="FunctionTok"/>
-        </w:rPr>
-        <w:t>load_embeddings</w:t>
-      </w:r>
-      <w:r>
-        <w:rPr>
-          <w:rStyle w:val="NormalTok"/>
-        </w:rPr>
-        <w:t>(</w:t>
-      </w:r>
-      <w:r>
-        <w:br/>
-      </w:r>
-      <w:r>
-        <w:rPr>
-          <w:rStyle w:val="NormalTok"/>
-        </w:rPr>
-        <w:t xml:space="preserve">  </w:t>
-      </w:r>
-      <w:r>
-        <w:rPr>
-          <w:rStyle w:val="StringTok"/>
-        </w:rPr>
-        <w:t>"glove.6B.50d"</w:t>
-      </w:r>
-      <w:r>
-        <w:rPr>
-          <w:rStyle w:val="NormalTok"/>
-        </w:rPr>
-        <w:t>,</w:t>
-      </w:r>
-      <w:r>
-        <w:br/>
-      </w:r>
-      <w:r>
-        <w:rPr>
-          <w:rStyle w:val="NormalTok"/>
-        </w:rPr>
-        <w:t xml:space="preserve">  </w:t>
-      </w:r>
-      <w:r>
-        <w:rPr>
-          <w:rStyle w:val="AttributeTok"/>
-        </w:rPr>
-        <w:t>words =</w:t>
-      </w:r>
-      <w:r>
-        <w:rPr>
-          <w:rStyle w:val="NormalTok"/>
-        </w:rPr>
-        <w:t xml:space="preserve"> Tinder_jobtitle_features,</w:t>
-      </w:r>
-      <w:r>
-        <w:br/>
-      </w:r>
-      <w:r>
-        <w:rPr>
-          <w:rStyle w:val="NormalTok"/>
-        </w:rPr>
-        <w:t xml:space="preserve">  </w:t>
-      </w:r>
-      <w:r>
-        <w:rPr>
-          <w:rStyle w:val="AttributeTok"/>
-        </w:rPr>
-        <w:t>format =</w:t>
-      </w:r>
-      <w:r>
-        <w:rPr>
-          <w:rStyle w:val="NormalTok"/>
-        </w:rPr>
-        <w:t xml:space="preserve"> </w:t>
-      </w:r>
-      <w:r>
-        <w:rPr>
-          <w:rStyle w:val="StringTok"/>
-        </w:rPr>
-        <w:t>"rds"</w:t>
-      </w:r>
-      <w:r>
-        <w:rPr>
-          <w:rStyle w:val="NormalTok"/>
-        </w:rPr>
-        <w:t>,</w:t>
-      </w:r>
-      <w:r>
-        <w:br/>
-      </w:r>
-      <w:r>
-        <w:rPr>
-          <w:rStyle w:val="NormalTok"/>
-        </w:rPr>
-        <w:t xml:space="preserve">  </w:t>
-      </w:r>
-      <w:r>
-        <w:rPr>
-          <w:rStyle w:val="AttributeTok"/>
-        </w:rPr>
-        <w:t>dir=</w:t>
-      </w:r>
-      <w:r>
-        <w:rPr>
-          <w:rStyle w:val="NormalTok"/>
-        </w:rPr>
-        <w:t xml:space="preserve"> </w:t>
-      </w:r>
-      <w:r>
-        <w:rPr>
-          <w:rStyle w:val="StringTok"/>
-        </w:rPr>
-        <w:t>"./rds"</w:t>
-      </w:r>
-      <w:r>
-        <w:rPr>
-          <w:rStyle w:val="NormalTok"/>
-        </w:rPr>
-        <w:t>)</w:t>
-      </w:r>
-    </w:p>
-    <w:p>
-      <w:pPr>
-        <w:pStyle w:val="SourceCode"/>
-        <w:bidi/>
-        <w:spacing w:line="360" w:lineRule="auto"/>
-      </w:pPr>
-      <w:r>
-        <w:rPr>
-          <w:rStyle w:val="VerbatimChar"/>
-          <w:rtl/>
-        </w:rPr>
-        <w:lastRenderedPageBreak/>
-        <w:t>Reading model from file...</w:t>
-      </w:r>
-    </w:p>
-    <w:p>
-      <w:pPr>
-        <w:pStyle w:val="SourceCode"/>
-        <w:bidi/>
-        <w:spacing w:line="360" w:lineRule="auto"/>
-      </w:pPr>
-      <w:r>
-        <w:rPr>
-          <w:rStyle w:val="VerbatimChar"/>
-          <w:rtl/>
-        </w:rPr>
-        <w:t>Warning in predict.embeddings(out, words): 27 items in `newdata` are not</w:t>
-      </w:r>
-      <w:r>
-        <w:br/>
-      </w:r>
-      <w:r>
-        <w:rPr>
-          <w:rStyle w:val="VerbatimChar"/>
-          <w:rtl/>
-        </w:rPr>
-        <w:t>present in the embeddings object.</w:t>
-      </w:r>
-    </w:p>
-    <w:p>
-      <w:pPr>
-        <w:pStyle w:val="SourceCode"/>
-        <w:bidi/>
-        <w:spacing w:line="360" w:lineRule="auto"/>
-      </w:pPr>
-      <w:r>
-        <w:rPr>
-          <w:rStyle w:val="CommentTok"/>
-        </w:rPr>
-        <w:t xml:space="preserve"># ./rds/glove.6B.50d.rds were created </w:t>
-      </w:r>
-      <w:r>
-        <w:br/>
-      </w:r>
-      <w:r>
-        <w:br/>
-      </w:r>
-      <w:r>
-        <w:rPr>
-          <w:rStyle w:val="CommentTok"/>
-        </w:rPr>
-        <w:t>#Using this model, we would embedd our corpus (Tinder job titles):</w:t>
-      </w:r>
-      <w:r>
-        <w:br/>
-      </w:r>
-      <w:r>
-        <w:rPr>
-          <w:rStyle w:val="NormalTok"/>
-        </w:rPr>
-        <w:t xml:space="preserve">Tinder_embbd_GloVe </w:t>
-      </w:r>
-      <w:r>
-        <w:rPr>
-          <w:rStyle w:val="OtherTok"/>
-        </w:rPr>
-        <w:t>&lt;-</w:t>
-      </w:r>
-      <w:r>
-        <w:rPr>
-          <w:rStyle w:val="NormalTok"/>
-        </w:rPr>
-        <w:t xml:space="preserve"> Tinder_job_tokens_dfm </w:t>
-      </w:r>
-      <w:r>
-        <w:rPr>
-          <w:rStyle w:val="SpecialCharTok"/>
-        </w:rPr>
-        <w:t>|&gt;</w:t>
-      </w:r>
-      <w:r>
-        <w:rPr>
-          <w:rStyle w:val="NormalTok"/>
-        </w:rPr>
-        <w:t xml:space="preserve"> </w:t>
-      </w:r>
-      <w:r>
-        <w:br/>
-      </w:r>
-      <w:r>
-        <w:rPr>
-          <w:rStyle w:val="FunctionTok"/>
-        </w:rPr>
-        <w:t>textstat_embedding</w:t>
-      </w:r>
-      <w:r>
-        <w:rPr>
-          <w:rStyle w:val="NormalTok"/>
-        </w:rPr>
-        <w:t>(Tinder_jobTitle_WEmodel)</w:t>
-      </w:r>
-    </w:p>
-    <w:p>
-      <w:pPr>
-        <w:pStyle w:val="SourceCode"/>
-        <w:bidi/>
-        <w:spacing w:line="360" w:lineRule="auto"/>
-      </w:pPr>
-      <w:r>
-        <w:rPr>
-          <w:rStyle w:val="VerbatimChar"/>
-          <w:rtl/>
-        </w:rPr>
-        <w:t>Warning in predict.embeddings(model, feats, .keep_missing = TRUE): 27 items in</w:t>
-      </w:r>
-      <w:r>
-        <w:br/>
-      </w:r>
-      <w:r>
-        <w:rPr>
-          <w:rStyle w:val="VerbatimChar"/>
-          <w:rtl/>
-        </w:rPr>
-        <w:t>`newdata` are not present in the embeddings object.</w:t>
-      </w:r>
-    </w:p>
-    <w:p>
-      <w:pPr>
-        <w:pStyle w:val="SourceCode"/>
-        <w:bidi/>
-        <w:spacing w:line="360" w:lineRule="auto"/>
-      </w:pPr>
-      <w:r>
-        <w:rPr>
-          <w:rStyle w:val="NormalTok"/>
-        </w:rPr>
-        <w:t xml:space="preserve">missing_words </w:t>
-      </w:r>
-      <w:r>
-        <w:rPr>
-          <w:rStyle w:val="OtherTok"/>
-        </w:rPr>
-        <w:t>&lt;-</w:t>
-      </w:r>
-      <w:r>
-        <w:rPr>
-          <w:rStyle w:val="NormalTok"/>
-        </w:rPr>
-        <w:t xml:space="preserve"> </w:t>
-      </w:r>
-      <w:r>
-        <w:rPr>
-          <w:rStyle w:val="FunctionTok"/>
-        </w:rPr>
-        <w:t>setdiff</w:t>
-      </w:r>
-      <w:r>
-        <w:rPr>
-          <w:rStyle w:val="NormalTok"/>
-        </w:rPr>
-        <w:t xml:space="preserve">(Tinder_jobtitle_features, </w:t>
-      </w:r>
-      <w:r>
-        <w:rPr>
-          <w:rStyle w:val="FunctionTok"/>
-        </w:rPr>
-        <w:t>rownames</w:t>
-      </w:r>
-      <w:r>
-        <w:rPr>
-          <w:rStyle w:val="NormalTok"/>
-        </w:rPr>
-        <w:t>(Tinder_jobTitle_WEmodel))</w:t>
-      </w:r>
-      <w:r>
-        <w:br/>
-      </w:r>
-      <w:r>
-        <w:br/>
-      </w:r>
-      <w:r>
-        <w:rPr>
-          <w:rStyle w:val="CommentTok"/>
-        </w:rPr>
-        <w:t># 28 instance were dismissed - jobTitle was a typo. For example: "programmerare", "salesperon", "rechtsreferendar".</w:t>
-      </w:r>
-      <w:r>
-        <w:br/>
-      </w:r>
-      <w:r>
-        <w:br/>
-      </w:r>
-      <w:r>
-        <w:br/>
-      </w:r>
-      <w:r>
-        <w:rPr>
-          <w:rStyle w:val="CommentTok"/>
-        </w:rPr>
-        <w:t># ----------Cosine Squished ------</w:t>
-      </w:r>
-      <w:r>
-        <w:br/>
-      </w:r>
-      <w:r>
-        <w:br/>
-      </w:r>
-      <w:r>
-        <w:rPr>
-          <w:rStyle w:val="CommentTok"/>
-        </w:rPr>
-        <w:t>#Getting the directorial position of the word "Engineer"</w:t>
-      </w:r>
-      <w:r>
-        <w:br/>
-      </w:r>
-      <w:r>
-        <w:rPr>
-          <w:rStyle w:val="NormalTok"/>
-        </w:rPr>
-        <w:t xml:space="preserve">engineer_embedding </w:t>
-      </w:r>
-      <w:r>
-        <w:rPr>
-          <w:rStyle w:val="OtherTok"/>
-        </w:rPr>
-        <w:t>&lt;-</w:t>
-      </w:r>
-      <w:r>
-        <w:rPr>
-          <w:rStyle w:val="NormalTok"/>
-        </w:rPr>
-        <w:t xml:space="preserve"> </w:t>
-      </w:r>
-      <w:r>
-        <w:rPr>
-          <w:rStyle w:val="FunctionTok"/>
-        </w:rPr>
-        <w:t>predict</w:t>
-      </w:r>
-      <w:r>
-        <w:rPr>
-          <w:rStyle w:val="NormalTok"/>
-        </w:rPr>
-        <w:t>(Tinder_jobTitle_WEmodel,</w:t>
-      </w:r>
-      <w:r>
-        <w:br/>
-      </w:r>
-      <w:r>
-        <w:rPr>
-          <w:rStyle w:val="NormalTok"/>
-        </w:rPr>
-        <w:t xml:space="preserve">                                </w:t>
-      </w:r>
-      <w:r>
-        <w:rPr>
-          <w:rStyle w:val="StringTok"/>
-        </w:rPr>
-        <w:t>"engineer"</w:t>
-      </w:r>
-      <w:r>
-        <w:rPr>
-          <w:rStyle w:val="NormalTok"/>
-        </w:rPr>
-        <w:t xml:space="preserve">) </w:t>
-      </w:r>
-      <w:r>
-        <w:br/>
-      </w:r>
-      <w:r>
-        <w:br/>
-      </w:r>
-      <w:r>
-        <w:br/>
-      </w:r>
-      <w:r>
-        <w:rPr>
-          <w:rStyle w:val="NormalTok"/>
-        </w:rPr>
-        <w:t xml:space="preserve">  </w:t>
-      </w:r>
-      <w:r>
-        <w:br/>
-      </w:r>
-      <w:r>
-        <w:rPr>
-          <w:rStyle w:val="NormalTok"/>
-        </w:rPr>
-        <w:t xml:space="preserve">Tinder_distantce_engineer_WEGloVe </w:t>
-      </w:r>
-      <w:r>
-        <w:rPr>
-          <w:rStyle w:val="OtherTok"/>
-        </w:rPr>
-        <w:t>&lt;-</w:t>
-      </w:r>
-      <w:r>
-        <w:rPr>
-          <w:rStyle w:val="NormalTok"/>
-        </w:rPr>
-        <w:t xml:space="preserve"> Tinder_embbd_GloVe </w:t>
-      </w:r>
-      <w:r>
-        <w:rPr>
-          <w:rStyle w:val="SpecialCharTok"/>
-        </w:rPr>
-        <w:t>|&gt;</w:t>
-      </w:r>
-      <w:r>
-        <w:rPr>
-          <w:rStyle w:val="NormalTok"/>
-        </w:rPr>
-        <w:t xml:space="preserve"> </w:t>
-      </w:r>
-      <w:r>
-        <w:br/>
-      </w:r>
-      <w:r>
-        <w:rPr>
-          <w:rStyle w:val="NormalTok"/>
-        </w:rPr>
-        <w:t xml:space="preserve">  </w:t>
-      </w:r>
-      <w:r>
-        <w:rPr>
-          <w:rStyle w:val="FunctionTok"/>
-        </w:rPr>
-        <w:t>get_sims</w:t>
-      </w:r>
-      <w:r>
-        <w:rPr>
-          <w:rStyle w:val="NormalTok"/>
-        </w:rPr>
-        <w:t>(</w:t>
-      </w:r>
-      <w:r>
-        <w:br/>
-      </w:r>
-      <w:r>
-        <w:rPr>
-          <w:rStyle w:val="NormalTok"/>
-        </w:rPr>
-        <w:t xml:space="preserve">    dim_1</w:t>
-      </w:r>
-      <w:r>
-        <w:rPr>
-          <w:rStyle w:val="SpecialCharTok"/>
-        </w:rPr>
-        <w:t>:</w:t>
-      </w:r>
-      <w:r>
-        <w:rPr>
-          <w:rStyle w:val="NormalTok"/>
-        </w:rPr>
-        <w:t xml:space="preserve">dim_50, </w:t>
-      </w:r>
-      <w:r>
-        <w:br/>
-      </w:r>
-      <w:r>
-        <w:rPr>
-          <w:rStyle w:val="NormalTok"/>
-        </w:rPr>
-        <w:t xml:space="preserve">    </w:t>
-      </w:r>
-      <w:r>
-        <w:rPr>
-          <w:rStyle w:val="FunctionTok"/>
-        </w:rPr>
-        <w:t>list</w:t>
-      </w:r>
-      <w:r>
-        <w:rPr>
-          <w:rStyle w:val="NormalTok"/>
-        </w:rPr>
-        <w:t>(</w:t>
-      </w:r>
-      <w:r>
-        <w:rPr>
-          <w:rStyle w:val="AttributeTok"/>
-        </w:rPr>
-        <w:t>engineer =</w:t>
-      </w:r>
-      <w:r>
-        <w:rPr>
-          <w:rStyle w:val="NormalTok"/>
-        </w:rPr>
-        <w:t xml:space="preserve"> engineer_embedding),</w:t>
-      </w:r>
-      <w:r>
-        <w:br/>
-      </w:r>
-      <w:r>
-        <w:rPr>
-          <w:rStyle w:val="NormalTok"/>
-        </w:rPr>
-        <w:t xml:space="preserve">    </w:t>
-      </w:r>
-      <w:r>
-        <w:rPr>
-          <w:rStyle w:val="AttributeTok"/>
-        </w:rPr>
-        <w:t>method =</w:t>
-      </w:r>
-      <w:r>
-        <w:rPr>
-          <w:rStyle w:val="NormalTok"/>
-        </w:rPr>
-        <w:t xml:space="preserve"> </w:t>
-      </w:r>
-      <w:r>
-        <w:rPr>
-          <w:rStyle w:val="StringTok"/>
-        </w:rPr>
-        <w:t>"cosine_squished"</w:t>
-      </w:r>
-      <w:r>
-        <w:br/>
-      </w:r>
-      <w:r>
-        <w:rPr>
-          <w:rStyle w:val="NormalTok"/>
-        </w:rPr>
-        <w:lastRenderedPageBreak/>
-        <w:t xml:space="preserve">    )</w:t>
-      </w:r>
-      <w:r>
-        <w:br/>
-      </w:r>
-      <w:r>
-        <w:rPr>
-          <w:rStyle w:val="NormalTok"/>
-        </w:rPr>
-        <w:t xml:space="preserve">  </w:t>
-      </w:r>
-      <w:r>
-        <w:br/>
-      </w:r>
-      <w:r>
-        <w:br/>
-      </w:r>
-      <w:r>
-        <w:br/>
-      </w:r>
-      <w:r>
-        <w:rPr>
-          <w:rStyle w:val="CommentTok"/>
-        </w:rPr>
-        <w:t xml:space="preserve">#Let's add this distnace to our dataset and conduct the modeling! </w:t>
-      </w:r>
-      <w:r>
-        <w:br/>
-      </w:r>
-      <w:r>
-        <w:br/>
-      </w:r>
-      <w:r>
-        <w:rPr>
-          <w:rStyle w:val="NormalTok"/>
-        </w:rPr>
-        <w:t xml:space="preserve">Tinder_filtered_for_txt_with_cosine </w:t>
-      </w:r>
-      <w:r>
-        <w:rPr>
-          <w:rStyle w:val="OtherTok"/>
-        </w:rPr>
-        <w:t>&lt;-</w:t>
-      </w:r>
-      <w:r>
-        <w:rPr>
-          <w:rStyle w:val="NormalTok"/>
-        </w:rPr>
-        <w:t xml:space="preserve"> Tinder_filtered_for_txt </w:t>
-      </w:r>
-      <w:r>
-        <w:rPr>
-          <w:rStyle w:val="SpecialCharTok"/>
-        </w:rPr>
-        <w:t>|&gt;</w:t>
-      </w:r>
-      <w:r>
-        <w:rPr>
-          <w:rStyle w:val="NormalTok"/>
-        </w:rPr>
-        <w:t xml:space="preserve"> </w:t>
-      </w:r>
-      <w:r>
-        <w:br/>
-      </w:r>
-      <w:r>
-        <w:rPr>
-          <w:rStyle w:val="NormalTok"/>
-        </w:rPr>
-        <w:t xml:space="preserve">  </w:t>
-      </w:r>
-      <w:r>
-        <w:rPr>
-          <w:rStyle w:val="FunctionTok"/>
-        </w:rPr>
-        <w:t>merge</w:t>
-      </w:r>
-      <w:r>
-        <w:rPr>
-          <w:rStyle w:val="NormalTok"/>
-        </w:rPr>
-        <w:t>(Tinder_distantce_engineer_WEGloVe,</w:t>
-      </w:r>
-      <w:r>
-        <w:br/>
-      </w:r>
-      <w:r>
-        <w:rPr>
-          <w:rStyle w:val="NormalTok"/>
-        </w:rPr>
-        <w:t xml:space="preserve">        </w:t>
-      </w:r>
-      <w:r>
-        <w:rPr>
-          <w:rStyle w:val="AttributeTok"/>
-        </w:rPr>
-        <w:t>by.x =</w:t>
-      </w:r>
-      <w:r>
-        <w:rPr>
-          <w:rStyle w:val="StringTok"/>
-        </w:rPr>
-        <w:t>"X_id"</w:t>
-      </w:r>
-      <w:r>
-        <w:rPr>
-          <w:rStyle w:val="NormalTok"/>
-        </w:rPr>
-        <w:t>,</w:t>
-      </w:r>
-      <w:r>
-        <w:br/>
-      </w:r>
-      <w:r>
-        <w:rPr>
-          <w:rStyle w:val="NormalTok"/>
-        </w:rPr>
-        <w:t xml:space="preserve">        </w:t>
-      </w:r>
-      <w:r>
-        <w:rPr>
-          <w:rStyle w:val="AttributeTok"/>
-        </w:rPr>
-        <w:t>by.y =</w:t>
-      </w:r>
-      <w:r>
-        <w:rPr>
-          <w:rStyle w:val="NormalTok"/>
-        </w:rPr>
-        <w:t xml:space="preserve"> </w:t>
-      </w:r>
-      <w:r>
-        <w:rPr>
-          <w:rStyle w:val="StringTok"/>
-        </w:rPr>
-        <w:t>"doc_id"</w:t>
-      </w:r>
-      <w:r>
-        <w:rPr>
-          <w:rStyle w:val="NormalTok"/>
-        </w:rPr>
-        <w:t xml:space="preserve">) </w:t>
-      </w:r>
-      <w:r>
-        <w:rPr>
-          <w:rStyle w:val="SpecialCharTok"/>
-        </w:rPr>
-        <w:t>|&gt;</w:t>
-      </w:r>
-      <w:r>
-        <w:rPr>
-          <w:rStyle w:val="NormalTok"/>
-        </w:rPr>
-        <w:t xml:space="preserve"> </w:t>
-      </w:r>
-      <w:r>
-        <w:br/>
-      </w:r>
-      <w:r>
-        <w:rPr>
-          <w:rStyle w:val="NormalTok"/>
-        </w:rPr>
-        <w:t xml:space="preserve">  </w:t>
-      </w:r>
-      <w:r>
-        <w:br/>
-      </w:r>
-      <w:r>
-        <w:rPr>
-          <w:rStyle w:val="NormalTok"/>
-        </w:rPr>
-        <w:t xml:space="preserve">  </w:t>
-      </w:r>
-      <w:r>
-        <w:rPr>
-          <w:rStyle w:val="CommentTok"/>
-        </w:rPr>
-        <w:t xml:space="preserve">#Also, omitting the instances where jobTitle is typo - the only NA in 'engineer' </w:t>
-      </w:r>
-      <w:r>
-        <w:br/>
-      </w:r>
-      <w:r>
-        <w:rPr>
-          <w:rStyle w:val="NormalTok"/>
-        </w:rPr>
-        <w:t xml:space="preserve">  </w:t>
-      </w:r>
-      <w:r>
-        <w:rPr>
-          <w:rStyle w:val="FunctionTok"/>
-        </w:rPr>
-        <w:t>filter</w:t>
-      </w:r>
-      <w:r>
-        <w:rPr>
-          <w:rStyle w:val="NormalTok"/>
-        </w:rPr>
-        <w:t>(</w:t>
-      </w:r>
-      <w:r>
-        <w:rPr>
-          <w:rStyle w:val="SpecialCharTok"/>
-        </w:rPr>
-        <w:t>!</w:t>
-      </w:r>
-      <w:r>
-        <w:rPr>
-          <w:rStyle w:val="FunctionTok"/>
-        </w:rPr>
-        <w:t>is.na</w:t>
-      </w:r>
-      <w:r>
-        <w:rPr>
-          <w:rStyle w:val="NormalTok"/>
-        </w:rPr>
-        <w:t>(engineer))</w:t>
-      </w:r>
-      <w:r>
-        <w:br/>
-      </w:r>
-      <w:r>
-        <w:br/>
-      </w:r>
-      <w:r>
-        <w:br/>
-      </w:r>
-      <w:r>
-        <w:rPr>
-          <w:rStyle w:val="CommentTok"/>
-        </w:rPr>
-        <w:t xml:space="preserve">#That's leaving us with 321 users! </w:t>
-      </w:r>
     </w:p>
     <w:p>
       <w:pPr>
@@ -2861,12 +1785,14 @@
       </w:pPr>
       <w:bookmarkStart w:id="1" w:name="modeling"/>
       <w:bookmarkEnd w:id="0"/>
+      <w:proofErr w:type="spellStart"/>
       <w:r>
         <w:rPr>
           <w:rtl/>
         </w:rPr>
         <w:t>Modeling</w:t>
       </w:r>
+      <w:proofErr w:type="spellEnd"/>
     </w:p>
     <w:p>
       <w:pPr>
@@ -3145,13 +2071,154 @@
         <w:rPr>
           <w:rStyle w:val="NormalTok"/>
         </w:rPr>
+        <w:t xml:space="preserve">  </w:t>
+      </w:r>
+      <w:r>
+        <w:rPr>
+          <w:rStyle w:val="AttributeTok"/>
+        </w:rPr>
+        <w:t>strata =</w:t>
+      </w:r>
+      <w:r>
+        <w:rPr>
+          <w:rStyle w:val="NormalTok"/>
+        </w:rPr>
+        <w:t xml:space="preserve"> </w:t>
+      </w:r>
+      <w:r>
+        <w:rPr>
+          <w:rStyle w:val="ConstantTok"/>
+        </w:rPr>
+        <w:t>NULL</w:t>
+      </w:r>
+      <w:r>
+        <w:rPr>
+          <w:rStyle w:val="NormalTok"/>
+        </w:rPr>
+        <w:t>,</w:t>
+      </w:r>
+      <w:r>
+        <w:br/>
+      </w:r>
+      <w:r>
+        <w:rPr>
+          <w:rStyle w:val="NormalTok"/>
+        </w:rPr>
+        <w:t xml:space="preserve">  </w:t>
+      </w:r>
+      <w:r>
+        <w:rPr>
+          <w:rStyle w:val="AttributeTok"/>
+        </w:rPr>
+        <w:t>apparent =</w:t>
+      </w:r>
+      <w:r>
+        <w:rPr>
+          <w:rStyle w:val="NormalTok"/>
+        </w:rPr>
+        <w:t xml:space="preserve"> F</w:t>
+      </w:r>
+      <w:r>
+        <w:br/>
+      </w:r>
+      <w:r>
+        <w:rPr>
+          <w:rStyle w:val="NormalTok"/>
+        </w:rPr>
         <w:lastRenderedPageBreak/>
+        <w:t>)</w:t>
+      </w:r>
+      <w:r>
+        <w:br/>
+      </w:r>
+      <w:r>
+        <w:br/>
+      </w:r>
+      <w:r>
+        <w:rPr>
+          <w:rStyle w:val="NormalTok"/>
+        </w:rPr>
+        <w:t xml:space="preserve">Tinder_comparison_sets </w:t>
+      </w:r>
+      <w:r>
+        <w:rPr>
+          <w:rStyle w:val="OtherTok"/>
+        </w:rPr>
+        <w:t>&lt;-</w:t>
+      </w:r>
+      <w:r>
+        <w:rPr>
+          <w:rStyle w:val="NormalTok"/>
+        </w:rPr>
+        <w:t xml:space="preserve"> </w:t>
+      </w:r>
+      <w:r>
+        <w:rPr>
+          <w:rStyle w:val="FunctionTok"/>
+        </w:rPr>
+        <w:t>bootstraps</w:t>
+      </w:r>
+      <w:r>
+        <w:rPr>
+          <w:rStyle w:val="NormalTok"/>
+        </w:rPr>
+        <w:t>(</w:t>
+      </w:r>
+      <w:r>
+        <w:br/>
+      </w:r>
+      <w:r>
+        <w:rPr>
+          <w:rStyle w:val="NormalTok"/>
+        </w:rPr>
+        <w:t xml:space="preserve">  Tinder.test,</w:t>
+      </w:r>
+      <w:r>
+        <w:br/>
+      </w:r>
+      <w:r>
+        <w:rPr>
+          <w:rStyle w:val="NormalTok"/>
+        </w:rPr>
         <w:t xml:space="preserve">  </w:t>
       </w:r>
       <w:r>
         <w:rPr>
           <w:rStyle w:val="AttributeTok"/>
         </w:rPr>
+        <w:t>times =</w:t>
+      </w:r>
+      <w:r>
+        <w:rPr>
+          <w:rStyle w:val="NormalTok"/>
+        </w:rPr>
+        <w:t xml:space="preserve"> </w:t>
+      </w:r>
+      <w:r>
+        <w:rPr>
+          <w:rStyle w:val="DecValTok"/>
+        </w:rPr>
+        <w:t>50</w:t>
+      </w:r>
+      <w:r>
+        <w:rPr>
+          <w:rStyle w:val="NormalTok"/>
+        </w:rPr>
+        <w:t>,</w:t>
+      </w:r>
+      <w:r>
+        <w:br/>
+      </w:r>
+      <w:r>
+        <w:rPr>
+          <w:rStyle w:val="NormalTok"/>
+        </w:rPr>
+        <w:t xml:space="preserve">  </w:t>
+      </w:r>
+      <w:r>
+        <w:rPr>
+          <w:rStyle w:val="AttributeTok"/>
+        </w:rPr>
         <w:t>strata =</w:t>
       </w:r>
       <w:r>
@@ -3210,9 +2277,21 @@
       </w:r>
       <w:r>
         <w:rPr>
-          <w:rStyle w:val="NormalTok"/>
-        </w:rPr>
-        <w:t xml:space="preserve">Tinder_comparison_sets </w:t>
+          <w:rStyle w:val="CommentTok"/>
+        </w:rPr>
+        <w:t>#the predictions would be evaluated using R2 and MAE</w:t>
+      </w:r>
+      <w:r>
+        <w:br/>
+      </w:r>
+      <w:r>
+        <w:br/>
+      </w:r>
+      <w:r>
+        <w:rPr>
+          <w:rStyle w:val="NormalTok"/>
+        </w:rPr>
+        <w:t xml:space="preserve">mset_reg </w:t>
       </w:r>
       <w:r>
         <w:rPr>
@@ -3230,7 +2309,422 @@
         <w:rPr>
           <w:rStyle w:val="FunctionTok"/>
         </w:rPr>
-        <w:t>bootstraps</w:t>
+        <w:t>metric_set</w:t>
+      </w:r>
+      <w:r>
+        <w:rPr>
+          <w:rStyle w:val="NormalTok"/>
+        </w:rPr>
+        <w:t>(rsq, mae)</w:t>
+      </w:r>
+      <w:r>
+        <w:br/>
+      </w:r>
+      <w:r>
+        <w:br/>
+      </w:r>
+      <w:r>
+        <w:rPr>
+          <w:rStyle w:val="CommentTok"/>
+        </w:rPr>
+        <w:t># ---------------- Recipe-------------------</w:t>
+      </w:r>
+      <w:r>
+        <w:br/>
+      </w:r>
+      <w:r>
+        <w:br/>
+      </w:r>
+      <w:r>
+        <w:rPr>
+          <w:rStyle w:val="CommentTok"/>
+        </w:rPr>
+        <w:t># let's define the models R</w:t>
+      </w:r>
+      <w:r>
+        <w:br/>
+      </w:r>
+      <w:r>
+        <w:br/>
+      </w:r>
+      <w:r>
+        <w:rPr>
+          <w:rStyle w:val="CommentTok"/>
+        </w:rPr>
+        <w:t># Predicting number of ghosting after initial message:</w:t>
+      </w:r>
+      <w:r>
+        <w:br/>
+      </w:r>
+      <w:r>
+        <w:br/>
+      </w:r>
+      <w:r>
+        <w:rPr>
+          <w:rStyle w:val="NormalTok"/>
+        </w:rPr>
+        <w:t xml:space="preserve">rec </w:t>
+      </w:r>
+      <w:r>
+        <w:rPr>
+          <w:rStyle w:val="OtherTok"/>
+        </w:rPr>
+        <w:t>&lt;-</w:t>
+      </w:r>
+      <w:r>
+        <w:rPr>
+          <w:rStyle w:val="NormalTok"/>
+        </w:rPr>
+        <w:t xml:space="preserve"> </w:t>
+      </w:r>
+      <w:r>
+        <w:rPr>
+          <w:rStyle w:val="FunctionTok"/>
+        </w:rPr>
+        <w:t>recipe</w:t>
+      </w:r>
+      <w:r>
+        <w:rPr>
+          <w:rStyle w:val="NormalTok"/>
+        </w:rPr>
+        <w:t xml:space="preserve">(nrOfGhostingsAfterInitialMessage </w:t>
+      </w:r>
+      <w:r>
+        <w:rPr>
+          <w:rStyle w:val="SpecialCharTok"/>
+        </w:rPr>
+        <w:t>~</w:t>
+      </w:r>
+      <w:r>
+        <w:rPr>
+          <w:rStyle w:val="NormalTok"/>
+        </w:rPr>
+        <w:t xml:space="preserve"> .,</w:t>
+      </w:r>
+      <w:r>
+        <w:br/>
+      </w:r>
+      <w:r>
+        <w:rPr>
+          <w:rStyle w:val="NormalTok"/>
+        </w:rPr>
+        <w:t xml:space="preserve">              </w:t>
+      </w:r>
+      <w:r>
+        <w:rPr>
+          <w:rStyle w:val="AttributeTok"/>
+        </w:rPr>
+        <w:t>data =</w:t>
+      </w:r>
+      <w:r>
+        <w:rPr>
+          <w:rStyle w:val="NormalTok"/>
+        </w:rPr>
+        <w:t xml:space="preserve"> Tinder.train) </w:t>
+      </w:r>
+      <w:r>
+        <w:rPr>
+          <w:rStyle w:val="SpecialCharTok"/>
+        </w:rPr>
+        <w:t>|&gt;</w:t>
+      </w:r>
+      <w:r>
+        <w:rPr>
+          <w:rStyle w:val="NormalTok"/>
+        </w:rPr>
+        <w:t xml:space="preserve"> </w:t>
+      </w:r>
+      <w:r>
+        <w:br/>
+      </w:r>
+      <w:r>
+        <w:rPr>
+          <w:rStyle w:val="NormalTok"/>
+        </w:rPr>
+        <w:t xml:space="preserve">   </w:t>
+      </w:r>
+      <w:r>
+        <w:rPr>
+          <w:rStyle w:val="CommentTok"/>
+        </w:rPr>
+        <w:t>#for our purposes we would omit some demographics that are not of high interests for us,   since we would like to examine patterns across nationalities and times.</w:t>
+      </w:r>
+      <w:r>
+        <w:br/>
+      </w:r>
+      <w:r>
+        <w:rPr>
+          <w:rStyle w:val="NormalTok"/>
+        </w:rPr>
+        <w:t xml:space="preserve">  </w:t>
+      </w:r>
+      <w:r>
+        <w:br/>
+      </w:r>
+      <w:r>
+        <w:rPr>
+          <w:rStyle w:val="NormalTok"/>
+        </w:rPr>
+        <w:t xml:space="preserve">   </w:t>
+      </w:r>
+      <w:r>
+        <w:rPr>
+          <w:rStyle w:val="CommentTok"/>
+        </w:rPr>
+        <w:t xml:space="preserve">#after visually inspecting the data frame I can say the the 'education' is not valid. I  found quite a few professionals with no education (physician fro example) </w:t>
+      </w:r>
+      <w:r>
+        <w:br/>
+      </w:r>
+      <w:r>
+        <w:rPr>
+          <w:rStyle w:val="NormalTok"/>
+        </w:rPr>
+        <w:t xml:space="preserve">  </w:t>
+      </w:r>
+      <w:r>
+        <w:br/>
+      </w:r>
+      <w:r>
+        <w:rPr>
+          <w:rStyle w:val="NormalTok"/>
+        </w:rPr>
+        <w:t xml:space="preserve">  </w:t>
+      </w:r>
+      <w:r>
+        <w:rPr>
+          <w:rStyle w:val="CommentTok"/>
+        </w:rPr>
+        <w:t xml:space="preserve">#I will omit jobTitle because I it seems that the textual analysis tool would be more sufficient in capturing the complexities of this variable  </w:t>
+      </w:r>
+      <w:r>
+        <w:br/>
+      </w:r>
+      <w:r>
+        <w:rPr>
+          <w:rStyle w:val="NormalTok"/>
+        </w:rPr>
+        <w:t xml:space="preserve">  </w:t>
+      </w:r>
+      <w:r>
+        <w:rPr>
+          <w:rStyle w:val="FunctionTok"/>
+        </w:rPr>
+        <w:t>step_rm</w:t>
+      </w:r>
+      <w:r>
+        <w:rPr>
+          <w:rStyle w:val="NormalTok"/>
+        </w:rPr>
+        <w:t>(country,</w:t>
+      </w:r>
+      <w:r>
+        <w:br/>
+      </w:r>
+      <w:r>
+        <w:rPr>
+          <w:rStyle w:val="NormalTok"/>
+        </w:rPr>
+        <w:lastRenderedPageBreak/>
+        <w:t xml:space="preserve">          cityName,</w:t>
+      </w:r>
+      <w:r>
+        <w:br/>
+      </w:r>
+      <w:r>
+        <w:rPr>
+          <w:rStyle w:val="NormalTok"/>
+        </w:rPr>
+        <w:t xml:space="preserve">          createDate,</w:t>
+      </w:r>
+      <w:r>
+        <w:br/>
+      </w:r>
+      <w:r>
+        <w:rPr>
+          <w:rStyle w:val="NormalTok"/>
+        </w:rPr>
+        <w:t xml:space="preserve">          education,</w:t>
+      </w:r>
+      <w:r>
+        <w:br/>
+      </w:r>
+      <w:r>
+        <w:rPr>
+          <w:rStyle w:val="NormalTok"/>
+        </w:rPr>
+        <w:t xml:space="preserve">          jobTitle,</w:t>
+      </w:r>
+      <w:r>
+        <w:br/>
+      </w:r>
+      <w:r>
+        <w:rPr>
+          <w:rStyle w:val="NormalTok"/>
+        </w:rPr>
+        <w:t xml:space="preserve">          X_id,</w:t>
+      </w:r>
+      <w:r>
+        <w:br/>
+      </w:r>
+      <w:r>
+        <w:rPr>
+          <w:rStyle w:val="NormalTok"/>
+        </w:rPr>
+        <w:t xml:space="preserve">          birthDate) </w:t>
+      </w:r>
+      <w:r>
+        <w:rPr>
+          <w:rStyle w:val="SpecialCharTok"/>
+        </w:rPr>
+        <w:t>|&gt;</w:t>
+      </w:r>
+      <w:r>
+        <w:rPr>
+          <w:rStyle w:val="NormalTok"/>
+        </w:rPr>
+        <w:t xml:space="preserve"> </w:t>
+      </w:r>
+      <w:r>
+        <w:br/>
+      </w:r>
+      <w:r>
+        <w:rPr>
+          <w:rStyle w:val="NormalTok"/>
+        </w:rPr>
+        <w:t xml:space="preserve">  </w:t>
+      </w:r>
+      <w:r>
+        <w:br/>
+      </w:r>
+      <w:r>
+        <w:rPr>
+          <w:rStyle w:val="NormalTok"/>
+        </w:rPr>
+        <w:t xml:space="preserve">  </w:t>
+      </w:r>
+      <w:r>
+        <w:br/>
+      </w:r>
+      <w:r>
+        <w:rPr>
+          <w:rStyle w:val="NormalTok"/>
+        </w:rPr>
+        <w:t xml:space="preserve">  </w:t>
+      </w:r>
+      <w:r>
+        <w:rPr>
+          <w:rStyle w:val="CommentTok"/>
+        </w:rPr>
+        <w:t xml:space="preserve">#dealing with factors </w:t>
+      </w:r>
+      <w:r>
+        <w:br/>
+      </w:r>
+      <w:r>
+        <w:rPr>
+          <w:rStyle w:val="NormalTok"/>
+        </w:rPr>
+        <w:t xml:space="preserve">  </w:t>
+      </w:r>
+      <w:r>
+        <w:rPr>
+          <w:rStyle w:val="FunctionTok"/>
+        </w:rPr>
+        <w:t>step_dummy</w:t>
+      </w:r>
+      <w:r>
+        <w:rPr>
+          <w:rStyle w:val="NormalTok"/>
+        </w:rPr>
+        <w:t>(spotify,</w:t>
+      </w:r>
+      <w:r>
+        <w:br/>
+      </w:r>
+      <w:r>
+        <w:rPr>
+          <w:rStyle w:val="NormalTok"/>
+        </w:rPr>
+        <w:t xml:space="preserve">             gender,</w:t>
+      </w:r>
+      <w:r>
+        <w:br/>
+      </w:r>
+      <w:r>
+        <w:rPr>
+          <w:rStyle w:val="NormalTok"/>
+        </w:rPr>
+        <w:t xml:space="preserve">             instagram,</w:t>
+      </w:r>
+      <w:r>
+        <w:br/>
+      </w:r>
+      <w:r>
+        <w:rPr>
+          <w:rStyle w:val="NormalTok"/>
+        </w:rPr>
+        <w:t xml:space="preserve">             hetero_sx) </w:t>
+      </w:r>
+      <w:r>
+        <w:br/>
+      </w:r>
+      <w:r>
+        <w:rPr>
+          <w:rStyle w:val="NormalTok"/>
+        </w:rPr>
+        <w:t xml:space="preserve">  </w:t>
+      </w:r>
+      <w:r>
+        <w:br/>
+      </w:r>
+      <w:r>
+        <w:rPr>
+          <w:rStyle w:val="NormalTok"/>
+        </w:rPr>
+        <w:t xml:space="preserve">  </w:t>
+      </w:r>
+      <w:r>
+        <w:br/>
+      </w:r>
+      <w:r>
+        <w:br/>
+      </w:r>
+      <w:r>
+        <w:rPr>
+          <w:rStyle w:val="CommentTok"/>
+        </w:rPr>
+        <w:t># -------------------------  Spec- Random Forest ------------------</w:t>
+      </w:r>
+      <w:r>
+        <w:br/>
+      </w:r>
+      <w:r>
+        <w:br/>
+      </w:r>
+      <w:r>
+        <w:rPr>
+          <w:rStyle w:val="NormalTok"/>
+        </w:rPr>
+        <w:t xml:space="preserve">rf_spec </w:t>
+      </w:r>
+      <w:r>
+        <w:rPr>
+          <w:rStyle w:val="OtherTok"/>
+        </w:rPr>
+        <w:t>&lt;-</w:t>
+      </w:r>
+      <w:r>
+        <w:rPr>
+          <w:rStyle w:val="NormalTok"/>
+        </w:rPr>
+        <w:t xml:space="preserve"> </w:t>
+      </w:r>
+      <w:r>
+        <w:rPr>
+          <w:rStyle w:val="FunctionTok"/>
+        </w:rPr>
+        <w:t>rand_forest</w:t>
       </w:r>
       <w:r>
         <w:rPr>
@@ -3245,22 +2739,178 @@
         <w:rPr>
           <w:rStyle w:val="NormalTok"/>
         </w:rPr>
-        <w:t xml:space="preserve">  Tinder.test,</w:t>
-      </w:r>
-      <w:r>
-        <w:br/>
-      </w:r>
-      <w:r>
-        <w:rPr>
-          <w:rStyle w:val="NormalTok"/>
-        </w:rPr>
         <w:t xml:space="preserve">  </w:t>
       </w:r>
       <w:r>
         <w:rPr>
           <w:rStyle w:val="AttributeTok"/>
         </w:rPr>
-        <w:t>times =</w:t>
+        <w:t>mode =</w:t>
+      </w:r>
+      <w:r>
+        <w:rPr>
+          <w:rStyle w:val="NormalTok"/>
+        </w:rPr>
+        <w:t xml:space="preserve"> </w:t>
+      </w:r>
+      <w:r>
+        <w:rPr>
+          <w:rStyle w:val="StringTok"/>
+        </w:rPr>
+        <w:t>"regression"</w:t>
+      </w:r>
+      <w:r>
+        <w:rPr>
+          <w:rStyle w:val="NormalTok"/>
+        </w:rPr>
+        <w:t>,</w:t>
+      </w:r>
+      <w:r>
+        <w:br/>
+      </w:r>
+      <w:r>
+        <w:rPr>
+          <w:rStyle w:val="NormalTok"/>
+        </w:rPr>
+        <w:t xml:space="preserve">  </w:t>
+      </w:r>
+      <w:r>
+        <w:rPr>
+          <w:rStyle w:val="AttributeTok"/>
+        </w:rPr>
+        <w:t>engine =</w:t>
+      </w:r>
+      <w:r>
+        <w:rPr>
+          <w:rStyle w:val="NormalTok"/>
+        </w:rPr>
+        <w:t xml:space="preserve"> </w:t>
+      </w:r>
+      <w:r>
+        <w:rPr>
+          <w:rStyle w:val="StringTok"/>
+        </w:rPr>
+        <w:t>"randomForest"</w:t>
+      </w:r>
+      <w:r>
+        <w:rPr>
+          <w:rStyle w:val="NormalTok"/>
+        </w:rPr>
+        <w:t>,</w:t>
+      </w:r>
+      <w:r>
+        <w:br/>
+      </w:r>
+      <w:r>
+        <w:rPr>
+          <w:rStyle w:val="NormalTok"/>
+        </w:rPr>
+        <w:t xml:space="preserve">  </w:t>
+      </w:r>
+      <w:r>
+        <w:br/>
+      </w:r>
+      <w:r>
+        <w:rPr>
+          <w:rStyle w:val="NormalTok"/>
+        </w:rPr>
+        <w:t xml:space="preserve">  </w:t>
+      </w:r>
+      <w:r>
+        <w:rPr>
+          <w:rStyle w:val="CommentTok"/>
+        </w:rPr>
+        <w:t>#we will tune these hyper-parameters</w:t>
+      </w:r>
+      <w:r>
+        <w:br/>
+      </w:r>
+      <w:r>
+        <w:rPr>
+          <w:rStyle w:val="NormalTok"/>
+        </w:rPr>
+        <w:t xml:space="preserve">  </w:t>
+      </w:r>
+      <w:r>
+        <w:br/>
+      </w:r>
+      <w:r>
+        <w:rPr>
+          <w:rStyle w:val="NormalTok"/>
+        </w:rPr>
+        <w:t xml:space="preserve">  </w:t>
+      </w:r>
+      <w:r>
+        <w:rPr>
+          <w:rStyle w:val="AttributeTok"/>
+        </w:rPr>
+        <w:t>mtry =</w:t>
+      </w:r>
+      <w:r>
+        <w:rPr>
+          <w:rStyle w:val="NormalTok"/>
+        </w:rPr>
+        <w:t xml:space="preserve"> </w:t>
+      </w:r>
+      <w:r>
+        <w:rPr>
+          <w:rStyle w:val="FunctionTok"/>
+        </w:rPr>
+        <w:t>tune</w:t>
+      </w:r>
+      <w:r>
+        <w:rPr>
+          <w:rStyle w:val="NormalTok"/>
+        </w:rPr>
+        <w:t>(),</w:t>
+      </w:r>
+      <w:r>
+        <w:br/>
+      </w:r>
+      <w:r>
+        <w:rPr>
+          <w:rStyle w:val="NormalTok"/>
+        </w:rPr>
+        <w:t xml:space="preserve">  </w:t>
+      </w:r>
+      <w:r>
+        <w:rPr>
+          <w:rStyle w:val="AttributeTok"/>
+        </w:rPr>
+        <w:t>trees =</w:t>
+      </w:r>
+      <w:r>
+        <w:rPr>
+          <w:rStyle w:val="NormalTok"/>
+        </w:rPr>
+        <w:t xml:space="preserve"> </w:t>
+      </w:r>
+      <w:r>
+        <w:rPr>
+          <w:rStyle w:val="FunctionTok"/>
+        </w:rPr>
+        <w:t>tune</w:t>
+      </w:r>
+      <w:r>
+        <w:rPr>
+          <w:rStyle w:val="NormalTok"/>
+        </w:rPr>
+        <w:t>(),</w:t>
+      </w:r>
+      <w:r>
+        <w:br/>
+      </w:r>
+      <w:r>
+        <w:rPr>
+          <w:rStyle w:val="NormalTok"/>
+        </w:rPr>
+        <w:t xml:space="preserve">  </w:t>
+      </w:r>
+      <w:r>
+        <w:rPr>
+          <w:rStyle w:val="AttributeTok"/>
+        </w:rPr>
+        <w:t>min_n =</w:t>
       </w:r>
       <w:r>
         <w:rPr>
@@ -3272,821 +2922,91 @@
         <w:rPr>
           <w:rStyle w:val="DecValTok"/>
         </w:rPr>
-        <w:t>50</w:t>
-      </w:r>
-      <w:r>
-        <w:rPr>
-          <w:rStyle w:val="NormalTok"/>
-        </w:rPr>
-        <w:t>,</w:t>
-      </w:r>
-      <w:r>
-        <w:br/>
-      </w:r>
-      <w:r>
-        <w:rPr>
-          <w:rStyle w:val="NormalTok"/>
-        </w:rPr>
-        <w:t xml:space="preserve">  </w:t>
+        <w:t>5</w:t>
+      </w:r>
+      <w:r>
+        <w:br/>
+      </w:r>
+      <w:r>
+        <w:rPr>
+          <w:rStyle w:val="NormalTok"/>
+        </w:rPr>
+        <w:t>)</w:t>
+      </w:r>
+      <w:r>
+        <w:br/>
+      </w:r>
+      <w:r>
+        <w:br/>
+      </w:r>
+      <w:r>
+        <w:rPr>
+          <w:rStyle w:val="NormalTok"/>
+        </w:rPr>
+        <w:t xml:space="preserve">rf_wf </w:t>
+      </w:r>
+      <w:r>
+        <w:rPr>
+          <w:rStyle w:val="OtherTok"/>
+        </w:rPr>
+        <w:t>&lt;-</w:t>
+      </w:r>
+      <w:r>
+        <w:rPr>
+          <w:rStyle w:val="NormalTok"/>
+        </w:rPr>
+        <w:t xml:space="preserve"> </w:t>
+      </w:r>
+      <w:r>
+        <w:rPr>
+          <w:rStyle w:val="FunctionTok"/>
+        </w:rPr>
+        <w:t>workflow</w:t>
+      </w:r>
+      <w:r>
+        <w:rPr>
+          <w:rStyle w:val="NormalTok"/>
+        </w:rPr>
+        <w:t>(</w:t>
       </w:r>
       <w:r>
         <w:rPr>
           <w:rStyle w:val="AttributeTok"/>
         </w:rPr>
-        <w:t>strata =</w:t>
-      </w:r>
-      <w:r>
-        <w:rPr>
-          <w:rStyle w:val="NormalTok"/>
-        </w:rPr>
-        <w:t xml:space="preserve"> </w:t>
-      </w:r>
-      <w:r>
-        <w:rPr>
-          <w:rStyle w:val="ConstantTok"/>
-        </w:rPr>
-        <w:t>NULL</w:t>
-      </w:r>
-      <w:r>
-        <w:rPr>
-          <w:rStyle w:val="NormalTok"/>
-        </w:rPr>
-        <w:t>,</w:t>
-      </w:r>
-      <w:r>
-        <w:br/>
-      </w:r>
-      <w:r>
-        <w:rPr>
-          <w:rStyle w:val="NormalTok"/>
-        </w:rPr>
-        <w:t xml:space="preserve">  </w:t>
+        <w:t>preprocessor =</w:t>
+      </w:r>
+      <w:r>
+        <w:rPr>
+          <w:rStyle w:val="NormalTok"/>
+        </w:rPr>
+        <w:t xml:space="preserve"> rec, </w:t>
       </w:r>
       <w:r>
         <w:rPr>
           <w:rStyle w:val="AttributeTok"/>
         </w:rPr>
-        <w:t>apparent =</w:t>
-      </w:r>
-      <w:r>
-        <w:rPr>
-          <w:rStyle w:val="NormalTok"/>
-        </w:rPr>
-        <w:t xml:space="preserve"> F</w:t>
-      </w:r>
-      <w:r>
-        <w:br/>
-      </w:r>
-      <w:r>
-        <w:rPr>
-          <w:rStyle w:val="NormalTok"/>
-        </w:rPr>
-        <w:t>)</w:t>
-      </w:r>
-      <w:r>
-        <w:br/>
-      </w:r>
-      <w:r>
-        <w:br/>
-      </w:r>
-      <w:r>
-        <w:rPr>
-          <w:rStyle w:val="CommentTok"/>
-        </w:rPr>
-        <w:t>#the predictions would be evaluated using R2 and MAE</w:t>
-      </w:r>
-      <w:r>
-        <w:br/>
-      </w:r>
-      <w:r>
-        <w:br/>
-      </w:r>
-      <w:r>
-        <w:rPr>
-          <w:rStyle w:val="NormalTok"/>
-        </w:rPr>
-        <w:t xml:space="preserve">mset_reg </w:t>
-      </w:r>
-      <w:r>
-        <w:rPr>
-          <w:rStyle w:val="OtherTok"/>
-        </w:rPr>
-        <w:t>&lt;-</w:t>
-      </w:r>
-      <w:r>
-        <w:rPr>
-          <w:rStyle w:val="NormalTok"/>
-        </w:rPr>
-        <w:t xml:space="preserve"> </w:t>
-      </w:r>
-      <w:r>
-        <w:rPr>
-          <w:rStyle w:val="FunctionTok"/>
-        </w:rPr>
-        <w:t>metric_set</w:t>
-      </w:r>
-      <w:r>
-        <w:rPr>
-          <w:rStyle w:val="NormalTok"/>
-        </w:rPr>
-        <w:t>(rsq, mae)</w:t>
-      </w:r>
-      <w:r>
-        <w:br/>
-      </w:r>
-      <w:r>
-        <w:br/>
-      </w:r>
-      <w:r>
-        <w:rPr>
-          <w:rStyle w:val="CommentTok"/>
-        </w:rPr>
-        <w:t># ---------------- Recipe-------------------</w:t>
-      </w:r>
-      <w:r>
-        <w:br/>
-      </w:r>
-      <w:r>
-        <w:br/>
-      </w:r>
-      <w:r>
-        <w:rPr>
-          <w:rStyle w:val="CommentTok"/>
-        </w:rPr>
-        <w:t># let's define the models R</w:t>
-      </w:r>
-      <w:r>
-        <w:br/>
-      </w:r>
-      <w:r>
-        <w:br/>
-      </w:r>
-      <w:r>
-        <w:rPr>
-          <w:rStyle w:val="CommentTok"/>
-        </w:rPr>
-        <w:t># Predicting number of ghosting after initial message:</w:t>
-      </w:r>
-      <w:r>
-        <w:br/>
-      </w:r>
-      <w:r>
-        <w:br/>
-      </w:r>
-      <w:r>
-        <w:rPr>
-          <w:rStyle w:val="NormalTok"/>
-        </w:rPr>
-        <w:t xml:space="preserve">rec </w:t>
-      </w:r>
-      <w:r>
-        <w:rPr>
-          <w:rStyle w:val="OtherTok"/>
-        </w:rPr>
-        <w:t>&lt;-</w:t>
-      </w:r>
-      <w:r>
-        <w:rPr>
-          <w:rStyle w:val="NormalTok"/>
-        </w:rPr>
-        <w:t xml:space="preserve"> </w:t>
-      </w:r>
-      <w:r>
-        <w:rPr>
-          <w:rStyle w:val="FunctionTok"/>
-        </w:rPr>
-        <w:t>recipe</w:t>
-      </w:r>
-      <w:r>
-        <w:rPr>
-          <w:rStyle w:val="NormalTok"/>
-        </w:rPr>
-        <w:t xml:space="preserve">(nrOfGhostingsAfterInitialMessage </w:t>
-      </w:r>
-      <w:r>
-        <w:rPr>
-          <w:rStyle w:val="SpecialCharTok"/>
-        </w:rPr>
-        <w:t>~</w:t>
-      </w:r>
-      <w:r>
-        <w:rPr>
-          <w:rStyle w:val="NormalTok"/>
-        </w:rPr>
-        <w:t xml:space="preserve"> .,</w:t>
-      </w:r>
-      <w:r>
-        <w:br/>
-      </w:r>
-      <w:r>
-        <w:rPr>
-          <w:rStyle w:val="NormalTok"/>
-        </w:rPr>
-        <w:t xml:space="preserve">              </w:t>
-      </w:r>
-      <w:r>
-        <w:rPr>
-          <w:rStyle w:val="AttributeTok"/>
-        </w:rPr>
-        <w:t>data =</w:t>
-      </w:r>
-      <w:r>
-        <w:rPr>
-          <w:rStyle w:val="NormalTok"/>
-        </w:rPr>
-        <w:t xml:space="preserve"> Tinder.train) </w:t>
-      </w:r>
-      <w:r>
-        <w:rPr>
-          <w:rStyle w:val="SpecialCharTok"/>
-        </w:rPr>
-        <w:t>|&gt;</w:t>
-      </w:r>
-      <w:r>
-        <w:rPr>
-          <w:rStyle w:val="NormalTok"/>
-        </w:rPr>
-        <w:t xml:space="preserve"> </w:t>
-      </w:r>
-      <w:r>
-        <w:br/>
-      </w:r>
-      <w:r>
-        <w:rPr>
-          <w:rStyle w:val="NormalTok"/>
-        </w:rPr>
-        <w:t xml:space="preserve">   </w:t>
-      </w:r>
-      <w:r>
-        <w:rPr>
-          <w:rStyle w:val="CommentTok"/>
-        </w:rPr>
-        <w:t>#for our purposes we would omit some demographics that are not of high interests for us,   since we would like to examine patterns across nationalities and times.</w:t>
-      </w:r>
-      <w:r>
-        <w:br/>
-      </w:r>
-      <w:r>
-        <w:rPr>
-          <w:rStyle w:val="NormalTok"/>
-        </w:rPr>
-        <w:t xml:space="preserve">  </w:t>
-      </w:r>
-      <w:r>
-        <w:br/>
-      </w:r>
-      <w:r>
-        <w:rPr>
-          <w:rStyle w:val="NormalTok"/>
-        </w:rPr>
-        <w:t xml:space="preserve">   </w:t>
-      </w:r>
-      <w:r>
-        <w:rPr>
-          <w:rStyle w:val="CommentTok"/>
-        </w:rPr>
-        <w:t xml:space="preserve">#after visually inspecting the data frame I can say the the 'education' is not valid. I  found quite a few professionals with no education (physician fro example) </w:t>
-      </w:r>
-      <w:r>
-        <w:br/>
-      </w:r>
-      <w:r>
-        <w:rPr>
-          <w:rStyle w:val="NormalTok"/>
-        </w:rPr>
-        <w:t xml:space="preserve">  </w:t>
-      </w:r>
-      <w:r>
-        <w:br/>
-      </w:r>
-      <w:r>
-        <w:rPr>
-          <w:rStyle w:val="NormalTok"/>
-        </w:rPr>
-        <w:t xml:space="preserve">  </w:t>
-      </w:r>
-      <w:r>
-        <w:rPr>
-          <w:rStyle w:val="CommentTok"/>
-        </w:rPr>
-        <w:t xml:space="preserve">#I will omit jobTitle because I it seems that the textual analysis tool </w:t>
-      </w:r>
-      <w:r>
-        <w:rPr>
-          <w:rStyle w:val="CommentTok"/>
+        <w:t>spec =</w:t>
+      </w:r>
+      <w:r>
+        <w:rPr>
+          <w:rStyle w:val="NormalTok"/>
+        </w:rPr>
+        <w:t xml:space="preserve"> rf_spec)</w:t>
+      </w:r>
+      <w:r>
+        <w:br/>
+      </w:r>
+      <w:r>
+        <w:br/>
+      </w:r>
+      <w:r>
+        <w:br/>
+      </w:r>
+      <w:r>
+        <w:rPr>
+          <w:rStyle w:val="NormalTok"/>
         </w:rPr>
         <w:lastRenderedPageBreak/>
-        <w:t xml:space="preserve">would be more sufficient in capturing the complexities of this variable  </w:t>
-      </w:r>
-      <w:r>
-        <w:br/>
-      </w:r>
-      <w:r>
-        <w:rPr>
-          <w:rStyle w:val="NormalTok"/>
-        </w:rPr>
-        <w:t xml:space="preserve">  </w:t>
-      </w:r>
-      <w:r>
-        <w:rPr>
-          <w:rStyle w:val="FunctionTok"/>
-        </w:rPr>
-        <w:t>step_rm</w:t>
-      </w:r>
-      <w:r>
-        <w:rPr>
-          <w:rStyle w:val="NormalTok"/>
-        </w:rPr>
-        <w:t>(country,</w:t>
-      </w:r>
-      <w:r>
-        <w:br/>
-      </w:r>
-      <w:r>
-        <w:rPr>
-          <w:rStyle w:val="NormalTok"/>
-        </w:rPr>
-        <w:t xml:space="preserve">          cityName,</w:t>
-      </w:r>
-      <w:r>
-        <w:br/>
-      </w:r>
-      <w:r>
-        <w:rPr>
-          <w:rStyle w:val="NormalTok"/>
-        </w:rPr>
-        <w:t xml:space="preserve">          createDate,</w:t>
-      </w:r>
-      <w:r>
-        <w:br/>
-      </w:r>
-      <w:r>
-        <w:rPr>
-          <w:rStyle w:val="NormalTok"/>
-        </w:rPr>
-        <w:t xml:space="preserve">          education,</w:t>
-      </w:r>
-      <w:r>
-        <w:br/>
-      </w:r>
-      <w:r>
-        <w:rPr>
-          <w:rStyle w:val="NormalTok"/>
-        </w:rPr>
-        <w:t xml:space="preserve">          jobTitle,</w:t>
-      </w:r>
-      <w:r>
-        <w:br/>
-      </w:r>
-      <w:r>
-        <w:rPr>
-          <w:rStyle w:val="NormalTok"/>
-        </w:rPr>
-        <w:t xml:space="preserve">          X_id,</w:t>
-      </w:r>
-      <w:r>
-        <w:br/>
-      </w:r>
-      <w:r>
-        <w:rPr>
-          <w:rStyle w:val="NormalTok"/>
-        </w:rPr>
-        <w:t xml:space="preserve">          birthDate) </w:t>
-      </w:r>
-      <w:r>
-        <w:rPr>
-          <w:rStyle w:val="SpecialCharTok"/>
-        </w:rPr>
-        <w:t>|&gt;</w:t>
-      </w:r>
-      <w:r>
-        <w:rPr>
-          <w:rStyle w:val="NormalTok"/>
-        </w:rPr>
-        <w:t xml:space="preserve"> </w:t>
-      </w:r>
-      <w:r>
-        <w:br/>
-      </w:r>
-      <w:r>
-        <w:rPr>
-          <w:rStyle w:val="NormalTok"/>
-        </w:rPr>
-        <w:t xml:space="preserve">  </w:t>
-      </w:r>
-      <w:r>
-        <w:br/>
-      </w:r>
-      <w:r>
-        <w:rPr>
-          <w:rStyle w:val="NormalTok"/>
-        </w:rPr>
-        <w:t xml:space="preserve">  </w:t>
-      </w:r>
-      <w:r>
-        <w:br/>
-      </w:r>
-      <w:r>
-        <w:rPr>
-          <w:rStyle w:val="NormalTok"/>
-        </w:rPr>
-        <w:t xml:space="preserve">  </w:t>
-      </w:r>
-      <w:r>
-        <w:rPr>
-          <w:rStyle w:val="CommentTok"/>
-        </w:rPr>
-        <w:t xml:space="preserve">#dealing with factors </w:t>
-      </w:r>
-      <w:r>
-        <w:br/>
-      </w:r>
-      <w:r>
-        <w:rPr>
-          <w:rStyle w:val="NormalTok"/>
-        </w:rPr>
-        <w:t xml:space="preserve">  </w:t>
-      </w:r>
-      <w:r>
-        <w:rPr>
-          <w:rStyle w:val="FunctionTok"/>
-        </w:rPr>
-        <w:t>step_dummy</w:t>
-      </w:r>
-      <w:r>
-        <w:rPr>
-          <w:rStyle w:val="NormalTok"/>
-        </w:rPr>
-        <w:t>(spotify,</w:t>
-      </w:r>
-      <w:r>
-        <w:br/>
-      </w:r>
-      <w:r>
-        <w:rPr>
-          <w:rStyle w:val="NormalTok"/>
-        </w:rPr>
-        <w:t xml:space="preserve">             gender,</w:t>
-      </w:r>
-      <w:r>
-        <w:br/>
-      </w:r>
-      <w:r>
-        <w:rPr>
-          <w:rStyle w:val="NormalTok"/>
-        </w:rPr>
-        <w:t xml:space="preserve">             instagram,</w:t>
-      </w:r>
-      <w:r>
-        <w:br/>
-      </w:r>
-      <w:r>
-        <w:rPr>
-          <w:rStyle w:val="NormalTok"/>
-        </w:rPr>
-        <w:t xml:space="preserve">             hetero_sx) </w:t>
-      </w:r>
-      <w:r>
-        <w:br/>
-      </w:r>
-      <w:r>
-        <w:rPr>
-          <w:rStyle w:val="NormalTok"/>
-        </w:rPr>
-        <w:t xml:space="preserve">  </w:t>
-      </w:r>
-      <w:r>
-        <w:br/>
-      </w:r>
-      <w:r>
-        <w:rPr>
-          <w:rStyle w:val="NormalTok"/>
-        </w:rPr>
-        <w:t xml:space="preserve">  </w:t>
-      </w:r>
-      <w:r>
-        <w:br/>
-      </w:r>
-      <w:r>
-        <w:br/>
-      </w:r>
-      <w:r>
-        <w:rPr>
-          <w:rStyle w:val="CommentTok"/>
-        </w:rPr>
-        <w:t># -------------------------  Spec- Random Forest ------------------</w:t>
-      </w:r>
-      <w:r>
-        <w:br/>
-      </w:r>
-      <w:r>
-        <w:br/>
-      </w:r>
-      <w:r>
-        <w:rPr>
-          <w:rStyle w:val="NormalTok"/>
-        </w:rPr>
-        <w:t xml:space="preserve">rf_spec </w:t>
-      </w:r>
-      <w:r>
-        <w:rPr>
-          <w:rStyle w:val="OtherTok"/>
-        </w:rPr>
-        <w:t>&lt;-</w:t>
-      </w:r>
-      <w:r>
-        <w:rPr>
-          <w:rStyle w:val="NormalTok"/>
-        </w:rPr>
-        <w:t xml:space="preserve"> </w:t>
-      </w:r>
-      <w:r>
-        <w:rPr>
-          <w:rStyle w:val="FunctionTok"/>
-        </w:rPr>
-        <w:t>rand_forest</w:t>
-      </w:r>
-      <w:r>
-        <w:rPr>
-          <w:rStyle w:val="NormalTok"/>
-        </w:rPr>
-        <w:t>(</w:t>
-      </w:r>
-      <w:r>
-        <w:br/>
-      </w:r>
-      <w:r>
-        <w:rPr>
-          <w:rStyle w:val="NormalTok"/>
-        </w:rPr>
-        <w:t xml:space="preserve">  </w:t>
-      </w:r>
-      <w:r>
-        <w:rPr>
-          <w:rStyle w:val="AttributeTok"/>
-        </w:rPr>
-        <w:t>mode =</w:t>
-      </w:r>
-      <w:r>
-        <w:rPr>
-          <w:rStyle w:val="NormalTok"/>
-        </w:rPr>
-        <w:t xml:space="preserve"> </w:t>
-      </w:r>
-      <w:r>
-        <w:rPr>
-          <w:rStyle w:val="StringTok"/>
-        </w:rPr>
-        <w:t>"regression"</w:t>
-      </w:r>
-      <w:r>
-        <w:rPr>
-          <w:rStyle w:val="NormalTok"/>
-        </w:rPr>
-        <w:t>,</w:t>
-      </w:r>
-      <w:r>
-        <w:br/>
-      </w:r>
-      <w:r>
-        <w:rPr>
-          <w:rStyle w:val="NormalTok"/>
-        </w:rPr>
-        <w:t xml:space="preserve">  </w:t>
-      </w:r>
-      <w:r>
-        <w:rPr>
-          <w:rStyle w:val="AttributeTok"/>
-        </w:rPr>
-        <w:t>engine =</w:t>
-      </w:r>
-      <w:r>
-        <w:rPr>
-          <w:rStyle w:val="NormalTok"/>
-        </w:rPr>
-        <w:t xml:space="preserve"> </w:t>
-      </w:r>
-      <w:r>
-        <w:rPr>
-          <w:rStyle w:val="StringTok"/>
-        </w:rPr>
-        <w:t>"randomForest"</w:t>
-      </w:r>
-      <w:r>
-        <w:rPr>
-          <w:rStyle w:val="NormalTok"/>
-        </w:rPr>
-        <w:t>,</w:t>
-      </w:r>
-      <w:r>
-        <w:br/>
-      </w:r>
-      <w:r>
-        <w:rPr>
-          <w:rStyle w:val="NormalTok"/>
-        </w:rPr>
-        <w:t xml:space="preserve">  </w:t>
-      </w:r>
-      <w:r>
-        <w:br/>
-      </w:r>
-      <w:r>
-        <w:rPr>
-          <w:rStyle w:val="NormalTok"/>
-        </w:rPr>
-        <w:t xml:space="preserve">  </w:t>
-      </w:r>
-      <w:r>
-        <w:rPr>
-          <w:rStyle w:val="CommentTok"/>
-        </w:rPr>
-        <w:t>#we will tune these hyper-parameters</w:t>
-      </w:r>
-      <w:r>
-        <w:br/>
-      </w:r>
-      <w:r>
-        <w:rPr>
-          <w:rStyle w:val="NormalTok"/>
-        </w:rPr>
-        <w:t xml:space="preserve">  </w:t>
-      </w:r>
-      <w:r>
-        <w:br/>
-      </w:r>
-      <w:r>
-        <w:rPr>
-          <w:rStyle w:val="NormalTok"/>
-        </w:rPr>
-        <w:t xml:space="preserve">  </w:t>
-      </w:r>
-      <w:r>
-        <w:rPr>
-          <w:rStyle w:val="AttributeTok"/>
-        </w:rPr>
-        <w:t>mtry =</w:t>
-      </w:r>
-      <w:r>
-        <w:rPr>
-          <w:rStyle w:val="NormalTok"/>
-        </w:rPr>
-        <w:t xml:space="preserve"> </w:t>
-      </w:r>
-      <w:r>
-        <w:rPr>
-          <w:rStyle w:val="FunctionTok"/>
-        </w:rPr>
-        <w:t>tune</w:t>
-      </w:r>
-      <w:r>
-        <w:rPr>
-          <w:rStyle w:val="NormalTok"/>
-        </w:rPr>
-        <w:t>(),</w:t>
-      </w:r>
-      <w:r>
-        <w:br/>
-      </w:r>
-      <w:r>
-        <w:rPr>
-          <w:rStyle w:val="NormalTok"/>
-        </w:rPr>
-        <w:t xml:space="preserve">  </w:t>
-      </w:r>
-      <w:r>
-        <w:rPr>
-          <w:rStyle w:val="AttributeTok"/>
-        </w:rPr>
-        <w:t>trees =</w:t>
-      </w:r>
-      <w:r>
-        <w:rPr>
-          <w:rStyle w:val="NormalTok"/>
-        </w:rPr>
-        <w:t xml:space="preserve"> </w:t>
-      </w:r>
-      <w:r>
-        <w:rPr>
-          <w:rStyle w:val="FunctionTok"/>
-        </w:rPr>
-        <w:t>tune</w:t>
-      </w:r>
-      <w:r>
-        <w:rPr>
-          <w:rStyle w:val="NormalTok"/>
-        </w:rPr>
-        <w:t>(),</w:t>
-      </w:r>
-      <w:r>
-        <w:br/>
-      </w:r>
-      <w:r>
-        <w:rPr>
-          <w:rStyle w:val="NormalTok"/>
-        </w:rPr>
-        <w:t xml:space="preserve">  </w:t>
-      </w:r>
-      <w:r>
-        <w:rPr>
-          <w:rStyle w:val="AttributeTok"/>
-        </w:rPr>
-        <w:t>min_n =</w:t>
-      </w:r>
-      <w:r>
-        <w:rPr>
-          <w:rStyle w:val="NormalTok"/>
-        </w:rPr>
-        <w:t xml:space="preserve"> </w:t>
-      </w:r>
-      <w:r>
-        <w:rPr>
-          <w:rStyle w:val="DecValTok"/>
-        </w:rPr>
-        <w:t>5</w:t>
-      </w:r>
-      <w:r>
-        <w:br/>
-      </w:r>
-      <w:r>
-        <w:rPr>
-          <w:rStyle w:val="NormalTok"/>
-        </w:rPr>
-        <w:t>)</w:t>
-      </w:r>
-      <w:r>
-        <w:br/>
-      </w:r>
-      <w:r>
-        <w:br/>
-      </w:r>
-      <w:r>
-        <w:rPr>
-          <w:rStyle w:val="NormalTok"/>
-        </w:rPr>
-        <w:t xml:space="preserve">rf_wf </w:t>
-      </w:r>
-      <w:r>
-        <w:rPr>
-          <w:rStyle w:val="OtherTok"/>
-        </w:rPr>
-        <w:t>&lt;-</w:t>
-      </w:r>
-      <w:r>
-        <w:rPr>
-          <w:rStyle w:val="NormalTok"/>
-        </w:rPr>
-        <w:t xml:space="preserve"> </w:t>
-      </w:r>
-      <w:r>
-        <w:rPr>
-          <w:rStyle w:val="FunctionTok"/>
-        </w:rPr>
-        <w:t>workflow</w:t>
-      </w:r>
-      <w:r>
-        <w:rPr>
-          <w:rStyle w:val="NormalTok"/>
-        </w:rPr>
-        <w:t>(</w:t>
-      </w:r>
-      <w:r>
-        <w:rPr>
-          <w:rStyle w:val="AttributeTok"/>
-        </w:rPr>
-        <w:t>preprocessor =</w:t>
-      </w:r>
-      <w:r>
-        <w:rPr>
-          <w:rStyle w:val="NormalTok"/>
-        </w:rPr>
-        <w:t xml:space="preserve"> rec, </w:t>
-      </w:r>
-      <w:r>
-        <w:rPr>
-          <w:rStyle w:val="AttributeTok"/>
-        </w:rPr>
-        <w:t>spec =</w:t>
-      </w:r>
-      <w:r>
-        <w:rPr>
-          <w:rStyle w:val="NormalTok"/>
-        </w:rPr>
-        <w:t xml:space="preserve"> rf_spec)</w:t>
-      </w:r>
-      <w:r>
-        <w:br/>
-      </w:r>
-      <w:r>
-        <w:lastRenderedPageBreak/>
-        <w:br/>
-      </w:r>
-      <w:r>
-        <w:br/>
-      </w:r>
-      <w:r>
-        <w:rPr>
-          <w:rStyle w:val="NormalTok"/>
-        </w:rPr>
         <w:t xml:space="preserve">rf_grid </w:t>
       </w:r>
       <w:r>
@@ -12064,6 +10984,13 @@
     <w:lsdException w:name="Placeholder Text" w:semiHidden="1"/>
     <w:lsdException w:name="Light Shading"/>
     <w:lsdException w:name="Light List"/>
+    <w:lsdException w:name="Light Grid"/>
+    <w:lsdException w:name="Medium Shading 1"/>
+    <w:lsdException w:name="Medium Shading 2"/>
+    <w:lsdException w:name="Medium List 1"/>
+    <w:lsdException w:name="Medium List 2"/>
+    <w:lsdException w:name="Medium Grid 1"/>
+    <w:lsdException w:name="Medium Grid 2"/>
     <w:lsdException w:name="Medium Grid 3"/>
     <w:lsdException w:name="Dark List"/>
     <w:lsdException w:name="Colorful Shading"/>
@@ -12467,6 +11394,7 @@
   <w:style w:type="character" w:default="1" w:styleId="DefaultParagraphFont">
     <w:name w:val="Default Paragraph Font"/>
     <w:uiPriority w:val="1"/>
+    <w:semiHidden/>
     <w:unhideWhenUsed/>
   </w:style>
   <w:style w:type="table" w:default="1" w:styleId="TableNormal">

</xml_diff>

<commit_message>
switching from quarto ro R
</commit_message>
<xml_diff>
--- a/ML_FINAL.docx
+++ b/ML_FINAL.docx
@@ -102,8 +102,19 @@
           <w:szCs w:val="22"/>
           <w:rtl/>
         </w:rPr>
-        <w:t>את מאגר הנתונים לקחנו מתוך האתר kaggle</w:t>
-      </w:r>
+        <w:t xml:space="preserve">את מאגר הנתונים לקחנו מתוך האתר </w:t>
+      </w:r>
+      <w:proofErr w:type="spellStart"/>
+      <w:r>
+        <w:rPr>
+          <w:rFonts w:ascii="Arial" w:hAnsi="Arial" w:cs="Arial"/>
+          <w:sz w:val="22"/>
+          <w:szCs w:val="22"/>
+          <w:rtl/>
+        </w:rPr>
+        <w:t>kaggle</w:t>
+      </w:r>
+      <w:proofErr w:type="spellEnd"/>
       <w:r>
         <w:rPr>
           <w:rFonts w:ascii="Arial" w:hAnsi="Arial" w:cs="Arial"/>
@@ -174,16 +185,126 @@
           <w:szCs w:val="22"/>
           <w:rtl/>
         </w:rPr>
-        <w:t xml:space="preserve">סט הנתונים כולל מידע שנאסף מ-1,209 משתמשים באפליקציית טינדר, ומכיל 31 עמודות המתארות פרטים דמוגרפיים והתנהגותיים: למשל מספר פתיחות של האפליקציה (sum_app_opens) מספר ימים בהם המשתמש פעיל (no_of_days) מספר ההתכתבויות הכללי (nrOfConversations) וכדומה.עבודה זו תבחן האם </w:t>
-      </w:r>
-      <w:r>
-        <w:rPr>
-          <w:rFonts w:ascii="Arial" w:hAnsi="Arial" w:cs="Arial"/>
-          <w:sz w:val="22"/>
-          <w:szCs w:val="22"/>
-          <w:rtl/>
-        </w:rPr>
-        <w:t>מספר פעמי ה</w:t>
+        <w:t xml:space="preserve">סט הנתונים כולל מידע שנאסף מ-1,209 משתמשים באפליקציית </w:t>
+      </w:r>
+      <w:proofErr w:type="spellStart"/>
+      <w:r>
+        <w:rPr>
+          <w:rFonts w:ascii="Arial" w:hAnsi="Arial" w:cs="Arial"/>
+          <w:sz w:val="22"/>
+          <w:szCs w:val="22"/>
+          <w:rtl/>
+        </w:rPr>
+        <w:t>טינדר</w:t>
+      </w:r>
+      <w:proofErr w:type="spellEnd"/>
+      <w:r>
+        <w:rPr>
+          <w:rFonts w:ascii="Arial" w:hAnsi="Arial" w:cs="Arial"/>
+          <w:sz w:val="22"/>
+          <w:szCs w:val="22"/>
+          <w:rtl/>
+        </w:rPr>
+        <w:t>, ומכיל 31 עמודות המתארות פרטים דמוגרפיים והתנהגותיים: למשל מספר פתיחות של האפליקציה (</w:t>
+      </w:r>
+      <w:proofErr w:type="spellStart"/>
+      <w:r>
+        <w:rPr>
+          <w:rFonts w:ascii="Arial" w:hAnsi="Arial" w:cs="Arial"/>
+          <w:sz w:val="22"/>
+          <w:szCs w:val="22"/>
+          <w:rtl/>
+        </w:rPr>
+        <w:t>sum_app_opens</w:t>
+      </w:r>
+      <w:proofErr w:type="spellEnd"/>
+      <w:r>
+        <w:rPr>
+          <w:rFonts w:ascii="Arial" w:hAnsi="Arial" w:cs="Arial"/>
+          <w:sz w:val="22"/>
+          <w:szCs w:val="22"/>
+          <w:rtl/>
+        </w:rPr>
+        <w:t>) מספר ימים בהם המשתמש פעיל (</w:t>
+      </w:r>
+      <w:proofErr w:type="spellStart"/>
+      <w:r>
+        <w:rPr>
+          <w:rFonts w:ascii="Arial" w:hAnsi="Arial" w:cs="Arial"/>
+          <w:sz w:val="22"/>
+          <w:szCs w:val="22"/>
+          <w:rtl/>
+        </w:rPr>
+        <w:t>no_of_days</w:t>
+      </w:r>
+      <w:proofErr w:type="spellEnd"/>
+      <w:r>
+        <w:rPr>
+          <w:rFonts w:ascii="Arial" w:hAnsi="Arial" w:cs="Arial"/>
+          <w:sz w:val="22"/>
+          <w:szCs w:val="22"/>
+          <w:rtl/>
+        </w:rPr>
+        <w:t>) מספר ההתכתבויות הכללי (</w:t>
+      </w:r>
+      <w:proofErr w:type="spellStart"/>
+      <w:r>
+        <w:rPr>
+          <w:rFonts w:ascii="Arial" w:hAnsi="Arial" w:cs="Arial"/>
+          <w:sz w:val="22"/>
+          <w:szCs w:val="22"/>
+          <w:rtl/>
+        </w:rPr>
+        <w:t>nrOfConversations</w:t>
+      </w:r>
+      <w:proofErr w:type="spellEnd"/>
+      <w:r>
+        <w:rPr>
+          <w:rFonts w:ascii="Arial" w:hAnsi="Arial" w:cs="Arial"/>
+          <w:sz w:val="22"/>
+          <w:szCs w:val="22"/>
+          <w:rtl/>
+        </w:rPr>
+        <w:t xml:space="preserve">) </w:t>
+      </w:r>
+      <w:proofErr w:type="spellStart"/>
+      <w:r>
+        <w:rPr>
+          <w:rFonts w:ascii="Arial" w:hAnsi="Arial" w:cs="Arial"/>
+          <w:sz w:val="22"/>
+          <w:szCs w:val="22"/>
+          <w:rtl/>
+        </w:rPr>
+        <w:t>וכדומה.עבודה</w:t>
+      </w:r>
+      <w:proofErr w:type="spellEnd"/>
+      <w:r>
+        <w:rPr>
+          <w:rFonts w:ascii="Arial" w:hAnsi="Arial" w:cs="Arial"/>
+          <w:sz w:val="22"/>
+          <w:szCs w:val="22"/>
+          <w:rtl/>
+        </w:rPr>
+        <w:t xml:space="preserve"> זו תבחן האם </w:t>
+      </w:r>
+      <w:r>
+        <w:rPr>
+          <w:rFonts w:ascii="Arial" w:hAnsi="Arial" w:cs="Arial"/>
+          <w:sz w:val="22"/>
+          <w:szCs w:val="22"/>
+          <w:rtl/>
+        </w:rPr>
+        <w:t xml:space="preserve">מספר פעמי </w:t>
+      </w:r>
+      <w:proofErr w:type="spellStart"/>
+      <w:r>
+        <w:rPr>
+          <w:rFonts w:ascii="Arial" w:hAnsi="Arial" w:cs="Arial"/>
+          <w:sz w:val="22"/>
+          <w:szCs w:val="22"/>
+          <w:rtl/>
+        </w:rPr>
+        <w:t>ה</w:t>
       </w:r>
       <w:r>
         <w:rPr>
@@ -194,6 +315,7 @@
         </w:rPr>
         <w:t>גוסטינג</w:t>
       </w:r>
+      <w:proofErr w:type="spellEnd"/>
       <w:r>
         <w:rPr>
           <w:rFonts w:ascii="Arial" w:hAnsi="Arial" w:cs="Arial"/>
@@ -247,6 +369,7 @@
         </w:rPr>
         <w:t>(</w:t>
       </w:r>
+      <w:proofErr w:type="spellStart"/>
       <w:r>
         <w:rPr>
           <w:rFonts w:ascii="Arial" w:hAnsi="Arial" w:cs="Arial"/>
@@ -255,6 +378,7 @@
         </w:rPr>
         <w:t>nrOfGhostingsAfterInitialMessage</w:t>
       </w:r>
+      <w:proofErr w:type="spellEnd"/>
       <w:r>
         <w:rPr>
           <w:rFonts w:ascii="Arial" w:hAnsi="Arial" w:cs="Arial"/>
@@ -346,8 +470,18 @@
           <w:sz w:val="22"/>
           <w:szCs w:val="22"/>
         </w:rPr>
-        <w:t xml:space="preserve"> sum_app_opens</w:t>
-      </w:r>
+        <w:t xml:space="preserve"> </w:t>
+      </w:r>
+      <w:proofErr w:type="spellStart"/>
+      <w:r>
+        <w:rPr>
+          <w:rFonts w:ascii="Arial" w:hAnsi="Arial" w:cs="Arial"/>
+          <w:sz w:val="22"/>
+          <w:szCs w:val="22"/>
+        </w:rPr>
+        <w:t>sum_app_opens</w:t>
+      </w:r>
+      <w:proofErr w:type="spellEnd"/>
       <w:r>
         <w:rPr>
           <w:rFonts w:ascii="Arial" w:hAnsi="Arial" w:cs="Arial"/>
@@ -374,6 +508,7 @@
         </w:rPr>
         <w:t>׳</w:t>
       </w:r>
+      <w:proofErr w:type="spellStart"/>
       <w:r>
         <w:rPr>
           <w:rFonts w:ascii="Arial" w:hAnsi="Arial" w:cs="Arial"/>
@@ -382,6 +517,7 @@
         </w:rPr>
         <w:t>swipe_likes</w:t>
       </w:r>
+      <w:proofErr w:type="spellEnd"/>
       <w:r>
         <w:rPr>
           <w:rFonts w:ascii="Arial" w:hAnsi="Arial" w:cs="Arial"/>
@@ -408,6 +544,7 @@
         </w:rPr>
         <w:t>, ׳</w:t>
       </w:r>
+      <w:proofErr w:type="spellStart"/>
       <w:r>
         <w:rPr>
           <w:rFonts w:ascii="Arial" w:hAnsi="Arial" w:cs="Arial"/>
@@ -416,6 +553,7 @@
         </w:rPr>
         <w:t>swipe_passes</w:t>
       </w:r>
+      <w:proofErr w:type="spellEnd"/>
       <w:r>
         <w:rPr>
           <w:rFonts w:ascii="Arial" w:hAnsi="Arial" w:cs="Arial"/>
@@ -515,8 +653,18 @@
           <w:sz w:val="22"/>
           <w:szCs w:val="22"/>
         </w:rPr>
-        <w:t xml:space="preserve"> medianConversationLength</w:t>
-      </w:r>
+        <w:t xml:space="preserve"> </w:t>
+      </w:r>
+      <w:proofErr w:type="spellStart"/>
+      <w:r>
+        <w:rPr>
+          <w:rFonts w:ascii="Arial" w:hAnsi="Arial" w:cs="Arial"/>
+          <w:sz w:val="22"/>
+          <w:szCs w:val="22"/>
+        </w:rPr>
+        <w:t>medianConversationLength</w:t>
+      </w:r>
+      <w:proofErr w:type="spellEnd"/>
       <w:r>
         <w:rPr>
           <w:rFonts w:ascii="Arial" w:hAnsi="Arial" w:cs="Arial"/>
@@ -533,8 +681,29 @@
           <w:szCs w:val="22"/>
           <w:rtl/>
         </w:rPr>
-        <w:t xml:space="preserve">  בנוסף על כך, יצרנו את משתנה בינארי אשר מעיד האם המשתמש הוא הטראוסקסואלי או לא, בשם </w:t>
-      </w:r>
+        <w:t xml:space="preserve">  בנוסף על כך, יצרנו את משתנה בינארי אשר מעיד האם המשתמש הוא </w:t>
+      </w:r>
+      <w:proofErr w:type="spellStart"/>
+      <w:r>
+        <w:rPr>
+          <w:rFonts w:ascii="Arial" w:hAnsi="Arial" w:cs="Arial"/>
+          <w:sz w:val="22"/>
+          <w:szCs w:val="22"/>
+          <w:rtl/>
+        </w:rPr>
+        <w:t>הטראוסקסואלי</w:t>
+      </w:r>
+      <w:proofErr w:type="spellEnd"/>
+      <w:r>
+        <w:rPr>
+          <w:rFonts w:ascii="Arial" w:hAnsi="Arial" w:cs="Arial"/>
+          <w:sz w:val="22"/>
+          <w:szCs w:val="22"/>
+          <w:rtl/>
+        </w:rPr>
+        <w:t xml:space="preserve"> או לא, בשם </w:t>
+      </w:r>
+      <w:proofErr w:type="spellStart"/>
       <w:r>
         <w:rPr>
           <w:rFonts w:ascii="Arial" w:hAnsi="Arial" w:cs="Arial"/>
@@ -543,6 +712,7 @@
         </w:rPr>
         <w:t>hetero_sx</w:t>
       </w:r>
+      <w:proofErr w:type="spellEnd"/>
       <w:r>
         <w:rPr>
           <w:rFonts w:ascii="Arial" w:hAnsi="Arial" w:cs="Arial"/>
@@ -552,6 +722,7 @@
         </w:rPr>
         <w:t xml:space="preserve">, והסרנו את המשתנה </w:t>
       </w:r>
+      <w:proofErr w:type="spellStart"/>
       <w:r>
         <w:rPr>
           <w:rFonts w:ascii="Arial" w:hAnsi="Arial" w:cs="Arial"/>
@@ -560,6 +731,7 @@
         </w:rPr>
         <w:t>interestedIn</w:t>
       </w:r>
+      <w:proofErr w:type="spellEnd"/>
       <w:r>
         <w:rPr>
           <w:rFonts w:ascii="Arial" w:hAnsi="Arial" w:cs="Arial"/>
@@ -625,7 +797,25 @@
           <w:sz w:val="22"/>
           <w:szCs w:val="22"/>
         </w:rPr>
-        <w:t>'ageFilterMax'</w:t>
+        <w:t>'</w:t>
+      </w:r>
+      <w:proofErr w:type="spellStart"/>
+      <w:r>
+        <w:rPr>
+          <w:rFonts w:ascii="Arial" w:hAnsi="Arial" w:cs="Arial"/>
+          <w:sz w:val="22"/>
+          <w:szCs w:val="22"/>
+        </w:rPr>
+        <w:t>ageFilterMax</w:t>
+      </w:r>
+      <w:proofErr w:type="spellEnd"/>
+      <w:r>
+        <w:rPr>
+          <w:rFonts w:ascii="Arial" w:hAnsi="Arial" w:cs="Arial"/>
+          <w:sz w:val="22"/>
+          <w:szCs w:val="22"/>
+        </w:rPr>
+        <w:t>'</w:t>
       </w:r>
       <w:r>
         <w:rPr>
@@ -679,7 +869,25 @@
           <w:sz w:val="22"/>
           <w:szCs w:val="22"/>
         </w:rPr>
-        <w:t xml:space="preserve"> nrOfGhostingsAfterInitialMessage </w:t>
+        <w:t xml:space="preserve"> </w:t>
+      </w:r>
+      <w:proofErr w:type="spellStart"/>
+      <w:r>
+        <w:rPr>
+          <w:rFonts w:ascii="Arial" w:hAnsi="Arial" w:cs="Arial"/>
+          <w:sz w:val="22"/>
+          <w:szCs w:val="22"/>
+        </w:rPr>
+        <w:t>nrOfGhostingsAfterInitialMessage</w:t>
+      </w:r>
+      <w:proofErr w:type="spellEnd"/>
+      <w:r>
+        <w:rPr>
+          <w:rFonts w:ascii="Arial" w:hAnsi="Arial" w:cs="Arial"/>
+          <w:sz w:val="22"/>
+          <w:szCs w:val="22"/>
+        </w:rPr>
+        <w:t xml:space="preserve"> </w:t>
       </w:r>
       <w:r>
         <w:rPr>
@@ -977,6 +1185,7 @@
         </w:rPr>
         <w:t xml:space="preserve"> בין ה-</w:t>
       </w:r>
+      <w:proofErr w:type="spellStart"/>
       <w:r>
         <w:rPr>
           <w:rStyle w:val="CommentTok"/>
@@ -987,6 +1196,7 @@
         </w:rPr>
         <w:t>jobTitle</w:t>
       </w:r>
+      <w:proofErr w:type="spellEnd"/>
       <w:r>
         <w:rPr>
           <w:rStyle w:val="CommentTok"/>
@@ -1058,7 +1268,19 @@
           <w:shd w:val="clear" w:color="auto" w:fill="auto"/>
           <w:rtl/>
         </w:rPr>
-        <w:t>לציון כי ההחלטה זו הקטינה לנו משמעותית את גודל סט הנתונים שלנו (ל-576 משתמשים שדה זה היה ריק) והותירה אותנו עם 335 בלבד. נדון בהיבט זה בסוף העבודה לאחר ש</w:t>
+        <w:t xml:space="preserve">לציון כי ההחלטה זו הקטינה לנו משמעותית את גודל סט הנתונים שלנו (ל-576 משתמשים שדה זה היה ריק) והותירה אותנו עם 335 בלבד. נדון בהיבט זה בסוף העבודה לאחר </w:t>
+      </w:r>
+      <w:proofErr w:type="spellStart"/>
+      <w:r>
+        <w:rPr>
+          <w:rStyle w:val="CommentTok"/>
+          <w:rFonts w:ascii="Arial" w:hAnsi="Arial" w:cs="Arial"/>
+          <w:color w:val="auto"/>
+          <w:szCs w:val="22"/>
+          <w:shd w:val="clear" w:color="auto" w:fill="auto"/>
+          <w:rtl/>
+        </w:rPr>
+        <w:t>ש</w:t>
       </w:r>
       <w:r>
         <w:rPr>
@@ -1080,7 +1302,19 @@
           <w:shd w:val="clear" w:color="auto" w:fill="auto"/>
           <w:rtl/>
         </w:rPr>
-        <w:t xml:space="preserve">אמוד את מידת התרומה של משתנה זה לניבוי. </w:t>
+        <w:t>אמוד</w:t>
+      </w:r>
+      <w:proofErr w:type="spellEnd"/>
+      <w:r>
+        <w:rPr>
+          <w:rStyle w:val="CommentTok"/>
+          <w:rFonts w:ascii="Arial" w:hAnsi="Arial" w:cs="Arial"/>
+          <w:color w:val="auto"/>
+          <w:szCs w:val="22"/>
+          <w:shd w:val="clear" w:color="auto" w:fill="auto"/>
+          <w:rtl/>
+        </w:rPr>
+        <w:t xml:space="preserve"> את מידת התרומה של משתנה זה לניבוי. </w:t>
       </w:r>
       <w:r>
         <w:rPr>
@@ -1118,6 +1352,7 @@
         </w:rPr>
         <w:t xml:space="preserve">תחת ההנחה כי משתמשים שערכם במשתנה </w:t>
       </w:r>
+      <w:proofErr w:type="spellStart"/>
       <w:r>
         <w:rPr>
           <w:rStyle w:val="CommentTok"/>
@@ -1128,6 +1363,7 @@
         </w:rPr>
         <w:t>jobTitle</w:t>
       </w:r>
+      <w:proofErr w:type="spellEnd"/>
       <w:r>
         <w:rPr>
           <w:rStyle w:val="CommentTok"/>
@@ -1256,6 +1492,7 @@
         </w:rPr>
         <w:t xml:space="preserve">. המודל שבחרנו הוא מסוג </w:t>
       </w:r>
+      <w:proofErr w:type="spellStart"/>
       <w:r>
         <w:rPr>
           <w:rStyle w:val="NormalTok"/>
@@ -1264,6 +1501,7 @@
         </w:rPr>
         <w:t>GloVe</w:t>
       </w:r>
+      <w:proofErr w:type="spellEnd"/>
       <w:r>
         <w:rPr>
           <w:rStyle w:val="CommentTok"/>
@@ -1374,8 +1612,18 @@
           <w:rFonts w:ascii="Arial" w:hAnsi="Arial" w:cs="Arial"/>
           <w:szCs w:val="22"/>
         </w:rPr>
-        <w:t xml:space="preserve"> GloVe</w:t>
-      </w:r>
+        <w:t xml:space="preserve"> </w:t>
+      </w:r>
+      <w:proofErr w:type="spellStart"/>
+      <w:r>
+        <w:rPr>
+          <w:rStyle w:val="NormalTok"/>
+          <w:rFonts w:ascii="Arial" w:hAnsi="Arial" w:cs="Arial"/>
+          <w:szCs w:val="22"/>
+        </w:rPr>
+        <w:t>GloVe</w:t>
+      </w:r>
+      <w:proofErr w:type="spellEnd"/>
       <w:r>
         <w:rPr>
           <w:rStyle w:val="CommentTok"/>
@@ -1393,7 +1641,61 @@
           <w:rFonts w:ascii="Arial" w:hAnsi="Arial" w:cs="Arial"/>
           <w:szCs w:val="22"/>
         </w:rPr>
-        <w:t>"programmerare", "salesperon" "rechtsreferendar".</w:t>
+        <w:t>"</w:t>
+      </w:r>
+      <w:proofErr w:type="spellStart"/>
+      <w:r>
+        <w:rPr>
+          <w:rStyle w:val="CommentTok"/>
+          <w:rFonts w:ascii="Arial" w:hAnsi="Arial" w:cs="Arial"/>
+          <w:szCs w:val="22"/>
+        </w:rPr>
+        <w:t>programmerare</w:t>
+      </w:r>
+      <w:proofErr w:type="spellEnd"/>
+      <w:r>
+        <w:rPr>
+          <w:rStyle w:val="CommentTok"/>
+          <w:rFonts w:ascii="Arial" w:hAnsi="Arial" w:cs="Arial"/>
+          <w:szCs w:val="22"/>
+        </w:rPr>
+        <w:t>", "</w:t>
+      </w:r>
+      <w:proofErr w:type="spellStart"/>
+      <w:r>
+        <w:rPr>
+          <w:rStyle w:val="CommentTok"/>
+          <w:rFonts w:ascii="Arial" w:hAnsi="Arial" w:cs="Arial"/>
+          <w:szCs w:val="22"/>
+        </w:rPr>
+        <w:t>salesperon</w:t>
+      </w:r>
+      <w:proofErr w:type="spellEnd"/>
+      <w:r>
+        <w:rPr>
+          <w:rStyle w:val="CommentTok"/>
+          <w:rFonts w:ascii="Arial" w:hAnsi="Arial" w:cs="Arial"/>
+          <w:szCs w:val="22"/>
+        </w:rPr>
+        <w:t>" "</w:t>
+      </w:r>
+      <w:proofErr w:type="spellStart"/>
+      <w:r>
+        <w:rPr>
+          <w:rStyle w:val="CommentTok"/>
+          <w:rFonts w:ascii="Arial" w:hAnsi="Arial" w:cs="Arial"/>
+          <w:szCs w:val="22"/>
+        </w:rPr>
+        <w:t>rechtsreferendar</w:t>
+      </w:r>
+      <w:proofErr w:type="spellEnd"/>
+      <w:r>
+        <w:rPr>
+          <w:rStyle w:val="CommentTok"/>
+          <w:rFonts w:ascii="Arial" w:hAnsi="Arial" w:cs="Arial"/>
+          <w:szCs w:val="22"/>
+        </w:rPr>
+        <w:t>".</w:t>
       </w:r>
       <w:r>
         <w:rPr>
@@ -2065,7 +2367,31 @@
           <w:shd w:val="clear" w:color="auto" w:fill="auto"/>
           <w:rtl/>
         </w:rPr>
-        <w:t xml:space="preserve"> אנו נאמוד את שלושת המודלים בעזרת </w:t>
+        <w:t xml:space="preserve"> אנו </w:t>
+      </w:r>
+      <w:proofErr w:type="spellStart"/>
+      <w:r>
+        <w:rPr>
+          <w:rStyle w:val="CommentTok"/>
+          <w:rFonts w:ascii="Arial" w:hAnsi="Arial" w:cs="Arial" w:hint="cs"/>
+          <w:color w:val="auto"/>
+          <w:szCs w:val="22"/>
+          <w:shd w:val="clear" w:color="auto" w:fill="auto"/>
+          <w:rtl/>
+        </w:rPr>
+        <w:t>נאמוד</w:t>
+      </w:r>
+      <w:proofErr w:type="spellEnd"/>
+      <w:r>
+        <w:rPr>
+          <w:rStyle w:val="CommentTok"/>
+          <w:rFonts w:ascii="Arial" w:hAnsi="Arial" w:cs="Arial" w:hint="cs"/>
+          <w:color w:val="auto"/>
+          <w:szCs w:val="22"/>
+          <w:shd w:val="clear" w:color="auto" w:fill="auto"/>
+          <w:rtl/>
+        </w:rPr>
+        <w:t xml:space="preserve"> את שלושת המודלים בעזרת </w:t>
       </w:r>
       <w:r>
         <w:rPr>
@@ -2172,7 +2498,31 @@
           <w:shd w:val="clear" w:color="auto" w:fill="auto"/>
           <w:rtl/>
         </w:rPr>
-        <w:t xml:space="preserve">המתכון ישאר קבוע עבור כלל המודלים בהם הורדנו משתנים שלא מעניינים אותנו </w:t>
+        <w:t xml:space="preserve">המתכון </w:t>
+      </w:r>
+      <w:proofErr w:type="spellStart"/>
+      <w:r>
+        <w:rPr>
+          <w:rStyle w:val="CommentTok"/>
+          <w:rFonts w:ascii="Arial" w:hAnsi="Arial" w:cs="Arial" w:hint="cs"/>
+          <w:color w:val="auto"/>
+          <w:szCs w:val="22"/>
+          <w:shd w:val="clear" w:color="auto" w:fill="auto"/>
+          <w:rtl/>
+        </w:rPr>
+        <w:t>ישאר</w:t>
+      </w:r>
+      <w:proofErr w:type="spellEnd"/>
+      <w:r>
+        <w:rPr>
+          <w:rStyle w:val="CommentTok"/>
+          <w:rFonts w:ascii="Arial" w:hAnsi="Arial" w:cs="Arial" w:hint="cs"/>
+          <w:color w:val="auto"/>
+          <w:szCs w:val="22"/>
+          <w:shd w:val="clear" w:color="auto" w:fill="auto"/>
+          <w:rtl/>
+        </w:rPr>
+        <w:t xml:space="preserve"> קבוע עבור כלל המודלים בהם הורדנו משתנים שלא מעניינים אותנו </w:t>
       </w:r>
       <w:r>
         <w:rPr>
@@ -2191,46 +2541,66 @@
         </w:rPr>
         <w:t xml:space="preserve"> </w:t>
       </w:r>
+      <w:proofErr w:type="spellStart"/>
       <w:r>
         <w:rPr>
           <w:rStyle w:val="NormalTok"/>
           <w:rFonts w:ascii="Arial" w:hAnsi="Arial" w:cs="Arial"/>
           <w:szCs w:val="22"/>
         </w:rPr>
-        <w:t>cityName,</w:t>
-      </w:r>
-      <w:r>
-        <w:rPr>
-          <w:rFonts w:ascii="Arial" w:hAnsi="Arial" w:cs="Arial" w:hint="cs"/>
-          <w:sz w:val="22"/>
-          <w:szCs w:val="22"/>
-          <w:rtl/>
-        </w:rPr>
-        <w:t xml:space="preserve"> </w:t>
-      </w:r>
+        <w:t>cityName</w:t>
+      </w:r>
+      <w:proofErr w:type="spellEnd"/>
       <w:r>
         <w:rPr>
           <w:rStyle w:val="NormalTok"/>
           <w:rFonts w:ascii="Arial" w:hAnsi="Arial" w:cs="Arial"/>
           <w:szCs w:val="22"/>
         </w:rPr>
-        <w:t>createDate,</w:t>
-      </w:r>
-      <w:r>
-        <w:rPr>
-          <w:rFonts w:ascii="Arial" w:hAnsi="Arial" w:cs="Arial" w:hint="cs"/>
-          <w:sz w:val="22"/>
-          <w:szCs w:val="22"/>
-          <w:rtl/>
-        </w:rPr>
-        <w:t xml:space="preserve"> </w:t>
-      </w:r>
+        <w:t>,</w:t>
+      </w:r>
+      <w:r>
+        <w:rPr>
+          <w:rFonts w:ascii="Arial" w:hAnsi="Arial" w:cs="Arial" w:hint="cs"/>
+          <w:sz w:val="22"/>
+          <w:szCs w:val="22"/>
+          <w:rtl/>
+        </w:rPr>
+        <w:t xml:space="preserve"> </w:t>
+      </w:r>
+      <w:proofErr w:type="spellStart"/>
       <w:r>
         <w:rPr>
           <w:rStyle w:val="NormalTok"/>
           <w:rFonts w:ascii="Arial" w:hAnsi="Arial" w:cs="Arial"/>
           <w:szCs w:val="22"/>
         </w:rPr>
+        <w:t>createDate</w:t>
+      </w:r>
+      <w:proofErr w:type="spellEnd"/>
+      <w:r>
+        <w:rPr>
+          <w:rStyle w:val="NormalTok"/>
+          <w:rFonts w:ascii="Arial" w:hAnsi="Arial" w:cs="Arial"/>
+          <w:szCs w:val="22"/>
+        </w:rPr>
+        <w:t>,</w:t>
+      </w:r>
+      <w:r>
+        <w:rPr>
+          <w:rFonts w:ascii="Arial" w:hAnsi="Arial" w:cs="Arial" w:hint="cs"/>
+          <w:sz w:val="22"/>
+          <w:szCs w:val="22"/>
+          <w:rtl/>
+        </w:rPr>
+        <w:t xml:space="preserve"> </w:t>
+      </w:r>
+      <w:r>
+        <w:rPr>
+          <w:rStyle w:val="NormalTok"/>
+          <w:rFonts w:ascii="Arial" w:hAnsi="Arial" w:cs="Arial"/>
+          <w:szCs w:val="22"/>
+        </w:rPr>
         <w:t>education,</w:t>
       </w:r>
       <w:r>
@@ -2242,46 +2612,66 @@
         </w:rPr>
         <w:t xml:space="preserve"> </w:t>
       </w:r>
+      <w:proofErr w:type="spellStart"/>
       <w:r>
         <w:rPr>
           <w:rStyle w:val="NormalTok"/>
           <w:rFonts w:ascii="Arial" w:hAnsi="Arial" w:cs="Arial"/>
           <w:szCs w:val="22"/>
         </w:rPr>
-        <w:t>jobTitle,</w:t>
-      </w:r>
-      <w:r>
-        <w:rPr>
-          <w:rFonts w:ascii="Arial" w:hAnsi="Arial" w:cs="Arial" w:hint="cs"/>
-          <w:sz w:val="22"/>
-          <w:szCs w:val="22"/>
-          <w:rtl/>
-        </w:rPr>
-        <w:t xml:space="preserve"> </w:t>
-      </w:r>
+        <w:t>jobTitle</w:t>
+      </w:r>
+      <w:proofErr w:type="spellEnd"/>
       <w:r>
         <w:rPr>
           <w:rStyle w:val="NormalTok"/>
           <w:rFonts w:ascii="Arial" w:hAnsi="Arial" w:cs="Arial"/>
           <w:szCs w:val="22"/>
         </w:rPr>
-        <w:t>X_id,</w:t>
-      </w:r>
-      <w:r>
-        <w:rPr>
-          <w:rFonts w:ascii="Arial" w:hAnsi="Arial" w:cs="Arial" w:hint="cs"/>
-          <w:sz w:val="22"/>
-          <w:szCs w:val="22"/>
-          <w:rtl/>
-        </w:rPr>
-        <w:t xml:space="preserve"> </w:t>
-      </w:r>
+        <w:t>,</w:t>
+      </w:r>
+      <w:r>
+        <w:rPr>
+          <w:rFonts w:ascii="Arial" w:hAnsi="Arial" w:cs="Arial" w:hint="cs"/>
+          <w:sz w:val="22"/>
+          <w:szCs w:val="22"/>
+          <w:rtl/>
+        </w:rPr>
+        <w:t xml:space="preserve"> </w:t>
+      </w:r>
+      <w:proofErr w:type="spellStart"/>
       <w:r>
         <w:rPr>
           <w:rStyle w:val="NormalTok"/>
           <w:rFonts w:ascii="Arial" w:hAnsi="Arial" w:cs="Arial"/>
           <w:szCs w:val="22"/>
         </w:rPr>
+        <w:t>X_id</w:t>
+      </w:r>
+      <w:proofErr w:type="spellEnd"/>
+      <w:r>
+        <w:rPr>
+          <w:rStyle w:val="NormalTok"/>
+          <w:rFonts w:ascii="Arial" w:hAnsi="Arial" w:cs="Arial"/>
+          <w:szCs w:val="22"/>
+        </w:rPr>
+        <w:t>,</w:t>
+      </w:r>
+      <w:r>
+        <w:rPr>
+          <w:rFonts w:ascii="Arial" w:hAnsi="Arial" w:cs="Arial" w:hint="cs"/>
+          <w:sz w:val="22"/>
+          <w:szCs w:val="22"/>
+          <w:rtl/>
+        </w:rPr>
+        <w:t xml:space="preserve"> </w:t>
+      </w:r>
+      <w:r>
+        <w:rPr>
+          <w:rStyle w:val="NormalTok"/>
+          <w:rFonts w:ascii="Arial" w:hAnsi="Arial" w:cs="Arial"/>
+          <w:szCs w:val="22"/>
+        </w:rPr>
         <w:t>birthdate</w:t>
       </w:r>
       <w:r>
@@ -2323,6 +2713,7 @@
         </w:rPr>
         <w:t xml:space="preserve"> </w:t>
       </w:r>
+      <w:proofErr w:type="spellStart"/>
       <w:r>
         <w:rPr>
           <w:rStyle w:val="NormalTok"/>
@@ -2331,6 +2722,7 @@
         </w:rPr>
         <w:t>jobTitle</w:t>
       </w:r>
+      <w:proofErr w:type="spellEnd"/>
       <w:r>
         <w:rPr>
           <w:rStyle w:val="NormalTok"/>
@@ -2395,8 +2787,21 @@
           <w:shd w:val="clear" w:color="auto" w:fill="auto"/>
           <w:rtl/>
         </w:rPr>
-        <w:t>בנוסף על כך יצרנו משתני דמה עבור המשתנים הקטגוריאלים</w:t>
-      </w:r>
+        <w:t xml:space="preserve">בנוסף על כך יצרנו משתני דמה עבור המשתנים </w:t>
+      </w:r>
+      <w:proofErr w:type="spellStart"/>
+      <w:r>
+        <w:rPr>
+          <w:rStyle w:val="CommentTok"/>
+          <w:rFonts w:ascii="Arial" w:hAnsi="Arial" w:cs="Arial" w:hint="cs"/>
+          <w:color w:val="auto"/>
+          <w:szCs w:val="22"/>
+          <w:shd w:val="clear" w:color="auto" w:fill="auto"/>
+          <w:rtl/>
+        </w:rPr>
+        <w:t>הקטגוריאלים</w:t>
+      </w:r>
+      <w:proofErr w:type="spellEnd"/>
       <w:r>
         <w:rPr>
           <w:rStyle w:val="CommentTok"/>
@@ -2408,29 +2813,39 @@
         </w:rPr>
         <w:t xml:space="preserve"> : </w:t>
       </w:r>
+      <w:proofErr w:type="spellStart"/>
       <w:r>
         <w:rPr>
           <w:rStyle w:val="NormalTok"/>
           <w:rFonts w:ascii="Arial" w:hAnsi="Arial" w:cs="Arial"/>
           <w:szCs w:val="22"/>
         </w:rPr>
-        <w:t>spotify,</w:t>
-      </w:r>
-      <w:r>
-        <w:rPr>
-          <w:rFonts w:ascii="Arial" w:hAnsi="Arial" w:cs="Arial" w:hint="cs"/>
-          <w:sz w:val="22"/>
-          <w:szCs w:val="22"/>
-          <w:rtl/>
-        </w:rPr>
-        <w:t xml:space="preserve"> </w:t>
-      </w:r>
+        <w:t>spotify</w:t>
+      </w:r>
+      <w:proofErr w:type="spellEnd"/>
       <w:r>
         <w:rPr>
           <w:rStyle w:val="NormalTok"/>
           <w:rFonts w:ascii="Arial" w:hAnsi="Arial" w:cs="Arial"/>
           <w:szCs w:val="22"/>
         </w:rPr>
+        <w:t>,</w:t>
+      </w:r>
+      <w:r>
+        <w:rPr>
+          <w:rFonts w:ascii="Arial" w:hAnsi="Arial" w:cs="Arial" w:hint="cs"/>
+          <w:sz w:val="22"/>
+          <w:szCs w:val="22"/>
+          <w:rtl/>
+        </w:rPr>
+        <w:t xml:space="preserve"> </w:t>
+      </w:r>
+      <w:r>
+        <w:rPr>
+          <w:rStyle w:val="NormalTok"/>
+          <w:rFonts w:ascii="Arial" w:hAnsi="Arial" w:cs="Arial"/>
+          <w:szCs w:val="22"/>
+        </w:rPr>
         <w:t>gender,</w:t>
       </w:r>
       <w:r>
@@ -2442,31 +2857,43 @@
         </w:rPr>
         <w:t xml:space="preserve"> </w:t>
       </w:r>
+      <w:proofErr w:type="spellStart"/>
       <w:r>
         <w:rPr>
           <w:rStyle w:val="NormalTok"/>
           <w:rFonts w:ascii="Arial" w:hAnsi="Arial" w:cs="Arial"/>
           <w:szCs w:val="22"/>
         </w:rPr>
-        <w:t>instagram,</w:t>
-      </w:r>
-      <w:r>
-        <w:rPr>
-          <w:rFonts w:ascii="Arial" w:hAnsi="Arial" w:cs="Arial" w:hint="cs"/>
-          <w:sz w:val="22"/>
-          <w:szCs w:val="22"/>
-          <w:rtl/>
-        </w:rPr>
-        <w:t xml:space="preserve"> </w:t>
-      </w:r>
+        <w:t>instagram</w:t>
+      </w:r>
+      <w:proofErr w:type="spellEnd"/>
       <w:r>
         <w:rPr>
           <w:rStyle w:val="NormalTok"/>
           <w:rFonts w:ascii="Arial" w:hAnsi="Arial" w:cs="Arial"/>
           <w:szCs w:val="22"/>
         </w:rPr>
+        <w:t>,</w:t>
+      </w:r>
+      <w:r>
+        <w:rPr>
+          <w:rFonts w:ascii="Arial" w:hAnsi="Arial" w:cs="Arial" w:hint="cs"/>
+          <w:sz w:val="22"/>
+          <w:szCs w:val="22"/>
+          <w:rtl/>
+        </w:rPr>
+        <w:t xml:space="preserve"> </w:t>
+      </w:r>
+      <w:proofErr w:type="spellStart"/>
+      <w:r>
+        <w:rPr>
+          <w:rStyle w:val="NormalTok"/>
+          <w:rFonts w:ascii="Arial" w:hAnsi="Arial" w:cs="Arial"/>
+          <w:szCs w:val="22"/>
+        </w:rPr>
         <w:t>hetero_sx</w:t>
       </w:r>
+      <w:proofErr w:type="spellEnd"/>
       <w:r>
         <w:rPr>
           <w:rStyle w:val="NormalTok"/>
@@ -2621,6 +3048,7 @@
         </w:rPr>
         <w:t xml:space="preserve"> כי אנו מעוניינים לכוון את מספר המנבאים בכל עץ (</w:t>
       </w:r>
+      <w:proofErr w:type="spellStart"/>
       <w:r>
         <w:rPr>
           <w:rFonts w:ascii="Arial" w:hAnsi="Arial" w:cs="Arial"/>
@@ -2631,6 +3059,7 @@
         </w:rPr>
         <w:t>mtry</w:t>
       </w:r>
+      <w:proofErr w:type="spellEnd"/>
       <w:r>
         <w:rPr>
           <w:rFonts w:ascii="Arial" w:hAnsi="Arial" w:cs="Arial" w:hint="cs"/>
@@ -2709,6 +3138,7 @@
         </w:rPr>
         <w:t xml:space="preserve">5 הממפה את ערכי </w:t>
       </w:r>
+      <w:proofErr w:type="spellStart"/>
       <w:r>
         <w:rPr>
           <w:rFonts w:ascii="Arial" w:hAnsi="Arial" w:cs="Arial"/>
@@ -2719,6 +3149,7 @@
         </w:rPr>
         <w:t>mtry</w:t>
       </w:r>
+      <w:proofErr w:type="spellEnd"/>
       <w:r>
         <w:rPr>
           <w:rFonts w:ascii="Arial" w:hAnsi="Arial" w:cs="Arial" w:hint="cs"/>
@@ -2842,8 +3273,20 @@
           <w:szCs w:val="22"/>
           <w:shd w:val="clear" w:color="auto" w:fill="F1F3F5"/>
         </w:rPr>
-        <w:t xml:space="preserve"> mtry</w:t>
-      </w:r>
+        <w:t xml:space="preserve"> </w:t>
+      </w:r>
+      <w:proofErr w:type="spellStart"/>
+      <w:r>
+        <w:rPr>
+          <w:rFonts w:ascii="Arial" w:hAnsi="Arial" w:cs="Arial"/>
+          <w:color w:val="657422"/>
+          <w:sz w:val="22"/>
+          <w:szCs w:val="22"/>
+          <w:shd w:val="clear" w:color="auto" w:fill="F1F3F5"/>
+        </w:rPr>
+        <w:t>mtry</w:t>
+      </w:r>
+      <w:proofErr w:type="spellEnd"/>
       <w:r>
         <w:rPr>
           <w:rFonts w:ascii="Arial" w:hAnsi="Arial" w:cs="Arial"/>
@@ -2923,6 +3366,7 @@
         </w:rPr>
         <w:t xml:space="preserve"> </w:t>
       </w:r>
+      <w:proofErr w:type="spellStart"/>
       <w:r>
         <w:rPr>
           <w:rFonts w:ascii="Arial" w:hAnsi="Arial" w:cs="Arial"/>
@@ -2931,6 +3375,7 @@
         </w:rPr>
         <w:t>mtry</w:t>
       </w:r>
+      <w:proofErr w:type="spellEnd"/>
       <w:r>
         <w:rPr>
           <w:rFonts w:ascii="Arial" w:hAnsi="Arial" w:cs="Arial"/>
@@ -3587,6 +4032,7 @@
         </w:rPr>
         <w:t xml:space="preserve">השתמשנו בשיטת </w:t>
       </w:r>
+      <w:proofErr w:type="spellStart"/>
       <w:r>
         <w:rPr>
           <w:rStyle w:val="FunctionTok"/>
@@ -3595,6 +4041,7 @@
         </w:rPr>
         <w:t>select_by_one_std_err</w:t>
       </w:r>
+      <w:proofErr w:type="spellEnd"/>
       <w:r>
         <w:rPr>
           <w:rStyle w:val="FunctionTok"/>
@@ -3613,6 +4060,7 @@
         </w:rPr>
         <w:t xml:space="preserve">על סמך ערכו של </w:t>
       </w:r>
+      <w:proofErr w:type="spellStart"/>
       <w:r>
         <w:rPr>
           <w:rFonts w:ascii="Arial" w:hAnsi="Arial" w:cs="Arial"/>
@@ -3621,6 +4069,7 @@
         </w:rPr>
         <w:t>rsq</w:t>
       </w:r>
+      <w:proofErr w:type="spellEnd"/>
       <w:r>
         <w:rPr>
           <w:rFonts w:ascii="Arial" w:hAnsi="Arial" w:cs="Arial" w:hint="cs"/>
@@ -3646,7 +4095,27 @@
           <w:szCs w:val="22"/>
           <w:rtl/>
         </w:rPr>
-        <w:t xml:space="preserve">מנת לקבוע את הערכי ההיפר פראמטר, עבור </w:t>
+        <w:t xml:space="preserve">מנת לקבוע את הערכי ההיפר </w:t>
+      </w:r>
+      <w:proofErr w:type="spellStart"/>
+      <w:r>
+        <w:rPr>
+          <w:rFonts w:ascii="Arial" w:hAnsi="Arial" w:cs="Arial" w:hint="cs"/>
+          <w:sz w:val="22"/>
+          <w:szCs w:val="22"/>
+          <w:rtl/>
+        </w:rPr>
+        <w:t>פראמטר</w:t>
+      </w:r>
+      <w:proofErr w:type="spellEnd"/>
+      <w:r>
+        <w:rPr>
+          <w:rFonts w:ascii="Arial" w:hAnsi="Arial" w:cs="Arial" w:hint="cs"/>
+          <w:sz w:val="22"/>
+          <w:szCs w:val="22"/>
+          <w:rtl/>
+        </w:rPr>
+        <w:t xml:space="preserve">, עבור </w:t>
       </w:r>
       <w:r>
         <w:rPr>
@@ -3682,8 +4151,20 @@
           <w:szCs w:val="22"/>
           <w:shd w:val="clear" w:color="auto" w:fill="F1F3F5"/>
         </w:rPr>
-        <w:t xml:space="preserve"> mtry</w:t>
-      </w:r>
+        <w:t xml:space="preserve"> </w:t>
+      </w:r>
+      <w:proofErr w:type="spellStart"/>
+      <w:r>
+        <w:rPr>
+          <w:rFonts w:ascii="Arial" w:hAnsi="Arial" w:cs="Arial"/>
+          <w:color w:val="657422"/>
+          <w:sz w:val="22"/>
+          <w:szCs w:val="22"/>
+          <w:shd w:val="clear" w:color="auto" w:fill="F1F3F5"/>
+        </w:rPr>
+        <w:t>mtry</w:t>
+      </w:r>
+      <w:proofErr w:type="spellEnd"/>
     </w:p>
     <w:p>
       <w:pPr>
@@ -3737,8 +4218,20 @@
           <w:szCs w:val="22"/>
           <w:shd w:val="clear" w:color="auto" w:fill="F1F3F5"/>
         </w:rPr>
-        <w:t xml:space="preserve"> mtry</w:t>
-      </w:r>
+        <w:t xml:space="preserve"> </w:t>
+      </w:r>
+      <w:proofErr w:type="spellStart"/>
+      <w:r>
+        <w:rPr>
+          <w:rFonts w:ascii="Arial" w:hAnsi="Arial" w:cs="Arial"/>
+          <w:color w:val="657422"/>
+          <w:sz w:val="22"/>
+          <w:szCs w:val="22"/>
+          <w:shd w:val="clear" w:color="auto" w:fill="F1F3F5"/>
+        </w:rPr>
+        <w:t>mtry</w:t>
+      </w:r>
+      <w:proofErr w:type="spellEnd"/>
       <w:r>
         <w:rPr>
           <w:rFonts w:ascii="Arial" w:hAnsi="Arial" w:cs="Arial"/>
@@ -3836,6 +4329,7 @@
         </w:rPr>
         <w:t xml:space="preserve">הביצועים של המודל על סט אימון הינו : </w:t>
       </w:r>
+      <w:proofErr w:type="spellStart"/>
       <w:r>
         <w:rPr>
           <w:rFonts w:ascii="Arial" w:hAnsi="Arial" w:cs="Arial"/>
@@ -3844,6 +4338,7 @@
         </w:rPr>
         <w:t>rsq</w:t>
       </w:r>
+      <w:proofErr w:type="spellEnd"/>
       <w:r>
         <w:rPr>
           <w:rFonts w:ascii="Arial" w:hAnsi="Arial" w:cs="Arial"/>
@@ -3894,6 +4389,7 @@
         </w:rPr>
         <w:t xml:space="preserve">התוצאה הגבוהה של </w:t>
       </w:r>
+      <w:proofErr w:type="spellStart"/>
       <w:r>
         <w:rPr>
           <w:rFonts w:ascii="Arial" w:hAnsi="Arial" w:cs="Arial"/>
@@ -3902,6 +4398,7 @@
         </w:rPr>
         <w:t>rsq</w:t>
       </w:r>
+      <w:proofErr w:type="spellEnd"/>
       <w:r>
         <w:rPr>
           <w:rFonts w:ascii="Arial" w:hAnsi="Arial" w:cs="Arial" w:hint="cs"/>
@@ -4070,6 +4567,7 @@
         </w:rPr>
         <w:t xml:space="preserve"> מסוג </w:t>
       </w:r>
+      <w:proofErr w:type="spellStart"/>
       <w:r>
         <w:rPr>
           <w:rStyle w:val="FunctionTok"/>
@@ -4078,6 +4576,7 @@
         </w:rPr>
         <w:t>boost_tree</w:t>
       </w:r>
+      <w:proofErr w:type="spellEnd"/>
       <w:r>
         <w:rPr>
           <w:rFonts w:ascii="Arial" w:hAnsi="Arial" w:cs="Arial" w:hint="cs"/>
@@ -4105,6 +4604,7 @@
         </w:rPr>
         <w:t xml:space="preserve"> אנו מעוניינים לכוון את עומק  (</w:t>
       </w:r>
+      <w:proofErr w:type="spellStart"/>
       <w:r>
         <w:rPr>
           <w:rStyle w:val="AttributeTok"/>
@@ -4129,6 +4629,7 @@
         </w:rPr>
         <w:t>depth</w:t>
       </w:r>
+      <w:proofErr w:type="spellEnd"/>
       <w:r>
         <w:rPr>
           <w:rFonts w:ascii="Arial" w:hAnsi="Arial" w:cs="Arial" w:hint="cs"/>
@@ -4190,6 +4691,7 @@
         </w:rPr>
         <w:t xml:space="preserve"> </w:t>
       </w:r>
+      <w:proofErr w:type="spellStart"/>
       <w:r>
         <w:rPr>
           <w:rStyle w:val="AttributeTok"/>
@@ -4198,6 +4700,7 @@
         </w:rPr>
         <w:t>sample_size</w:t>
       </w:r>
+      <w:proofErr w:type="spellEnd"/>
       <w:r>
         <w:rPr>
           <w:rFonts w:ascii="Arial" w:hAnsi="Arial" w:cs="Arial" w:hint="cs"/>
@@ -4223,8 +4726,29 @@
           <w:szCs w:val="22"/>
           <w:rtl/>
         </w:rPr>
-        <w:t xml:space="preserve"> את יתר ההיפר פרמאטרים על ברירת המחדל למעט </w:t>
-      </w:r>
+        <w:t xml:space="preserve"> את יתר ההיפר </w:t>
+      </w:r>
+      <w:proofErr w:type="spellStart"/>
+      <w:r>
+        <w:rPr>
+          <w:rFonts w:ascii="Arial" w:hAnsi="Arial" w:cs="Arial" w:hint="cs"/>
+          <w:sz w:val="22"/>
+          <w:szCs w:val="22"/>
+          <w:rtl/>
+        </w:rPr>
+        <w:t>פרמאטרים</w:t>
+      </w:r>
+      <w:proofErr w:type="spellEnd"/>
+      <w:r>
+        <w:rPr>
+          <w:rFonts w:ascii="Arial" w:hAnsi="Arial" w:cs="Arial" w:hint="cs"/>
+          <w:sz w:val="22"/>
+          <w:szCs w:val="22"/>
+          <w:rtl/>
+        </w:rPr>
+        <w:t xml:space="preserve"> על ברירת המחדל למעט </w:t>
+      </w:r>
+      <w:proofErr w:type="spellStart"/>
       <w:r>
         <w:rPr>
           <w:rFonts w:ascii="Arial" w:hAnsi="Arial" w:cs="Arial"/>
@@ -4233,6 +4757,7 @@
         </w:rPr>
         <w:t>mtry</w:t>
       </w:r>
+      <w:proofErr w:type="spellEnd"/>
       <w:r>
         <w:rPr>
           <w:rFonts w:ascii="Arial" w:hAnsi="Arial" w:cs="Arial" w:hint="cs"/>
@@ -4303,6 +4828,7 @@
         </w:rPr>
         <w:t xml:space="preserve">הממפה את ערכי </w:t>
       </w:r>
+      <w:proofErr w:type="spellStart"/>
       <w:r>
         <w:rPr>
           <w:rStyle w:val="AttributeTok"/>
@@ -4311,6 +4837,7 @@
         </w:rPr>
         <w:t>tree_depth</w:t>
       </w:r>
+      <w:proofErr w:type="spellEnd"/>
       <w:r>
         <w:rPr>
           <w:rFonts w:ascii="Arial" w:hAnsi="Arial" w:cs="Arial" w:hint="cs"/>
@@ -4372,6 +4899,7 @@
         </w:rPr>
         <w:t xml:space="preserve">  </w:t>
       </w:r>
+      <w:proofErr w:type="spellStart"/>
       <w:r>
         <w:rPr>
           <w:rStyle w:val="AttributeTok"/>
@@ -4380,6 +4908,7 @@
         </w:rPr>
         <w:t>sample_size</w:t>
       </w:r>
+      <w:proofErr w:type="spellEnd"/>
       <w:r>
         <w:rPr>
           <w:rFonts w:ascii="Arial" w:hAnsi="Arial" w:cs="Arial" w:hint="cs"/>
@@ -4529,6 +5058,7 @@
         </w:rPr>
         <w:t xml:space="preserve">נראה כי ללא ספק </w:t>
       </w:r>
+      <w:proofErr w:type="spellStart"/>
       <w:r>
         <w:rPr>
           <w:rStyle w:val="AttributeTok"/>
@@ -4553,6 +5083,7 @@
         </w:rPr>
         <w:t>depth</w:t>
       </w:r>
+      <w:proofErr w:type="spellEnd"/>
       <w:r>
         <w:rPr>
           <w:rStyle w:val="AttributeTok"/>
@@ -4587,6 +5118,7 @@
         </w:rPr>
         <w:t xml:space="preserve">כאשר השתמשנו בשיטת </w:t>
       </w:r>
+      <w:proofErr w:type="spellStart"/>
       <w:r>
         <w:rPr>
           <w:rStyle w:val="FunctionTok"/>
@@ -4595,6 +5127,7 @@
         </w:rPr>
         <w:t>select_by_one_std_err</w:t>
       </w:r>
+      <w:proofErr w:type="spellEnd"/>
       <w:r>
         <w:rPr>
           <w:rStyle w:val="FunctionTok"/>
@@ -4613,6 +5146,7 @@
         </w:rPr>
         <w:t xml:space="preserve">על סמך ערכו של </w:t>
       </w:r>
+      <w:proofErr w:type="spellStart"/>
       <w:r>
         <w:rPr>
           <w:rFonts w:ascii="Arial" w:hAnsi="Arial" w:cs="Arial"/>
@@ -4621,23 +5155,44 @@
         </w:rPr>
         <w:t>rsq</w:t>
       </w:r>
-      <w:r>
-        <w:rPr>
-          <w:rFonts w:ascii="Arial" w:hAnsi="Arial" w:cs="Arial" w:hint="cs"/>
-          <w:sz w:val="22"/>
-          <w:szCs w:val="22"/>
-          <w:rtl/>
-        </w:rPr>
-        <w:t xml:space="preserve"> </w:t>
-      </w:r>
-      <w:r>
-        <w:rPr>
-          <w:rFonts w:ascii="Arial" w:hAnsi="Arial" w:cs="Arial" w:hint="cs"/>
-          <w:sz w:val="22"/>
-          <w:szCs w:val="22"/>
-          <w:rtl/>
-        </w:rPr>
-        <w:t xml:space="preserve">על מנת לקבוע את הערכי ההיפר פראמטר, עבור </w:t>
+      <w:proofErr w:type="spellEnd"/>
+      <w:r>
+        <w:rPr>
+          <w:rFonts w:ascii="Arial" w:hAnsi="Arial" w:cs="Arial" w:hint="cs"/>
+          <w:sz w:val="22"/>
+          <w:szCs w:val="22"/>
+          <w:rtl/>
+        </w:rPr>
+        <w:t xml:space="preserve"> </w:t>
+      </w:r>
+      <w:r>
+        <w:rPr>
+          <w:rFonts w:ascii="Arial" w:hAnsi="Arial" w:cs="Arial" w:hint="cs"/>
+          <w:sz w:val="22"/>
+          <w:szCs w:val="22"/>
+          <w:rtl/>
+        </w:rPr>
+        <w:t xml:space="preserve">על מנת לקבוע את הערכי ההיפר </w:t>
+      </w:r>
+      <w:proofErr w:type="spellStart"/>
+      <w:r>
+        <w:rPr>
+          <w:rFonts w:ascii="Arial" w:hAnsi="Arial" w:cs="Arial" w:hint="cs"/>
+          <w:sz w:val="22"/>
+          <w:szCs w:val="22"/>
+          <w:rtl/>
+        </w:rPr>
+        <w:t>פראמטר</w:t>
+      </w:r>
+      <w:proofErr w:type="spellEnd"/>
+      <w:r>
+        <w:rPr>
+          <w:rFonts w:ascii="Arial" w:hAnsi="Arial" w:cs="Arial" w:hint="cs"/>
+          <w:sz w:val="22"/>
+          <w:szCs w:val="22"/>
+          <w:rtl/>
+        </w:rPr>
+        <w:t xml:space="preserve">, עבור </w:t>
       </w:r>
       <w:r>
         <w:rPr>
@@ -4666,6 +5221,7 @@
         </w:rPr>
         <w:t xml:space="preserve"> </w:t>
       </w:r>
+      <w:proofErr w:type="spellStart"/>
       <w:r>
         <w:rPr>
           <w:rFonts w:ascii="Arial" w:hAnsi="Arial" w:cs="Arial"/>
@@ -4676,6 +5232,7 @@
         </w:rPr>
         <w:t>sample_size</w:t>
       </w:r>
+      <w:proofErr w:type="spellEnd"/>
       <w:r>
         <w:rPr>
           <w:rFonts w:ascii="Arial" w:hAnsi="Arial" w:cs="Arial" w:hint="cs"/>
@@ -4696,6 +5253,7 @@
         </w:rPr>
         <w:t>קיבלנו תמיכה משותפת. הערכים אשר מניבים את ה-</w:t>
       </w:r>
+      <w:proofErr w:type="spellStart"/>
       <w:r>
         <w:rPr>
           <w:rFonts w:ascii="Arial" w:hAnsi="Arial" w:cs="Arial"/>
@@ -4704,6 +5262,7 @@
         </w:rPr>
         <w:t>rsq</w:t>
       </w:r>
+      <w:proofErr w:type="spellEnd"/>
       <w:r>
         <w:rPr>
           <w:rFonts w:ascii="Arial" w:hAnsi="Arial" w:cs="Arial" w:hint="cs"/>
@@ -4722,6 +5281,7 @@
         </w:rPr>
         <w:t xml:space="preserve"> </w:t>
       </w:r>
+      <w:proofErr w:type="spellStart"/>
       <w:r>
         <w:rPr>
           <w:rStyle w:val="AttributeTok"/>
@@ -4746,6 +5306,7 @@
         </w:rPr>
         <w:t>depth</w:t>
       </w:r>
+      <w:proofErr w:type="spellEnd"/>
       <w:r>
         <w:rPr>
           <w:rStyle w:val="AttributeTok"/>
@@ -4772,6 +5333,7 @@
         </w:rPr>
         <w:t xml:space="preserve"> </w:t>
       </w:r>
+      <w:proofErr w:type="spellStart"/>
       <w:r>
         <w:rPr>
           <w:rFonts w:ascii="Arial" w:hAnsi="Arial" w:cs="Arial"/>
@@ -4780,7 +5342,18 @@
           <w:szCs w:val="22"/>
           <w:shd w:val="clear" w:color="auto" w:fill="F1F3F5"/>
         </w:rPr>
-        <w:t>sample_size=0.6</w:t>
+        <w:t>sample_size</w:t>
+      </w:r>
+      <w:proofErr w:type="spellEnd"/>
+      <w:r>
+        <w:rPr>
+          <w:rFonts w:ascii="Arial" w:hAnsi="Arial" w:cs="Arial"/>
+          <w:color w:val="657422"/>
+          <w:sz w:val="22"/>
+          <w:szCs w:val="22"/>
+          <w:shd w:val="clear" w:color="auto" w:fill="F1F3F5"/>
+        </w:rPr>
+        <w:t>=0.6</w:t>
       </w:r>
       <w:r>
         <w:rPr>
@@ -4842,6 +5415,7 @@
         </w:rPr>
         <w:t xml:space="preserve">זאת לעומת התוצאה של שיטה זו על </w:t>
       </w:r>
+      <w:proofErr w:type="spellStart"/>
       <w:r>
         <w:rPr>
           <w:rStyle w:val="AttributeTok"/>
@@ -4866,6 +5440,7 @@
         </w:rPr>
         <w:t>depth</w:t>
       </w:r>
+      <w:proofErr w:type="spellEnd"/>
       <w:r>
         <w:rPr>
           <w:rStyle w:val="AttributeTok"/>
@@ -4899,8 +5474,29 @@
           <w:szCs w:val="22"/>
           <w:rtl/>
         </w:rPr>
-        <w:t xml:space="preserve">טענה כי הערכים האופטימלים הם </w:t>
-      </w:r>
+        <w:t xml:space="preserve">טענה כי הערכים </w:t>
+      </w:r>
+      <w:proofErr w:type="spellStart"/>
+      <w:r>
+        <w:rPr>
+          <w:rFonts w:ascii="Arial" w:hAnsi="Arial" w:cs="Arial" w:hint="cs"/>
+          <w:sz w:val="22"/>
+          <w:szCs w:val="22"/>
+          <w:rtl/>
+        </w:rPr>
+        <w:t>האופטימלים</w:t>
+      </w:r>
+      <w:proofErr w:type="spellEnd"/>
+      <w:r>
+        <w:rPr>
+          <w:rFonts w:ascii="Arial" w:hAnsi="Arial" w:cs="Arial" w:hint="cs"/>
+          <w:sz w:val="22"/>
+          <w:szCs w:val="22"/>
+          <w:rtl/>
+        </w:rPr>
+        <w:t xml:space="preserve"> הם </w:t>
+      </w:r>
+      <w:proofErr w:type="spellStart"/>
       <w:r>
         <w:rPr>
           <w:rStyle w:val="AttributeTok"/>
@@ -4925,6 +5521,7 @@
         </w:rPr>
         <w:t>depth</w:t>
       </w:r>
+      <w:proofErr w:type="spellEnd"/>
       <w:r>
         <w:rPr>
           <w:rStyle w:val="AttributeTok"/>
@@ -4951,6 +5548,7 @@
         </w:rPr>
         <w:t xml:space="preserve"> </w:t>
       </w:r>
+      <w:proofErr w:type="spellStart"/>
       <w:r>
         <w:rPr>
           <w:rFonts w:ascii="Arial" w:hAnsi="Arial" w:cs="Arial"/>
@@ -4959,7 +5557,18 @@
           <w:szCs w:val="22"/>
           <w:shd w:val="clear" w:color="auto" w:fill="F1F3F5"/>
         </w:rPr>
-        <w:t>sample_size=0.8</w:t>
+        <w:t>sample_size</w:t>
+      </w:r>
+      <w:proofErr w:type="spellEnd"/>
+      <w:r>
+        <w:rPr>
+          <w:rFonts w:ascii="Arial" w:hAnsi="Arial" w:cs="Arial"/>
+          <w:color w:val="657422"/>
+          <w:sz w:val="22"/>
+          <w:szCs w:val="22"/>
+          <w:shd w:val="clear" w:color="auto" w:fill="F1F3F5"/>
+        </w:rPr>
+        <w:t>=0.8</w:t>
       </w:r>
       <w:r>
         <w:rPr>
@@ -5051,6 +5660,7 @@
         </w:rPr>
         <w:t xml:space="preserve"> הערכים הראשונה  </w:t>
       </w:r>
+      <w:proofErr w:type="spellStart"/>
       <w:r>
         <w:rPr>
           <w:rStyle w:val="AttributeTok"/>
@@ -5075,6 +5685,7 @@
         </w:rPr>
         <w:t>depth</w:t>
       </w:r>
+      <w:proofErr w:type="spellEnd"/>
       <w:r>
         <w:rPr>
           <w:rStyle w:val="AttributeTok"/>
@@ -5101,6 +5712,7 @@
         </w:rPr>
         <w:t xml:space="preserve"> </w:t>
       </w:r>
+      <w:proofErr w:type="spellStart"/>
       <w:r>
         <w:rPr>
           <w:rFonts w:ascii="Arial" w:hAnsi="Arial" w:cs="Arial"/>
@@ -5109,7 +5721,18 @@
           <w:szCs w:val="22"/>
           <w:shd w:val="clear" w:color="auto" w:fill="F1F3F5"/>
         </w:rPr>
-        <w:t>sample_size=0.6</w:t>
+        <w:t>sample_size</w:t>
+      </w:r>
+      <w:proofErr w:type="spellEnd"/>
+      <w:r>
+        <w:rPr>
+          <w:rFonts w:ascii="Arial" w:hAnsi="Arial" w:cs="Arial"/>
+          <w:color w:val="657422"/>
+          <w:sz w:val="22"/>
+          <w:szCs w:val="22"/>
+          <w:shd w:val="clear" w:color="auto" w:fill="F1F3F5"/>
+        </w:rPr>
+        <w:t>=0.6</w:t>
       </w:r>
       <w:r>
         <w:rPr>
@@ -5178,15 +5801,45 @@
           <w:szCs w:val="22"/>
           <w:rtl/>
         </w:rPr>
-        <w:t xml:space="preserve">הביצועים של מודל זה עם ערכי היפר פראמטר אלו עבור סט האימון הם </w:t>
-      </w:r>
-      <w:r>
-        <w:rPr>
-          <w:rFonts w:ascii="Arial" w:hAnsi="Arial" w:cs="Arial"/>
-          <w:sz w:val="22"/>
-          <w:szCs w:val="22"/>
-        </w:rPr>
-        <w:t>mae=3.04</w:t>
+        <w:t xml:space="preserve">הביצועים של מודל זה עם ערכי היפר </w:t>
+      </w:r>
+      <w:proofErr w:type="spellStart"/>
+      <w:r>
+        <w:rPr>
+          <w:rFonts w:ascii="Arial" w:hAnsi="Arial" w:cs="Arial" w:hint="cs"/>
+          <w:sz w:val="22"/>
+          <w:szCs w:val="22"/>
+          <w:rtl/>
+        </w:rPr>
+        <w:t>פראמטר</w:t>
+      </w:r>
+      <w:proofErr w:type="spellEnd"/>
+      <w:r>
+        <w:rPr>
+          <w:rFonts w:ascii="Arial" w:hAnsi="Arial" w:cs="Arial" w:hint="cs"/>
+          <w:sz w:val="22"/>
+          <w:szCs w:val="22"/>
+          <w:rtl/>
+        </w:rPr>
+        <w:t xml:space="preserve"> אלו עבור סט האימון הם </w:t>
+      </w:r>
+      <w:proofErr w:type="spellStart"/>
+      <w:r>
+        <w:rPr>
+          <w:rFonts w:ascii="Arial" w:hAnsi="Arial" w:cs="Arial"/>
+          <w:sz w:val="22"/>
+          <w:szCs w:val="22"/>
+        </w:rPr>
+        <w:t>mae</w:t>
+      </w:r>
+      <w:proofErr w:type="spellEnd"/>
+      <w:r>
+        <w:rPr>
+          <w:rFonts w:ascii="Arial" w:hAnsi="Arial" w:cs="Arial"/>
+          <w:sz w:val="22"/>
+          <w:szCs w:val="22"/>
+        </w:rPr>
+        <w:t>=3.04</w:t>
       </w:r>
       <w:r>
         <w:rPr>
@@ -5197,13 +5850,23 @@
         </w:rPr>
         <w:t xml:space="preserve"> ו-</w:t>
       </w:r>
-      <w:r>
-        <w:rPr>
-          <w:rFonts w:ascii="Arial" w:hAnsi="Arial" w:cs="Arial"/>
-          <w:sz w:val="22"/>
-          <w:szCs w:val="22"/>
-        </w:rPr>
-        <w:t>rsq=0.99</w:t>
+      <w:proofErr w:type="spellStart"/>
+      <w:r>
+        <w:rPr>
+          <w:rFonts w:ascii="Arial" w:hAnsi="Arial" w:cs="Arial"/>
+          <w:sz w:val="22"/>
+          <w:szCs w:val="22"/>
+        </w:rPr>
+        <w:t>rsq</w:t>
+      </w:r>
+      <w:proofErr w:type="spellEnd"/>
+      <w:r>
+        <w:rPr>
+          <w:rFonts w:ascii="Arial" w:hAnsi="Arial" w:cs="Arial"/>
+          <w:sz w:val="22"/>
+          <w:szCs w:val="22"/>
+        </w:rPr>
+        <w:t>=0.99</w:t>
       </w:r>
       <w:r>
         <w:rPr>
@@ -5561,6 +6224,7 @@
         </w:rPr>
         <w:t xml:space="preserve">חוזה את מספר מקרי </w:t>
       </w:r>
+      <w:proofErr w:type="spellStart"/>
       <w:r>
         <w:rPr>
           <w:rFonts w:ascii="Arial" w:hAnsi="Arial" w:cs="Arial"/>
@@ -5570,16 +6234,27 @@
           <w:lang w:val="en-IL"/>
         </w:rPr>
         <w:lastRenderedPageBreak/>
-        <w:t>הגוסטינג עם טעות של כ-±</w:t>
-      </w:r>
-      <w:r>
-        <w:rPr>
-          <w:rFonts w:ascii="Arial" w:hAnsi="Arial" w:cs="Arial" w:hint="cs"/>
+        <w:t>הגוסטינג</w:t>
+      </w:r>
+      <w:proofErr w:type="spellEnd"/>
+      <w:r>
+        <w:rPr>
+          <w:rFonts w:ascii="Arial" w:hAnsi="Arial" w:cs="Arial"/>
           <w:sz w:val="22"/>
           <w:szCs w:val="22"/>
           <w:rtl/>
           <w:lang w:val="en-IL"/>
         </w:rPr>
+        <w:t xml:space="preserve"> עם טעות של כ-±</w:t>
+      </w:r>
+      <w:r>
+        <w:rPr>
+          <w:rFonts w:ascii="Arial" w:hAnsi="Arial" w:cs="Arial" w:hint="cs"/>
+          <w:sz w:val="22"/>
+          <w:szCs w:val="22"/>
+          <w:rtl/>
+          <w:lang w:val="en-IL"/>
+        </w:rPr>
         <w:t>12</w:t>
       </w:r>
       <w:r>
@@ -5813,16 +6488,38 @@
           <w:rtl/>
           <w:lang w:val="en-IL"/>
         </w:rPr>
-        <w:t>% מהשונות במספר הודעות הגוסטינג מוסברת על ידי המודל, לעומת כ-</w:t>
-      </w:r>
-      <w:r>
-        <w:rPr>
-          <w:rFonts w:ascii="Arial" w:hAnsi="Arial" w:cs="Arial" w:hint="cs"/>
+        <w:t xml:space="preserve">% מהשונות במספר הודעות </w:t>
+      </w:r>
+      <w:proofErr w:type="spellStart"/>
+      <w:r>
+        <w:rPr>
+          <w:rFonts w:ascii="Arial" w:hAnsi="Arial" w:cs="Arial"/>
           <w:sz w:val="22"/>
           <w:szCs w:val="22"/>
           <w:rtl/>
           <w:lang w:val="en-IL"/>
         </w:rPr>
+        <w:t>הגוסטינג</w:t>
+      </w:r>
+      <w:proofErr w:type="spellEnd"/>
+      <w:r>
+        <w:rPr>
+          <w:rFonts w:ascii="Arial" w:hAnsi="Arial" w:cs="Arial"/>
+          <w:sz w:val="22"/>
+          <w:szCs w:val="22"/>
+          <w:rtl/>
+          <w:lang w:val="en-IL"/>
+        </w:rPr>
+        <w:t xml:space="preserve"> מוסברת על ידי המודל, לעומת כ-</w:t>
+      </w:r>
+      <w:r>
+        <w:rPr>
+          <w:rFonts w:ascii="Arial" w:hAnsi="Arial" w:cs="Arial" w:hint="cs"/>
+          <w:sz w:val="22"/>
+          <w:szCs w:val="22"/>
+          <w:rtl/>
+          <w:lang w:val="en-IL"/>
+        </w:rPr>
         <w:t>57.6</w:t>
       </w:r>
       <w:r>
@@ -5896,7 +6593,27 @@
           <w:szCs w:val="22"/>
           <w:rtl/>
         </w:rPr>
-        <w:t>כעת נאמוד את הביצועים של המודלים ונשווה אותם על ידי ה-</w:t>
+        <w:t xml:space="preserve">כעת </w:t>
+      </w:r>
+      <w:proofErr w:type="spellStart"/>
+      <w:r>
+        <w:rPr>
+          <w:rFonts w:ascii="Arial" w:hAnsi="Arial" w:cs="Arial" w:hint="cs"/>
+          <w:sz w:val="22"/>
+          <w:szCs w:val="22"/>
+          <w:rtl/>
+        </w:rPr>
+        <w:t>נאמוד</w:t>
+      </w:r>
+      <w:proofErr w:type="spellEnd"/>
+      <w:r>
+        <w:rPr>
+          <w:rFonts w:ascii="Arial" w:hAnsi="Arial" w:cs="Arial" w:hint="cs"/>
+          <w:sz w:val="22"/>
+          <w:szCs w:val="22"/>
+          <w:rtl/>
+        </w:rPr>
+        <w:t xml:space="preserve"> את הביצועים של המודלים ונשווה אותם על ידי ה-</w:t>
       </w:r>
       <w:r>
         <w:rPr>
@@ -6097,6 +6814,7 @@
         </w:rPr>
         <w:t xml:space="preserve"> עבור ערכי </w:t>
       </w:r>
+      <w:proofErr w:type="spellStart"/>
       <w:r>
         <w:rPr>
           <w:rFonts w:ascii="Arial" w:hAnsi="Arial" w:cs="Arial"/>
@@ -6105,6 +6823,7 @@
         </w:rPr>
         <w:t>rsq</w:t>
       </w:r>
+      <w:proofErr w:type="spellEnd"/>
       <w:r>
         <w:rPr>
           <w:rFonts w:ascii="Arial" w:hAnsi="Arial" w:cs="Arial" w:hint="cs"/>
@@ -6114,6 +6833,7 @@
         </w:rPr>
         <w:t xml:space="preserve"> ו-</w:t>
       </w:r>
+      <w:proofErr w:type="spellStart"/>
       <w:r>
         <w:rPr>
           <w:rFonts w:ascii="Arial" w:hAnsi="Arial" w:cs="Arial"/>
@@ -6122,6 +6842,7 @@
         </w:rPr>
         <w:t>mae</w:t>
       </w:r>
+      <w:proofErr w:type="spellEnd"/>
       <w:r>
         <w:rPr>
           <w:rFonts w:ascii="Arial" w:hAnsi="Arial" w:cs="Arial" w:hint="cs"/>
@@ -6176,6 +6897,7 @@
         </w:rPr>
         <w:t>. ההבדל ב-</w:t>
       </w:r>
+      <w:proofErr w:type="spellStart"/>
       <w:r>
         <w:rPr>
           <w:rFonts w:ascii="Arial" w:hAnsi="Arial" w:cs="Arial"/>
@@ -6184,6 +6906,7 @@
         </w:rPr>
         <w:t>rsq</w:t>
       </w:r>
+      <w:proofErr w:type="spellEnd"/>
       <w:r>
         <w:rPr>
           <w:rFonts w:ascii="Arial" w:hAnsi="Arial" w:cs="Arial" w:hint="cs"/>
@@ -6518,6 +7241,7 @@
         </w:rPr>
         <w:t xml:space="preserve"> מכוון שבניגוד ל-</w:t>
       </w:r>
+      <w:proofErr w:type="spellStart"/>
       <w:r>
         <w:rPr>
           <w:rFonts w:ascii="Arial" w:hAnsi="Arial" w:cs="Arial"/>
@@ -6526,6 +7250,7 @@
         </w:rPr>
         <w:t>shap</w:t>
       </w:r>
+      <w:proofErr w:type="spellEnd"/>
       <w:r>
         <w:rPr>
           <w:rFonts w:ascii="Arial" w:hAnsi="Arial" w:cs="Arial" w:hint="cs"/>
@@ -6698,6 +7423,7 @@
         </w:rPr>
         <w:t xml:space="preserve">נראה כי </w:t>
       </w:r>
+      <w:proofErr w:type="spellStart"/>
       <w:r>
         <w:rPr>
           <w:rStyle w:val="CommentTok"/>
@@ -6706,6 +7432,7 @@
         </w:rPr>
         <w:t>no_of_matchs</w:t>
       </w:r>
+      <w:proofErr w:type="spellEnd"/>
       <w:r>
         <w:rPr>
           <w:rFonts w:ascii="Arial" w:hAnsi="Arial" w:cs="Arial" w:hint="cs"/>
@@ -6863,6 +7590,7 @@
         </w:rPr>
         <w:t xml:space="preserve">ניתן להכיל את אותו הגיוני על 2 המנבאים המוצלחים ביותר שאחריו: </w:t>
       </w:r>
+      <w:proofErr w:type="spellStart"/>
       <w:r>
         <w:rPr>
           <w:rStyle w:val="StringTok"/>
@@ -6871,6 +7599,7 @@
         </w:rPr>
         <w:t>nrOfConversations</w:t>
       </w:r>
+      <w:proofErr w:type="spellEnd"/>
       <w:r>
         <w:rPr>
           <w:rStyle w:val="StringTok"/>
@@ -6880,6 +7609,7 @@
         </w:rPr>
         <w:t xml:space="preserve">, </w:t>
       </w:r>
+      <w:proofErr w:type="spellStart"/>
       <w:r>
         <w:rPr>
           <w:rStyle w:val="StringTok"/>
@@ -6904,6 +7634,7 @@
         </w:rPr>
         <w:t>ved</w:t>
       </w:r>
+      <w:proofErr w:type="spellEnd"/>
       <w:r>
         <w:rPr>
           <w:rStyle w:val="StringTok"/>
@@ -7039,6 +7770,7 @@
         </w:rPr>
         <w:t xml:space="preserve">שלושת מנבאים אלו על מנת לבחון האם הקשר אכן מונוטומי מושלם.  למרות שבשלושת המנבאים המגמה חיובית באופן ברור, כאשר מסתכלים על טווח הערכים של אותו מנבא הסיפור אינו מוחלט. למשל, הפרופיל של </w:t>
       </w:r>
+      <w:proofErr w:type="spellStart"/>
       <w:r>
         <w:rPr>
           <w:rStyle w:val="StringTok"/>
@@ -7047,6 +7779,7 @@
         </w:rPr>
         <w:t>no_of_msgs_received</w:t>
       </w:r>
+      <w:proofErr w:type="spellEnd"/>
       <w:r>
         <w:rPr>
           <w:rStyle w:val="StringTok"/>
@@ -7137,7 +7870,27 @@
           <w:szCs w:val="22"/>
           <w:rtl/>
         </w:rPr>
-        <w:t xml:space="preserve"> אם זאת, נראה שהצלחנו לנבא במידה רבה בעזרת המודלים את מספר הודעות הגוסטינג לאחר קבלת הודעה ראשונה.  </w:t>
+        <w:t xml:space="preserve"> אם זאת, נראה שהצלחנו לנבא במידה רבה בעזרת המודלים את מספר הודעות </w:t>
+      </w:r>
+      <w:proofErr w:type="spellStart"/>
+      <w:r>
+        <w:rPr>
+          <w:rFonts w:ascii="Arial" w:hAnsi="Arial" w:cs="Arial" w:hint="cs"/>
+          <w:sz w:val="22"/>
+          <w:szCs w:val="22"/>
+          <w:rtl/>
+        </w:rPr>
+        <w:t>הגוסטינג</w:t>
+      </w:r>
+      <w:proofErr w:type="spellEnd"/>
+      <w:r>
+        <w:rPr>
+          <w:rFonts w:ascii="Arial" w:hAnsi="Arial" w:cs="Arial" w:hint="cs"/>
+          <w:sz w:val="22"/>
+          <w:szCs w:val="22"/>
+          <w:rtl/>
+        </w:rPr>
+        <w:t xml:space="preserve"> לאחר קבלת הודעה ראשונה.  </w:t>
       </w:r>
       <w:r>
         <w:rPr>
@@ -7165,6 +7918,17 @@
         </w:rPr>
         <w:t xml:space="preserve">. </w:t>
       </w:r>
+      <w:proofErr w:type="spellStart"/>
+      <w:r>
+        <w:rPr>
+          <w:rFonts w:ascii="Arial" w:hAnsi="Arial" w:cs="Arial" w:hint="cs"/>
+          <w:sz w:val="22"/>
+          <w:szCs w:val="22"/>
+          <w:rtl/>
+        </w:rPr>
+        <w:t>דגשגשדג</w:t>
+      </w:r>
+      <w:proofErr w:type="spellEnd"/>
     </w:p>
     <w:sectPr>
       <w:pgSz w:w="12240" w:h="15840"/>

</xml_diff>